<commit_message>
Merged CORE-639 into master
</commit_message>
<xml_diff>
--- a/doc/SOFD Core - AD replikator.docx
+++ b/doc/SOFD Core - AD replikator.docx
@@ -336,13 +336,7 @@
         </w:rPr>
         <w:t>:</w:t>
         <w:tab/>
-        <w:t>1.14.</w:t>
-      </w:r>
-      <w:r>
-        <w:rPr>
-          <w:lang w:val="da-DK"/>
-        </w:rPr>
-        <w:t>1</w:t>
+        <w:t>1.14.1</w:t>
       </w:r>
     </w:p>
     <w:p>
@@ -367,30 +361,7 @@
         </w:rPr>
         <w:t>:</w:t>
         <w:tab/>
-      </w:r>
-      <w:r>
-        <w:rPr>
-          <w:lang w:val="da-DK"/>
-        </w:rPr>
-        <w:t>27</w:t>
-      </w:r>
-      <w:r>
-        <w:rPr>
-          <w:lang w:val="da-DK"/>
-        </w:rPr>
-        <w:t>.1</w:t>
-      </w:r>
-      <w:r>
-        <w:rPr>
-          <w:lang w:val="da-DK"/>
-        </w:rPr>
-        <w:t>1</w:t>
-      </w:r>
-      <w:r>
-        <w:rPr>
-          <w:lang w:val="da-DK"/>
-        </w:rPr>
-        <w:t>.2025</w:t>
+        <w:t>27.11.2025</w:t>
       </w:r>
     </w:p>
     <w:p>
@@ -477,6 +448,7 @@
             <w:rPr>
               <w:webHidden/>
               <w:rStyle w:val="IndexLink"/>
+              <w:vanish w:val="false"/>
               <w:lang w:val="da-DK"/>
             </w:rPr>
             <w:instrText xml:space="preserve"> TOC \z \o "1-3" \u \h</w:instrText>
@@ -485,6 +457,7 @@
             <w:rPr>
               <w:webHidden/>
               <w:rStyle w:val="IndexLink"/>
+              <w:vanish w:val="false"/>
               <w:lang w:val="da-DK"/>
             </w:rPr>
             <w:fldChar w:fldCharType="separate"/>
@@ -494,6 +467,7 @@
               <w:rPr>
                 <w:webHidden/>
                 <w:rStyle w:val="IndexLink"/>
+                <w:vanish w:val="false"/>
                 <w:lang w:val="da-DK"/>
               </w:rPr>
               <w:t>1</w:t>
@@ -567,6 +541,7 @@
               <w:rPr>
                 <w:webHidden/>
                 <w:rStyle w:val="IndexLink"/>
+                <w:vanish w:val="false"/>
                 <w:lang w:val="da-DK"/>
               </w:rPr>
               <w:t>1.1</w:t>
@@ -640,6 +615,7 @@
               <w:rPr>
                 <w:webHidden/>
                 <w:rStyle w:val="IndexLink"/>
+                <w:vanish w:val="false"/>
                 <w:lang w:val="da-DK"/>
               </w:rPr>
               <w:t>1.1.1</w:t>
@@ -713,6 +689,7 @@
               <w:rPr>
                 <w:webHidden/>
                 <w:rStyle w:val="IndexLink"/>
+                <w:vanish w:val="false"/>
                 <w:lang w:val="da-DK"/>
               </w:rPr>
               <w:t>1.1.2</w:t>
@@ -786,6 +763,7 @@
               <w:rPr>
                 <w:webHidden/>
                 <w:rStyle w:val="IndexLink"/>
+                <w:vanish w:val="false"/>
                 <w:lang w:val="da-DK"/>
               </w:rPr>
               <w:t>1.1.3</w:t>
@@ -859,6 +837,7 @@
               <w:rPr>
                 <w:webHidden/>
                 <w:rStyle w:val="IndexLink"/>
+                <w:vanish w:val="false"/>
                 <w:lang w:val="da-DK"/>
               </w:rPr>
               <w:t>2</w:t>
@@ -932,6 +911,7 @@
               <w:rPr>
                 <w:webHidden/>
                 <w:rStyle w:val="IndexLink"/>
+                <w:vanish w:val="false"/>
                 <w:lang w:val="da-DK"/>
               </w:rPr>
               <w:t>2.1</w:t>
@@ -1005,6 +985,7 @@
               <w:rPr>
                 <w:webHidden/>
                 <w:rStyle w:val="IndexLink"/>
+                <w:vanish w:val="false"/>
                 <w:lang w:val="da-DK"/>
               </w:rPr>
               <w:t>2.2</w:t>
@@ -1078,6 +1059,7 @@
               <w:rPr>
                 <w:webHidden/>
                 <w:rStyle w:val="IndexLink"/>
+                <w:vanish w:val="false"/>
                 <w:lang w:val="da-DK"/>
               </w:rPr>
               <w:t>2.2.1</w:t>
@@ -1151,6 +1133,7 @@
               <w:rPr>
                 <w:webHidden/>
                 <w:rStyle w:val="IndexLink"/>
+                <w:vanish w:val="false"/>
                 <w:lang w:val="da-DK"/>
               </w:rPr>
               <w:t>2.2.2</w:t>
@@ -1224,6 +1207,7 @@
               <w:rPr>
                 <w:webHidden/>
                 <w:rStyle w:val="IndexLink"/>
+                <w:vanish w:val="false"/>
                 <w:lang w:val="da-DK"/>
               </w:rPr>
               <w:t>2.2.3</w:t>
@@ -1297,6 +1281,7 @@
               <w:rPr>
                 <w:webHidden/>
                 <w:rStyle w:val="IndexLink"/>
+                <w:vanish w:val="false"/>
                 <w:lang w:val="da-DK"/>
               </w:rPr>
               <w:t>2.2.4</w:t>
@@ -1370,6 +1355,7 @@
               <w:rPr>
                 <w:webHidden/>
                 <w:rStyle w:val="IndexLink"/>
+                <w:vanish w:val="false"/>
                 <w:lang w:val="da-DK"/>
               </w:rPr>
               <w:t>2.3</w:t>
@@ -1828,8 +1814,8 @@
         <w:tblLook w:val="04a0" w:noHBand="0" w:noVBand="1" w:firstColumn="1" w:lastRow="0" w:lastColumn="0" w:firstRow="1"/>
       </w:tblPr>
       <w:tblGrid>
-        <w:gridCol w:w="3113"/>
-        <w:gridCol w:w="2836"/>
+        <w:gridCol w:w="3112"/>
+        <w:gridCol w:w="2837"/>
         <w:gridCol w:w="3679"/>
       </w:tblGrid>
       <w:tr>
@@ -1838,7 +1824,7 @@
         </w:trPr>
         <w:tc>
           <w:tcPr>
-            <w:tcW w:w="3113" w:type="dxa"/>
+            <w:tcW w:w="3112" w:type="dxa"/>
             <w:cnfStyle w:val="001000000000" w:firstRow="0" w:lastRow="0" w:firstColumn="1" w:lastColumn="0" w:oddVBand="0" w:evenVBand="0" w:oddHBand="0" w:evenHBand="0" w:firstRowFirstColumn="0" w:firstRowLastColumn="0" w:lastRowFirstColumn="0" w:lastRowLastColumn="0"/>
             <w:tcBorders>
               <w:bottom w:val="single" w:sz="12" w:space="0" w:color="9CC2E5"/>
@@ -1848,6 +1834,7 @@
             <w:pPr>
               <w:pStyle w:val="Normal"/>
               <w:widowControl/>
+              <w:suppressAutoHyphens w:val="true"/>
               <w:spacing w:lineRule="auto" w:line="240" w:before="0" w:after="0"/>
               <w:jc w:val="left"/>
               <w:rPr>
@@ -1872,7 +1859,7 @@
         </w:tc>
         <w:tc>
           <w:tcPr>
-            <w:tcW w:w="2836" w:type="dxa"/>
+            <w:tcW w:w="2837" w:type="dxa"/>
             <w:tcBorders>
               <w:bottom w:val="single" w:sz="12" w:space="0" w:color="9CC2E5"/>
             </w:tcBorders>
@@ -1881,6 +1868,7 @@
             <w:pPr>
               <w:pStyle w:val="Normal"/>
               <w:widowControl/>
+              <w:suppressAutoHyphens w:val="true"/>
               <w:spacing w:lineRule="auto" w:line="240" w:before="0" w:after="0"/>
               <w:jc w:val="left"/>
               <w:cnfStyle w:val="100000000000" w:firstRow="1" w:lastRow="0" w:firstColumn="0" w:lastColumn="0" w:oddVBand="0" w:evenVBand="0" w:oddHBand="0" w:evenHBand="0" w:firstRowFirstColumn="0" w:firstRowLastColumn="0" w:lastRowFirstColumn="0" w:lastRowLastColumn="0"/>
@@ -1915,6 +1903,7 @@
             <w:pPr>
               <w:pStyle w:val="Normal"/>
               <w:widowControl/>
+              <w:suppressAutoHyphens w:val="true"/>
               <w:spacing w:lineRule="auto" w:line="240" w:before="0" w:after="0"/>
               <w:jc w:val="left"/>
               <w:cnfStyle w:val="100000000000" w:firstRow="1" w:lastRow="0" w:firstColumn="0" w:lastColumn="0" w:oddVBand="0" w:evenVBand="0" w:oddHBand="0" w:evenHBand="0" w:firstRowFirstColumn="0" w:firstRowLastColumn="0" w:lastRowFirstColumn="0" w:lastRowLastColumn="0"/>
@@ -1943,7 +1932,7 @@
         <w:trPr/>
         <w:tc>
           <w:tcPr>
-            <w:tcW w:w="3113" w:type="dxa"/>
+            <w:tcW w:w="3112" w:type="dxa"/>
             <w:cnfStyle w:val="001000000000" w:firstRow="0" w:lastRow="0" w:firstColumn="1" w:lastColumn="0" w:oddVBand="0" w:evenVBand="0" w:oddHBand="0" w:evenHBand="0" w:firstRowFirstColumn="0" w:firstRowLastColumn="0" w:lastRowFirstColumn="0" w:lastRowLastColumn="0"/>
             <w:tcBorders/>
           </w:tcPr>
@@ -1951,6 +1940,7 @@
             <w:pPr>
               <w:pStyle w:val="Normal"/>
               <w:widowControl/>
+              <w:suppressAutoHyphens w:val="true"/>
               <w:spacing w:lineRule="auto" w:line="240" w:before="0" w:after="0"/>
               <w:jc w:val="left"/>
               <w:rPr>
@@ -1975,13 +1965,14 @@
         </w:tc>
         <w:tc>
           <w:tcPr>
-            <w:tcW w:w="2836" w:type="dxa"/>
-            <w:tcBorders/>
-          </w:tcPr>
-          <w:p>
-            <w:pPr>
-              <w:pStyle w:val="Normal"/>
-              <w:widowControl/>
+            <w:tcW w:w="2837" w:type="dxa"/>
+            <w:tcBorders/>
+          </w:tcPr>
+          <w:p>
+            <w:pPr>
+              <w:pStyle w:val="Normal"/>
+              <w:widowControl/>
+              <w:suppressAutoHyphens w:val="true"/>
               <w:spacing w:lineRule="auto" w:line="240" w:before="0" w:after="0"/>
               <w:jc w:val="left"/>
               <w:cnfStyle w:val="000000000000" w:firstRow="0" w:lastRow="0" w:firstColumn="0" w:lastColumn="0" w:oddVBand="0" w:evenVBand="0" w:oddHBand="0" w:evenHBand="0" w:firstRowFirstColumn="0" w:firstRowLastColumn="0" w:lastRowFirstColumn="0" w:lastRowLastColumn="0"/>
@@ -2010,6 +2001,7 @@
             <w:pPr>
               <w:pStyle w:val="Normal"/>
               <w:widowControl/>
+              <w:suppressAutoHyphens w:val="true"/>
               <w:spacing w:lineRule="auto" w:line="240" w:before="0" w:after="0"/>
               <w:jc w:val="left"/>
               <w:cnfStyle w:val="000000000000" w:firstRow="0" w:lastRow="0" w:firstColumn="0" w:lastColumn="0" w:oddVBand="0" w:evenVBand="0" w:oddHBand="0" w:evenHBand="0" w:firstRowFirstColumn="0" w:firstRowLastColumn="0" w:lastRowFirstColumn="0" w:lastRowLastColumn="0"/>
@@ -2034,7 +2026,7 @@
         <w:trPr/>
         <w:tc>
           <w:tcPr>
-            <w:tcW w:w="3113" w:type="dxa"/>
+            <w:tcW w:w="3112" w:type="dxa"/>
             <w:cnfStyle w:val="001000000000" w:firstRow="0" w:lastRow="0" w:firstColumn="1" w:lastColumn="0" w:oddVBand="0" w:evenVBand="0" w:oddHBand="0" w:evenHBand="0" w:firstRowFirstColumn="0" w:firstRowLastColumn="0" w:lastRowFirstColumn="0" w:lastRowLastColumn="0"/>
             <w:tcBorders/>
           </w:tcPr>
@@ -2042,6 +2034,7 @@
             <w:pPr>
               <w:pStyle w:val="Normal"/>
               <w:widowControl/>
+              <w:suppressAutoHyphens w:val="true"/>
               <w:spacing w:lineRule="auto" w:line="240" w:before="0" w:after="0"/>
               <w:jc w:val="left"/>
               <w:rPr>
@@ -2066,13 +2059,14 @@
         </w:tc>
         <w:tc>
           <w:tcPr>
-            <w:tcW w:w="2836" w:type="dxa"/>
-            <w:tcBorders/>
-          </w:tcPr>
-          <w:p>
-            <w:pPr>
-              <w:pStyle w:val="Normal"/>
-              <w:widowControl/>
+            <w:tcW w:w="2837" w:type="dxa"/>
+            <w:tcBorders/>
+          </w:tcPr>
+          <w:p>
+            <w:pPr>
+              <w:pStyle w:val="Normal"/>
+              <w:widowControl/>
+              <w:suppressAutoHyphens w:val="true"/>
               <w:spacing w:lineRule="auto" w:line="240" w:before="0" w:after="0"/>
               <w:jc w:val="left"/>
               <w:cnfStyle w:val="000000000000" w:firstRow="0" w:lastRow="0" w:firstColumn="0" w:lastColumn="0" w:oddVBand="0" w:evenVBand="0" w:oddHBand="0" w:evenHBand="0" w:firstRowFirstColumn="0" w:firstRowLastColumn="0" w:lastRowFirstColumn="0" w:lastRowLastColumn="0"/>
@@ -2101,6 +2095,7 @@
             <w:pPr>
               <w:pStyle w:val="Normal"/>
               <w:widowControl/>
+              <w:suppressAutoHyphens w:val="true"/>
               <w:spacing w:lineRule="auto" w:line="240" w:before="0" w:after="0"/>
               <w:jc w:val="left"/>
               <w:cnfStyle w:val="000000000000" w:firstRow="0" w:lastRow="0" w:firstColumn="0" w:lastColumn="0" w:oddVBand="0" w:evenVBand="0" w:oddHBand="0" w:evenHBand="0" w:firstRowFirstColumn="0" w:firstRowLastColumn="0" w:lastRowFirstColumn="0" w:lastRowLastColumn="0"/>
@@ -2125,7 +2120,7 @@
         <w:trPr/>
         <w:tc>
           <w:tcPr>
-            <w:tcW w:w="3113" w:type="dxa"/>
+            <w:tcW w:w="3112" w:type="dxa"/>
             <w:cnfStyle w:val="001000000000" w:firstRow="0" w:lastRow="0" w:firstColumn="1" w:lastColumn="0" w:oddVBand="0" w:evenVBand="0" w:oddHBand="0" w:evenHBand="0" w:firstRowFirstColumn="0" w:firstRowLastColumn="0" w:lastRowFirstColumn="0" w:lastRowLastColumn="0"/>
             <w:tcBorders/>
           </w:tcPr>
@@ -2133,6 +2128,7 @@
             <w:pPr>
               <w:pStyle w:val="Normal"/>
               <w:widowControl/>
+              <w:suppressAutoHyphens w:val="true"/>
               <w:spacing w:lineRule="auto" w:line="240" w:before="0" w:after="0"/>
               <w:jc w:val="left"/>
               <w:rPr>
@@ -2157,13 +2153,14 @@
         </w:tc>
         <w:tc>
           <w:tcPr>
-            <w:tcW w:w="2836" w:type="dxa"/>
-            <w:tcBorders/>
-          </w:tcPr>
-          <w:p>
-            <w:pPr>
-              <w:pStyle w:val="Normal"/>
-              <w:widowControl/>
+            <w:tcW w:w="2837" w:type="dxa"/>
+            <w:tcBorders/>
+          </w:tcPr>
+          <w:p>
+            <w:pPr>
+              <w:pStyle w:val="Normal"/>
+              <w:widowControl/>
+              <w:suppressAutoHyphens w:val="true"/>
               <w:spacing w:lineRule="auto" w:line="240" w:before="0" w:after="0"/>
               <w:jc w:val="left"/>
               <w:cnfStyle w:val="000000000000" w:firstRow="0" w:lastRow="0" w:firstColumn="0" w:lastColumn="0" w:oddVBand="0" w:evenVBand="0" w:oddHBand="0" w:evenHBand="0" w:firstRowFirstColumn="0" w:firstRowLastColumn="0" w:lastRowFirstColumn="0" w:lastRowLastColumn="0"/>
@@ -2192,6 +2189,7 @@
             <w:pPr>
               <w:pStyle w:val="Normal"/>
               <w:widowControl/>
+              <w:suppressAutoHyphens w:val="true"/>
               <w:spacing w:lineRule="auto" w:line="240" w:before="0" w:after="0"/>
               <w:jc w:val="left"/>
               <w:cnfStyle w:val="000000000000" w:firstRow="0" w:lastRow="0" w:firstColumn="0" w:lastColumn="0" w:oddVBand="0" w:evenVBand="0" w:oddHBand="0" w:evenHBand="0" w:firstRowFirstColumn="0" w:firstRowLastColumn="0" w:lastRowFirstColumn="0" w:lastRowLastColumn="0"/>
@@ -2216,7 +2214,7 @@
         <w:trPr/>
         <w:tc>
           <w:tcPr>
-            <w:tcW w:w="3113" w:type="dxa"/>
+            <w:tcW w:w="3112" w:type="dxa"/>
             <w:cnfStyle w:val="001000000000" w:firstRow="0" w:lastRow="0" w:firstColumn="1" w:lastColumn="0" w:oddVBand="0" w:evenVBand="0" w:oddHBand="0" w:evenHBand="0" w:firstRowFirstColumn="0" w:firstRowLastColumn="0" w:lastRowFirstColumn="0" w:lastRowLastColumn="0"/>
             <w:tcBorders/>
           </w:tcPr>
@@ -2224,6 +2222,7 @@
             <w:pPr>
               <w:pStyle w:val="Normal"/>
               <w:widowControl/>
+              <w:suppressAutoHyphens w:val="true"/>
               <w:spacing w:lineRule="auto" w:line="240" w:before="0" w:after="0"/>
               <w:jc w:val="left"/>
               <w:rPr>
@@ -2248,13 +2247,14 @@
         </w:tc>
         <w:tc>
           <w:tcPr>
-            <w:tcW w:w="2836" w:type="dxa"/>
-            <w:tcBorders/>
-          </w:tcPr>
-          <w:p>
-            <w:pPr>
-              <w:pStyle w:val="Normal"/>
-              <w:widowControl/>
+            <w:tcW w:w="2837" w:type="dxa"/>
+            <w:tcBorders/>
+          </w:tcPr>
+          <w:p>
+            <w:pPr>
+              <w:pStyle w:val="Normal"/>
+              <w:widowControl/>
+              <w:suppressAutoHyphens w:val="true"/>
               <w:spacing w:lineRule="auto" w:line="240" w:before="0" w:after="0"/>
               <w:jc w:val="left"/>
               <w:cnfStyle w:val="000000000000" w:firstRow="0" w:lastRow="0" w:firstColumn="0" w:lastColumn="0" w:oddVBand="0" w:evenVBand="0" w:oddHBand="0" w:evenHBand="0" w:firstRowFirstColumn="0" w:firstRowLastColumn="0" w:lastRowFirstColumn="0" w:lastRowLastColumn="0"/>
@@ -2282,6 +2282,7 @@
             <w:pPr>
               <w:pStyle w:val="Normal"/>
               <w:widowControl/>
+              <w:suppressAutoHyphens w:val="true"/>
               <w:spacing w:lineRule="auto" w:line="240" w:before="0" w:after="0"/>
               <w:jc w:val="left"/>
               <w:cnfStyle w:val="000000000000" w:firstRow="0" w:lastRow="0" w:firstColumn="0" w:lastColumn="0" w:oddVBand="0" w:evenVBand="0" w:oddHBand="0" w:evenHBand="0" w:firstRowFirstColumn="0" w:firstRowLastColumn="0" w:lastRowFirstColumn="0" w:lastRowLastColumn="0"/>
@@ -2306,7 +2307,7 @@
         <w:trPr/>
         <w:tc>
           <w:tcPr>
-            <w:tcW w:w="3113" w:type="dxa"/>
+            <w:tcW w:w="3112" w:type="dxa"/>
             <w:cnfStyle w:val="001000000000" w:firstRow="0" w:lastRow="0" w:firstColumn="1" w:lastColumn="0" w:oddVBand="0" w:evenVBand="0" w:oddHBand="0" w:evenHBand="0" w:firstRowFirstColumn="0" w:firstRowLastColumn="0" w:lastRowFirstColumn="0" w:lastRowLastColumn="0"/>
             <w:tcBorders/>
           </w:tcPr>
@@ -2314,6 +2315,7 @@
             <w:pPr>
               <w:pStyle w:val="Normal"/>
               <w:widowControl/>
+              <w:suppressAutoHyphens w:val="true"/>
               <w:spacing w:lineRule="auto" w:line="240" w:before="0" w:after="0"/>
               <w:jc w:val="left"/>
               <w:rPr>
@@ -2338,13 +2340,14 @@
         </w:tc>
         <w:tc>
           <w:tcPr>
-            <w:tcW w:w="2836" w:type="dxa"/>
-            <w:tcBorders/>
-          </w:tcPr>
-          <w:p>
-            <w:pPr>
-              <w:pStyle w:val="Normal"/>
-              <w:widowControl/>
+            <w:tcW w:w="2837" w:type="dxa"/>
+            <w:tcBorders/>
+          </w:tcPr>
+          <w:p>
+            <w:pPr>
+              <w:pStyle w:val="Normal"/>
+              <w:widowControl/>
+              <w:suppressAutoHyphens w:val="true"/>
               <w:spacing w:lineRule="auto" w:line="240" w:before="0" w:after="0"/>
               <w:jc w:val="left"/>
               <w:cnfStyle w:val="000000000000" w:firstRow="0" w:lastRow="0" w:firstColumn="0" w:lastColumn="0" w:oddVBand="0" w:evenVBand="0" w:oddHBand="0" w:evenHBand="0" w:firstRowFirstColumn="0" w:firstRowLastColumn="0" w:lastRowFirstColumn="0" w:lastRowLastColumn="0"/>
@@ -2373,6 +2376,7 @@
             <w:pPr>
               <w:pStyle w:val="Normal"/>
               <w:widowControl/>
+              <w:suppressAutoHyphens w:val="true"/>
               <w:spacing w:lineRule="auto" w:line="240" w:before="0" w:after="0"/>
               <w:jc w:val="left"/>
               <w:cnfStyle w:val="000000000000" w:firstRow="0" w:lastRow="0" w:firstColumn="0" w:lastColumn="0" w:oddVBand="0" w:evenVBand="0" w:oddHBand="0" w:evenHBand="0" w:firstRowFirstColumn="0" w:firstRowLastColumn="0" w:lastRowFirstColumn="0" w:lastRowLastColumn="0"/>
@@ -2397,7 +2401,7 @@
         <w:trPr/>
         <w:tc>
           <w:tcPr>
-            <w:tcW w:w="3113" w:type="dxa"/>
+            <w:tcW w:w="3112" w:type="dxa"/>
             <w:cnfStyle w:val="001000000000" w:firstRow="0" w:lastRow="0" w:firstColumn="1" w:lastColumn="0" w:oddVBand="0" w:evenVBand="0" w:oddHBand="0" w:evenHBand="0" w:firstRowFirstColumn="0" w:firstRowLastColumn="0" w:lastRowFirstColumn="0" w:lastRowLastColumn="0"/>
             <w:tcBorders/>
           </w:tcPr>
@@ -2405,6 +2409,7 @@
             <w:pPr>
               <w:pStyle w:val="Normal"/>
               <w:widowControl/>
+              <w:suppressAutoHyphens w:val="true"/>
               <w:spacing w:lineRule="auto" w:line="240" w:before="0" w:after="0"/>
               <w:jc w:val="left"/>
               <w:rPr>
@@ -2429,13 +2434,14 @@
         </w:tc>
         <w:tc>
           <w:tcPr>
-            <w:tcW w:w="2836" w:type="dxa"/>
-            <w:tcBorders/>
-          </w:tcPr>
-          <w:p>
-            <w:pPr>
-              <w:pStyle w:val="Normal"/>
-              <w:widowControl/>
+            <w:tcW w:w="2837" w:type="dxa"/>
+            <w:tcBorders/>
+          </w:tcPr>
+          <w:p>
+            <w:pPr>
+              <w:pStyle w:val="Normal"/>
+              <w:widowControl/>
+              <w:suppressAutoHyphens w:val="true"/>
               <w:spacing w:lineRule="auto" w:line="240" w:before="0" w:after="0"/>
               <w:jc w:val="left"/>
               <w:cnfStyle w:val="000000000000" w:firstRow="0" w:lastRow="0" w:firstColumn="0" w:lastColumn="0" w:oddVBand="0" w:evenVBand="0" w:oddHBand="0" w:evenHBand="0" w:firstRowFirstColumn="0" w:firstRowLastColumn="0" w:lastRowFirstColumn="0" w:lastRowLastColumn="0"/>
@@ -2483,6 +2489,7 @@
             <w:pPr>
               <w:pStyle w:val="Normal"/>
               <w:widowControl/>
+              <w:suppressAutoHyphens w:val="true"/>
               <w:spacing w:lineRule="auto" w:line="240" w:before="0" w:after="0"/>
               <w:jc w:val="left"/>
               <w:cnfStyle w:val="000000000000" w:firstRow="0" w:lastRow="0" w:firstColumn="0" w:lastColumn="0" w:oddVBand="0" w:evenVBand="0" w:oddHBand="0" w:evenHBand="0" w:firstRowFirstColumn="0" w:firstRowLastColumn="0" w:lastRowFirstColumn="0" w:lastRowLastColumn="0"/>
@@ -2552,6 +2559,7 @@
             <w:pPr>
               <w:pStyle w:val="Normal"/>
               <w:widowControl/>
+              <w:suppressAutoHyphens w:val="true"/>
               <w:spacing w:lineRule="auto" w:line="240" w:before="0" w:after="0"/>
               <w:jc w:val="left"/>
               <w:cnfStyle w:val="000000000000" w:firstRow="0" w:lastRow="0" w:firstColumn="0" w:lastColumn="0" w:oddVBand="0" w:evenVBand="0" w:oddHBand="0" w:evenHBand="0" w:firstRowFirstColumn="0" w:firstRowLastColumn="0" w:lastRowFirstColumn="0" w:lastRowLastColumn="0"/>
@@ -2610,6 +2618,7 @@
             <w:pPr>
               <w:pStyle w:val="Normal"/>
               <w:widowControl/>
+              <w:suppressAutoHyphens w:val="true"/>
               <w:spacing w:lineRule="auto" w:line="240" w:before="0" w:after="0"/>
               <w:jc w:val="left"/>
               <w:cnfStyle w:val="000000000000" w:firstRow="0" w:lastRow="0" w:firstColumn="0" w:lastColumn="0" w:oddVBand="0" w:evenVBand="0" w:oddHBand="0" w:evenHBand="0" w:firstRowFirstColumn="0" w:firstRowLastColumn="0" w:lastRowFirstColumn="0" w:lastRowLastColumn="0"/>
@@ -2652,6 +2661,7 @@
             <w:pPr>
               <w:pStyle w:val="Normal"/>
               <w:widowControl/>
+              <w:suppressAutoHyphens w:val="true"/>
               <w:spacing w:lineRule="auto" w:line="240" w:before="0" w:after="0"/>
               <w:jc w:val="left"/>
               <w:cnfStyle w:val="000000000000" w:firstRow="0" w:lastRow="0" w:firstColumn="0" w:lastColumn="0" w:oddVBand="0" w:evenVBand="0" w:oddHBand="0" w:evenHBand="0" w:firstRowFirstColumn="0" w:firstRowLastColumn="0" w:lastRowFirstColumn="0" w:lastRowLastColumn="0"/>
@@ -2719,8 +2729,8 @@
         <w:tblLook w:val="04a0" w:noHBand="0" w:noVBand="1" w:firstColumn="1" w:lastRow="0" w:lastColumn="0" w:firstRow="1"/>
       </w:tblPr>
       <w:tblGrid>
-        <w:gridCol w:w="3113"/>
-        <w:gridCol w:w="2836"/>
+        <w:gridCol w:w="3112"/>
+        <w:gridCol w:w="2837"/>
         <w:gridCol w:w="3679"/>
       </w:tblGrid>
       <w:tr>
@@ -2729,7 +2739,7 @@
         </w:trPr>
         <w:tc>
           <w:tcPr>
-            <w:tcW w:w="3113" w:type="dxa"/>
+            <w:tcW w:w="3112" w:type="dxa"/>
             <w:cnfStyle w:val="001000000000" w:firstRow="0" w:lastRow="0" w:firstColumn="1" w:lastColumn="0" w:oddVBand="0" w:evenVBand="0" w:oddHBand="0" w:evenHBand="0" w:firstRowFirstColumn="0" w:firstRowLastColumn="0" w:lastRowFirstColumn="0" w:lastRowLastColumn="0"/>
             <w:tcBorders>
               <w:bottom w:val="single" w:sz="12" w:space="0" w:color="9CC2E5"/>
@@ -2739,6 +2749,7 @@
             <w:pPr>
               <w:pStyle w:val="Normal"/>
               <w:widowControl/>
+              <w:suppressAutoHyphens w:val="true"/>
               <w:spacing w:lineRule="auto" w:line="240" w:before="0" w:after="0"/>
               <w:jc w:val="left"/>
               <w:rPr>
@@ -2763,7 +2774,7 @@
         </w:tc>
         <w:tc>
           <w:tcPr>
-            <w:tcW w:w="2836" w:type="dxa"/>
+            <w:tcW w:w="2837" w:type="dxa"/>
             <w:tcBorders>
               <w:bottom w:val="single" w:sz="12" w:space="0" w:color="9CC2E5"/>
             </w:tcBorders>
@@ -2772,6 +2783,7 @@
             <w:pPr>
               <w:pStyle w:val="Normal"/>
               <w:widowControl/>
+              <w:suppressAutoHyphens w:val="true"/>
               <w:spacing w:lineRule="auto" w:line="240" w:before="0" w:after="0"/>
               <w:jc w:val="left"/>
               <w:cnfStyle w:val="100000000000" w:firstRow="1" w:lastRow="0" w:firstColumn="0" w:lastColumn="0" w:oddVBand="0" w:evenVBand="0" w:oddHBand="0" w:evenHBand="0" w:firstRowFirstColumn="0" w:firstRowLastColumn="0" w:lastRowFirstColumn="0" w:lastRowLastColumn="0"/>
@@ -2806,6 +2818,7 @@
             <w:pPr>
               <w:pStyle w:val="Normal"/>
               <w:widowControl/>
+              <w:suppressAutoHyphens w:val="true"/>
               <w:spacing w:lineRule="auto" w:line="240" w:before="0" w:after="0"/>
               <w:jc w:val="left"/>
               <w:cnfStyle w:val="100000000000" w:firstRow="1" w:lastRow="0" w:firstColumn="0" w:lastColumn="0" w:oddVBand="0" w:evenVBand="0" w:oddHBand="0" w:evenHBand="0" w:firstRowFirstColumn="0" w:firstRowLastColumn="0" w:lastRowFirstColumn="0" w:lastRowLastColumn="0"/>
@@ -2834,7 +2847,7 @@
         <w:trPr/>
         <w:tc>
           <w:tcPr>
-            <w:tcW w:w="3113" w:type="dxa"/>
+            <w:tcW w:w="3112" w:type="dxa"/>
             <w:cnfStyle w:val="001000000000" w:firstRow="0" w:lastRow="0" w:firstColumn="1" w:lastColumn="0" w:oddVBand="0" w:evenVBand="0" w:oddHBand="0" w:evenHBand="0" w:firstRowFirstColumn="0" w:firstRowLastColumn="0" w:lastRowFirstColumn="0" w:lastRowLastColumn="0"/>
             <w:tcBorders/>
           </w:tcPr>
@@ -2842,6 +2855,7 @@
             <w:pPr>
               <w:pStyle w:val="Normal"/>
               <w:widowControl/>
+              <w:suppressAutoHyphens w:val="true"/>
               <w:spacing w:lineRule="auto" w:line="240" w:before="0" w:after="0"/>
               <w:jc w:val="left"/>
               <w:rPr>
@@ -2866,13 +2880,14 @@
         </w:tc>
         <w:tc>
           <w:tcPr>
-            <w:tcW w:w="2836" w:type="dxa"/>
-            <w:tcBorders/>
-          </w:tcPr>
-          <w:p>
-            <w:pPr>
-              <w:pStyle w:val="Normal"/>
-              <w:widowControl/>
+            <w:tcW w:w="2837" w:type="dxa"/>
+            <w:tcBorders/>
+          </w:tcPr>
+          <w:p>
+            <w:pPr>
+              <w:pStyle w:val="Normal"/>
+              <w:widowControl/>
+              <w:suppressAutoHyphens w:val="true"/>
               <w:spacing w:lineRule="auto" w:line="240" w:before="0" w:after="0"/>
               <w:jc w:val="left"/>
               <w:cnfStyle w:val="000000000000" w:firstRow="0" w:lastRow="0" w:firstColumn="0" w:lastColumn="0" w:oddVBand="0" w:evenVBand="0" w:oddHBand="0" w:evenHBand="0" w:firstRowFirstColumn="0" w:firstRowLastColumn="0" w:lastRowFirstColumn="0" w:lastRowLastColumn="0"/>
@@ -2901,6 +2916,7 @@
             <w:pPr>
               <w:pStyle w:val="Normal"/>
               <w:widowControl/>
+              <w:suppressAutoHyphens w:val="true"/>
               <w:spacing w:lineRule="auto" w:line="240" w:before="0" w:after="0"/>
               <w:jc w:val="left"/>
               <w:cnfStyle w:val="000000000000" w:firstRow="0" w:lastRow="0" w:firstColumn="0" w:lastColumn="0" w:oddVBand="0" w:evenVBand="0" w:oddHBand="0" w:evenHBand="0" w:firstRowFirstColumn="0" w:firstRowLastColumn="0" w:lastRowFirstColumn="0" w:lastRowLastColumn="0"/>
@@ -2925,7 +2941,7 @@
         <w:trPr/>
         <w:tc>
           <w:tcPr>
-            <w:tcW w:w="3113" w:type="dxa"/>
+            <w:tcW w:w="3112" w:type="dxa"/>
             <w:cnfStyle w:val="001000000000" w:firstRow="0" w:lastRow="0" w:firstColumn="1" w:lastColumn="0" w:oddVBand="0" w:evenVBand="0" w:oddHBand="0" w:evenHBand="0" w:firstRowFirstColumn="0" w:firstRowLastColumn="0" w:lastRowFirstColumn="0" w:lastRowLastColumn="0"/>
             <w:tcBorders/>
           </w:tcPr>
@@ -2933,6 +2949,7 @@
             <w:pPr>
               <w:pStyle w:val="Normal"/>
               <w:widowControl/>
+              <w:suppressAutoHyphens w:val="true"/>
               <w:spacing w:lineRule="auto" w:line="240" w:before="0" w:after="0"/>
               <w:jc w:val="left"/>
               <w:rPr>
@@ -2957,13 +2974,14 @@
         </w:tc>
         <w:tc>
           <w:tcPr>
-            <w:tcW w:w="2836" w:type="dxa"/>
-            <w:tcBorders/>
-          </w:tcPr>
-          <w:p>
-            <w:pPr>
-              <w:pStyle w:val="Normal"/>
-              <w:widowControl/>
+            <w:tcW w:w="2837" w:type="dxa"/>
+            <w:tcBorders/>
+          </w:tcPr>
+          <w:p>
+            <w:pPr>
+              <w:pStyle w:val="Normal"/>
+              <w:widowControl/>
+              <w:suppressAutoHyphens w:val="true"/>
               <w:spacing w:lineRule="auto" w:line="240" w:before="0" w:after="0"/>
               <w:jc w:val="left"/>
               <w:cnfStyle w:val="000000000000" w:firstRow="0" w:lastRow="0" w:firstColumn="0" w:lastColumn="0" w:oddVBand="0" w:evenVBand="0" w:oddHBand="0" w:evenHBand="0" w:firstRowFirstColumn="0" w:firstRowLastColumn="0" w:lastRowFirstColumn="0" w:lastRowLastColumn="0"/>
@@ -2991,6 +3009,7 @@
             <w:pPr>
               <w:pStyle w:val="Normal"/>
               <w:widowControl/>
+              <w:suppressAutoHyphens w:val="true"/>
               <w:spacing w:lineRule="auto" w:line="240" w:before="0" w:after="0"/>
               <w:jc w:val="left"/>
               <w:cnfStyle w:val="000000000000" w:firstRow="0" w:lastRow="0" w:firstColumn="0" w:lastColumn="0" w:oddVBand="0" w:evenVBand="0" w:oddHBand="0" w:evenHBand="0" w:firstRowFirstColumn="0" w:firstRowLastColumn="0" w:lastRowFirstColumn="0" w:lastRowLastColumn="0"/>
@@ -3015,7 +3034,7 @@
         <w:trPr/>
         <w:tc>
           <w:tcPr>
-            <w:tcW w:w="3113" w:type="dxa"/>
+            <w:tcW w:w="3112" w:type="dxa"/>
             <w:cnfStyle w:val="001000000000" w:firstRow="0" w:lastRow="0" w:firstColumn="1" w:lastColumn="0" w:oddVBand="0" w:evenVBand="0" w:oddHBand="0" w:evenHBand="0" w:firstRowFirstColumn="0" w:firstRowLastColumn="0" w:lastRowFirstColumn="0" w:lastRowLastColumn="0"/>
             <w:tcBorders/>
           </w:tcPr>
@@ -3023,6 +3042,7 @@
             <w:pPr>
               <w:pStyle w:val="Normal"/>
               <w:widowControl/>
+              <w:suppressAutoHyphens w:val="true"/>
               <w:spacing w:lineRule="auto" w:line="240" w:before="0" w:after="0"/>
               <w:jc w:val="left"/>
               <w:rPr>
@@ -3047,13 +3067,14 @@
         </w:tc>
         <w:tc>
           <w:tcPr>
-            <w:tcW w:w="2836" w:type="dxa"/>
-            <w:tcBorders/>
-          </w:tcPr>
-          <w:p>
-            <w:pPr>
-              <w:pStyle w:val="Normal"/>
-              <w:widowControl/>
+            <w:tcW w:w="2837" w:type="dxa"/>
+            <w:tcBorders/>
+          </w:tcPr>
+          <w:p>
+            <w:pPr>
+              <w:pStyle w:val="Normal"/>
+              <w:widowControl/>
+              <w:suppressAutoHyphens w:val="true"/>
               <w:spacing w:lineRule="auto" w:line="240" w:before="0" w:after="0"/>
               <w:jc w:val="left"/>
               <w:cnfStyle w:val="000000000000" w:firstRow="0" w:lastRow="0" w:firstColumn="0" w:lastColumn="0" w:oddVBand="0" w:evenVBand="0" w:oddHBand="0" w:evenHBand="0" w:firstRowFirstColumn="0" w:firstRowLastColumn="0" w:lastRowFirstColumn="0" w:lastRowLastColumn="0"/>
@@ -3081,6 +3102,7 @@
             <w:pPr>
               <w:pStyle w:val="Normal"/>
               <w:widowControl/>
+              <w:suppressAutoHyphens w:val="true"/>
               <w:spacing w:lineRule="auto" w:line="240" w:before="0" w:after="0"/>
               <w:jc w:val="left"/>
               <w:cnfStyle w:val="000000000000" w:firstRow="0" w:lastRow="0" w:firstColumn="0" w:lastColumn="0" w:oddVBand="0" w:evenVBand="0" w:oddHBand="0" w:evenHBand="0" w:firstRowFirstColumn="0" w:firstRowLastColumn="0" w:lastRowFirstColumn="0" w:lastRowLastColumn="0"/>
@@ -3105,7 +3127,7 @@
         <w:trPr/>
         <w:tc>
           <w:tcPr>
-            <w:tcW w:w="3113" w:type="dxa"/>
+            <w:tcW w:w="3112" w:type="dxa"/>
             <w:cnfStyle w:val="001000000000" w:firstRow="0" w:lastRow="0" w:firstColumn="1" w:lastColumn="0" w:oddVBand="0" w:evenVBand="0" w:oddHBand="0" w:evenHBand="0" w:firstRowFirstColumn="0" w:firstRowLastColumn="0" w:lastRowFirstColumn="0" w:lastRowLastColumn="0"/>
             <w:tcBorders/>
           </w:tcPr>
@@ -3113,6 +3135,7 @@
             <w:pPr>
               <w:pStyle w:val="Normal"/>
               <w:widowControl/>
+              <w:suppressAutoHyphens w:val="true"/>
               <w:spacing w:lineRule="auto" w:line="240" w:before="0" w:after="0"/>
               <w:jc w:val="left"/>
               <w:rPr>
@@ -3137,13 +3160,14 @@
         </w:tc>
         <w:tc>
           <w:tcPr>
-            <w:tcW w:w="2836" w:type="dxa"/>
-            <w:tcBorders/>
-          </w:tcPr>
-          <w:p>
-            <w:pPr>
-              <w:pStyle w:val="Normal"/>
-              <w:widowControl/>
+            <w:tcW w:w="2837" w:type="dxa"/>
+            <w:tcBorders/>
+          </w:tcPr>
+          <w:p>
+            <w:pPr>
+              <w:pStyle w:val="Normal"/>
+              <w:widowControl/>
+              <w:suppressAutoHyphens w:val="true"/>
               <w:spacing w:lineRule="auto" w:line="240" w:before="0" w:after="0"/>
               <w:jc w:val="left"/>
               <w:cnfStyle w:val="000000000000" w:firstRow="0" w:lastRow="0" w:firstColumn="0" w:lastColumn="0" w:oddVBand="0" w:evenVBand="0" w:oddHBand="0" w:evenHBand="0" w:firstRowFirstColumn="0" w:firstRowLastColumn="0" w:lastRowFirstColumn="0" w:lastRowLastColumn="0"/>
@@ -3171,6 +3195,7 @@
             <w:pPr>
               <w:pStyle w:val="Normal"/>
               <w:widowControl/>
+              <w:suppressAutoHyphens w:val="true"/>
               <w:spacing w:lineRule="auto" w:line="240" w:before="0" w:after="0"/>
               <w:jc w:val="left"/>
               <w:cnfStyle w:val="000000000000" w:firstRow="0" w:lastRow="0" w:firstColumn="0" w:lastColumn="0" w:oddVBand="0" w:evenVBand="0" w:oddHBand="0" w:evenHBand="0" w:firstRowFirstColumn="0" w:firstRowLastColumn="0" w:lastRowFirstColumn="0" w:lastRowLastColumn="0"/>
@@ -3195,7 +3220,7 @@
         <w:trPr/>
         <w:tc>
           <w:tcPr>
-            <w:tcW w:w="3113" w:type="dxa"/>
+            <w:tcW w:w="3112" w:type="dxa"/>
             <w:cnfStyle w:val="001000000000" w:firstRow="0" w:lastRow="0" w:firstColumn="1" w:lastColumn="0" w:oddVBand="0" w:evenVBand="0" w:oddHBand="0" w:evenHBand="0" w:firstRowFirstColumn="0" w:firstRowLastColumn="0" w:lastRowFirstColumn="0" w:lastRowLastColumn="0"/>
             <w:tcBorders/>
           </w:tcPr>
@@ -3203,6 +3228,7 @@
             <w:pPr>
               <w:pStyle w:val="Normal"/>
               <w:widowControl/>
+              <w:suppressAutoHyphens w:val="true"/>
               <w:spacing w:lineRule="auto" w:line="240" w:before="0" w:after="0"/>
               <w:jc w:val="left"/>
               <w:rPr>
@@ -3227,13 +3253,14 @@
         </w:tc>
         <w:tc>
           <w:tcPr>
-            <w:tcW w:w="2836" w:type="dxa"/>
-            <w:tcBorders/>
-          </w:tcPr>
-          <w:p>
-            <w:pPr>
-              <w:pStyle w:val="Normal"/>
-              <w:widowControl/>
+            <w:tcW w:w="2837" w:type="dxa"/>
+            <w:tcBorders/>
+          </w:tcPr>
+          <w:p>
+            <w:pPr>
+              <w:pStyle w:val="Normal"/>
+              <w:widowControl/>
+              <w:suppressAutoHyphens w:val="true"/>
               <w:spacing w:lineRule="auto" w:line="240" w:before="0" w:after="0"/>
               <w:jc w:val="left"/>
               <w:cnfStyle w:val="000000000000" w:firstRow="0" w:lastRow="0" w:firstColumn="0" w:lastColumn="0" w:oddVBand="0" w:evenVBand="0" w:oddHBand="0" w:evenHBand="0" w:firstRowFirstColumn="0" w:firstRowLastColumn="0" w:lastRowFirstColumn="0" w:lastRowLastColumn="0"/>
@@ -3261,6 +3288,7 @@
             <w:pPr>
               <w:pStyle w:val="Normal"/>
               <w:widowControl/>
+              <w:suppressAutoHyphens w:val="true"/>
               <w:spacing w:lineRule="auto" w:line="240" w:before="0" w:after="0"/>
               <w:jc w:val="left"/>
               <w:cnfStyle w:val="000000000000" w:firstRow="0" w:lastRow="0" w:firstColumn="0" w:lastColumn="0" w:oddVBand="0" w:evenVBand="0" w:oddHBand="0" w:evenHBand="0" w:firstRowFirstColumn="0" w:firstRowLastColumn="0" w:lastRowFirstColumn="0" w:lastRowLastColumn="0"/>
@@ -3329,8 +3357,8 @@
       </w:tblPr>
       <w:tblGrid>
         <w:gridCol w:w="3256"/>
-        <w:gridCol w:w="3117"/>
-        <w:gridCol w:w="3255"/>
+        <w:gridCol w:w="3116"/>
+        <w:gridCol w:w="3256"/>
       </w:tblGrid>
       <w:tr>
         <w:trPr>
@@ -3348,6 +3376,7 @@
             <w:pPr>
               <w:pStyle w:val="Normal"/>
               <w:widowControl/>
+              <w:suppressAutoHyphens w:val="true"/>
               <w:spacing w:lineRule="auto" w:line="240" w:before="0" w:after="0"/>
               <w:jc w:val="left"/>
               <w:rPr>
@@ -3372,7 +3401,7 @@
         </w:tc>
         <w:tc>
           <w:tcPr>
-            <w:tcW w:w="3117" w:type="dxa"/>
+            <w:tcW w:w="3116" w:type="dxa"/>
             <w:tcBorders>
               <w:bottom w:val="single" w:sz="12" w:space="0" w:color="9CC2E5"/>
             </w:tcBorders>
@@ -3381,6 +3410,7 @@
             <w:pPr>
               <w:pStyle w:val="Normal"/>
               <w:widowControl/>
+              <w:suppressAutoHyphens w:val="true"/>
               <w:spacing w:lineRule="auto" w:line="240" w:before="0" w:after="0"/>
               <w:jc w:val="left"/>
               <w:cnfStyle w:val="100000000000" w:firstRow="1" w:lastRow="0" w:firstColumn="0" w:lastColumn="0" w:oddVBand="0" w:evenVBand="0" w:oddHBand="0" w:evenHBand="0" w:firstRowFirstColumn="0" w:firstRowLastColumn="0" w:lastRowFirstColumn="0" w:lastRowLastColumn="0"/>
@@ -3406,7 +3436,7 @@
         </w:tc>
         <w:tc>
           <w:tcPr>
-            <w:tcW w:w="3255" w:type="dxa"/>
+            <w:tcW w:w="3256" w:type="dxa"/>
             <w:tcBorders>
               <w:bottom w:val="single" w:sz="12" w:space="0" w:color="9CC2E5"/>
             </w:tcBorders>
@@ -3415,6 +3445,7 @@
             <w:pPr>
               <w:pStyle w:val="Normal"/>
               <w:widowControl/>
+              <w:suppressAutoHyphens w:val="true"/>
               <w:spacing w:lineRule="auto" w:line="240" w:before="0" w:after="0"/>
               <w:jc w:val="left"/>
               <w:cnfStyle w:val="100000000000" w:firstRow="1" w:lastRow="0" w:firstColumn="0" w:lastColumn="0" w:oddVBand="0" w:evenVBand="0" w:oddHBand="0" w:evenHBand="0" w:firstRowFirstColumn="0" w:firstRowLastColumn="0" w:lastRowFirstColumn="0" w:lastRowLastColumn="0"/>
@@ -3455,6 +3486,7 @@
                 <w:tab w:val="clear" w:pos="1304"/>
                 <w:tab w:val="center" w:pos="1449" w:leader="none"/>
               </w:tabs>
+              <w:suppressAutoHyphens w:val="true"/>
               <w:spacing w:lineRule="auto" w:line="240" w:before="0" w:after="0"/>
               <w:jc w:val="left"/>
               <w:rPr>
@@ -3474,46 +3506,47 @@
                 <w:lang w:val="da-DK" w:eastAsia="en-US" w:bidi="ar-SA"/>
               </w:rPr>
               <w:t>RootOU</w:t>
-              <w:tab/>
-            </w:r>
-          </w:p>
-        </w:tc>
-        <w:tc>
-          <w:tcPr>
-            <w:tcW w:w="3117" w:type="dxa"/>
-            <w:tcBorders/>
-          </w:tcPr>
-          <w:p>
-            <w:pPr>
-              <w:pStyle w:val="Normal"/>
-              <w:widowControl/>
-              <w:spacing w:lineRule="auto" w:line="240" w:before="0" w:after="0"/>
-              <w:jc w:val="left"/>
-              <w:cnfStyle w:val="000000000000" w:firstRow="0" w:lastRow="0" w:firstColumn="0" w:lastColumn="0" w:oddVBand="0" w:evenVBand="0" w:oddHBand="0" w:evenHBand="0" w:firstRowFirstColumn="0" w:firstRowLastColumn="0" w:lastRowFirstColumn="0" w:lastRowLastColumn="0"/>
-              <w:rPr>
-                <w:rFonts w:eastAsia="Calibri" w:cs=""/>
-                <w:kern w:val="0"/>
-                <w:lang w:val="da-DK" w:eastAsia="en-US" w:bidi="ar-SA"/>
-              </w:rPr>
-            </w:pPr>
-            <w:r>
-              <w:rPr>
-                <w:rFonts w:eastAsia="Calibri" w:cs=""/>
-                <w:kern w:val="0"/>
-                <w:lang w:val="da-DK" w:eastAsia="en-US" w:bidi="ar-SA"/>
-              </w:rPr>
-            </w:r>
-          </w:p>
-        </w:tc>
-        <w:tc>
-          <w:tcPr>
-            <w:tcW w:w="3255" w:type="dxa"/>
-            <w:tcBorders/>
-          </w:tcPr>
-          <w:p>
-            <w:pPr>
-              <w:pStyle w:val="Normal"/>
-              <w:widowControl/>
+            </w:r>
+          </w:p>
+        </w:tc>
+        <w:tc>
+          <w:tcPr>
+            <w:tcW w:w="3116" w:type="dxa"/>
+            <w:tcBorders/>
+          </w:tcPr>
+          <w:p>
+            <w:pPr>
+              <w:pStyle w:val="Normal"/>
+              <w:widowControl/>
+              <w:suppressAutoHyphens w:val="true"/>
+              <w:spacing w:lineRule="auto" w:line="240" w:before="0" w:after="0"/>
+              <w:jc w:val="left"/>
+              <w:cnfStyle w:val="000000000000" w:firstRow="0" w:lastRow="0" w:firstColumn="0" w:lastColumn="0" w:oddVBand="0" w:evenVBand="0" w:oddHBand="0" w:evenHBand="0" w:firstRowFirstColumn="0" w:firstRowLastColumn="0" w:lastRowFirstColumn="0" w:lastRowLastColumn="0"/>
+              <w:rPr>
+                <w:rFonts w:eastAsia="Calibri" w:cs=""/>
+                <w:kern w:val="0"/>
+                <w:lang w:val="da-DK" w:eastAsia="en-US" w:bidi="ar-SA"/>
+              </w:rPr>
+            </w:pPr>
+            <w:r>
+              <w:rPr>
+                <w:rFonts w:eastAsia="Calibri" w:cs=""/>
+                <w:kern w:val="0"/>
+                <w:lang w:val="da-DK" w:eastAsia="en-US" w:bidi="ar-SA"/>
+              </w:rPr>
+            </w:r>
+          </w:p>
+        </w:tc>
+        <w:tc>
+          <w:tcPr>
+            <w:tcW w:w="3256" w:type="dxa"/>
+            <w:tcBorders/>
+          </w:tcPr>
+          <w:p>
+            <w:pPr>
+              <w:pStyle w:val="Normal"/>
+              <w:widowControl/>
+              <w:suppressAutoHyphens w:val="true"/>
               <w:spacing w:lineRule="auto" w:line="240" w:before="0" w:after="0"/>
               <w:jc w:val="left"/>
               <w:cnfStyle w:val="000000000000" w:firstRow="0" w:lastRow="0" w:firstColumn="0" w:lastColumn="0" w:oddVBand="0" w:evenVBand="0" w:oddHBand="0" w:evenHBand="0" w:firstRowFirstColumn="0" w:firstRowLastColumn="0" w:lastRowFirstColumn="0" w:lastRowLastColumn="0"/>
@@ -3557,6 +3590,7 @@
             <w:pPr>
               <w:pStyle w:val="Normal"/>
               <w:widowControl/>
+              <w:suppressAutoHyphens w:val="true"/>
               <w:spacing w:lineRule="auto" w:line="240" w:before="0" w:after="0"/>
               <w:jc w:val="left"/>
               <w:rPr>
@@ -3581,13 +3615,14 @@
         </w:tc>
         <w:tc>
           <w:tcPr>
-            <w:tcW w:w="3117" w:type="dxa"/>
-            <w:tcBorders/>
-          </w:tcPr>
-          <w:p>
-            <w:pPr>
-              <w:pStyle w:val="Normal"/>
-              <w:widowControl/>
+            <w:tcW w:w="3116" w:type="dxa"/>
+            <w:tcBorders/>
+          </w:tcPr>
+          <w:p>
+            <w:pPr>
+              <w:pStyle w:val="Normal"/>
+              <w:widowControl/>
+              <w:suppressAutoHyphens w:val="true"/>
               <w:spacing w:lineRule="auto" w:line="240" w:before="0" w:after="0"/>
               <w:jc w:val="left"/>
               <w:cnfStyle w:val="000000000000" w:firstRow="0" w:lastRow="0" w:firstColumn="0" w:lastColumn="0" w:oddVBand="0" w:evenVBand="0" w:oddHBand="0" w:evenHBand="0" w:firstRowFirstColumn="0" w:firstRowLastColumn="0" w:lastRowFirstColumn="0" w:lastRowLastColumn="0"/>
@@ -3609,13 +3644,14 @@
         </w:tc>
         <w:tc>
           <w:tcPr>
-            <w:tcW w:w="3255" w:type="dxa"/>
-            <w:tcBorders/>
-          </w:tcPr>
-          <w:p>
-            <w:pPr>
-              <w:pStyle w:val="Normal"/>
-              <w:widowControl/>
+            <w:tcW w:w="3256" w:type="dxa"/>
+            <w:tcBorders/>
+          </w:tcPr>
+          <w:p>
+            <w:pPr>
+              <w:pStyle w:val="Normal"/>
+              <w:widowControl/>
+              <w:suppressAutoHyphens w:val="true"/>
               <w:spacing w:lineRule="auto" w:line="240" w:before="0" w:after="0"/>
               <w:jc w:val="left"/>
               <w:cnfStyle w:val="000000000000" w:firstRow="0" w:lastRow="0" w:firstColumn="0" w:lastColumn="0" w:oddVBand="0" w:evenVBand="0" w:oddHBand="0" w:evenHBand="0" w:firstRowFirstColumn="0" w:firstRowLastColumn="0" w:lastRowFirstColumn="0" w:lastRowLastColumn="0"/>
@@ -3648,6 +3684,7 @@
             <w:pPr>
               <w:pStyle w:val="Normal"/>
               <w:widowControl/>
+              <w:suppressAutoHyphens w:val="true"/>
               <w:spacing w:lineRule="auto" w:line="240" w:before="0" w:after="0"/>
               <w:jc w:val="left"/>
               <w:rPr>
@@ -3672,13 +3709,14 @@
         </w:tc>
         <w:tc>
           <w:tcPr>
-            <w:tcW w:w="3117" w:type="dxa"/>
-            <w:tcBorders/>
-          </w:tcPr>
-          <w:p>
-            <w:pPr>
-              <w:pStyle w:val="Normal"/>
-              <w:widowControl/>
+            <w:tcW w:w="3116" w:type="dxa"/>
+            <w:tcBorders/>
+          </w:tcPr>
+          <w:p>
+            <w:pPr>
+              <w:pStyle w:val="Normal"/>
+              <w:widowControl/>
+              <w:suppressAutoHyphens w:val="true"/>
               <w:spacing w:lineRule="auto" w:line="240" w:before="0" w:after="0"/>
               <w:jc w:val="left"/>
               <w:cnfStyle w:val="000000000000" w:firstRow="0" w:lastRow="0" w:firstColumn="0" w:lastColumn="0" w:oddVBand="0" w:evenVBand="0" w:oddHBand="0" w:evenHBand="0" w:firstRowFirstColumn="0" w:firstRowLastColumn="0" w:lastRowFirstColumn="0" w:lastRowLastColumn="0"/>
@@ -3700,13 +3738,14 @@
         </w:tc>
         <w:tc>
           <w:tcPr>
-            <w:tcW w:w="3255" w:type="dxa"/>
-            <w:tcBorders/>
-          </w:tcPr>
-          <w:p>
-            <w:pPr>
-              <w:pStyle w:val="Normal"/>
-              <w:widowControl/>
+            <w:tcW w:w="3256" w:type="dxa"/>
+            <w:tcBorders/>
+          </w:tcPr>
+          <w:p>
+            <w:pPr>
+              <w:pStyle w:val="Normal"/>
+              <w:widowControl/>
+              <w:suppressAutoHyphens w:val="true"/>
               <w:spacing w:lineRule="auto" w:line="240" w:before="0" w:after="0"/>
               <w:jc w:val="left"/>
               <w:cnfStyle w:val="000000000000" w:firstRow="0" w:lastRow="0" w:firstColumn="0" w:lastColumn="0" w:oddVBand="0" w:evenVBand="0" w:oddHBand="0" w:evenHBand="0" w:firstRowFirstColumn="0" w:firstRowLastColumn="0" w:lastRowFirstColumn="0" w:lastRowLastColumn="0"/>
@@ -3739,6 +3778,7 @@
             <w:pPr>
               <w:pStyle w:val="Normal"/>
               <w:widowControl/>
+              <w:suppressAutoHyphens w:val="true"/>
               <w:spacing w:lineRule="auto" w:line="240" w:before="0" w:after="0"/>
               <w:jc w:val="left"/>
               <w:rPr>
@@ -3766,6 +3806,7 @@
             <w:pPr>
               <w:pStyle w:val="Normal"/>
               <w:widowControl/>
+              <w:suppressAutoHyphens w:val="true"/>
               <w:spacing w:lineRule="auto" w:line="240" w:before="0" w:after="0"/>
               <w:jc w:val="left"/>
               <w:rPr>
@@ -3801,6 +3842,7 @@
             <w:pPr>
               <w:pStyle w:val="Normal"/>
               <w:widowControl/>
+              <w:suppressAutoHyphens w:val="true"/>
               <w:spacing w:lineRule="auto" w:line="240" w:before="0" w:after="0"/>
               <w:jc w:val="left"/>
               <w:rPr>
@@ -3836,6 +3878,7 @@
             <w:pPr>
               <w:pStyle w:val="Normal"/>
               <w:widowControl/>
+              <w:suppressAutoHyphens w:val="true"/>
               <w:spacing w:lineRule="auto" w:line="240" w:before="0" w:after="0"/>
               <w:jc w:val="left"/>
               <w:rPr>
@@ -3871,6 +3914,7 @@
             <w:pPr>
               <w:pStyle w:val="Normal"/>
               <w:widowControl/>
+              <w:suppressAutoHyphens w:val="true"/>
               <w:spacing w:lineRule="auto" w:line="240" w:before="0" w:after="0"/>
               <w:jc w:val="left"/>
               <w:rPr>
@@ -3906,6 +3950,7 @@
             <w:pPr>
               <w:pStyle w:val="Normal"/>
               <w:widowControl/>
+              <w:suppressAutoHyphens w:val="true"/>
               <w:spacing w:lineRule="auto" w:line="240" w:before="0" w:after="0"/>
               <w:jc w:val="left"/>
               <w:rPr>
@@ -3941,6 +3986,7 @@
             <w:pPr>
               <w:pStyle w:val="Normal"/>
               <w:widowControl/>
+              <w:suppressAutoHyphens w:val="true"/>
               <w:spacing w:lineRule="auto" w:line="240" w:before="0" w:after="0"/>
               <w:jc w:val="left"/>
               <w:rPr>
@@ -3975,40 +4021,42 @@
         </w:tc>
         <w:tc>
           <w:tcPr>
-            <w:tcW w:w="3117" w:type="dxa"/>
-            <w:tcBorders/>
-          </w:tcPr>
-          <w:p>
-            <w:pPr>
-              <w:pStyle w:val="Normal"/>
-              <w:widowControl/>
-              <w:spacing w:lineRule="auto" w:line="240" w:before="0" w:after="0"/>
-              <w:jc w:val="left"/>
-              <w:cnfStyle w:val="000000000000" w:firstRow="0" w:lastRow="0" w:firstColumn="0" w:lastColumn="0" w:oddVBand="0" w:evenVBand="0" w:oddHBand="0" w:evenHBand="0" w:firstRowFirstColumn="0" w:firstRowLastColumn="0" w:lastRowFirstColumn="0" w:lastRowLastColumn="0"/>
-              <w:rPr>
-                <w:rFonts w:eastAsia="Calibri" w:cs=""/>
-                <w:kern w:val="0"/>
-                <w:lang w:val="da-DK" w:eastAsia="en-US" w:bidi="ar-SA"/>
-              </w:rPr>
-            </w:pPr>
-            <w:r>
-              <w:rPr>
-                <w:rFonts w:eastAsia="Calibri" w:cs=""/>
-                <w:kern w:val="0"/>
-                <w:lang w:val="da-DK" w:eastAsia="en-US" w:bidi="ar-SA"/>
-              </w:rPr>
-            </w:r>
-          </w:p>
-        </w:tc>
-        <w:tc>
-          <w:tcPr>
-            <w:tcW w:w="3255" w:type="dxa"/>
-            <w:tcBorders/>
-          </w:tcPr>
-          <w:p>
-            <w:pPr>
-              <w:pStyle w:val="Normal"/>
-              <w:widowControl/>
+            <w:tcW w:w="3116" w:type="dxa"/>
+            <w:tcBorders/>
+          </w:tcPr>
+          <w:p>
+            <w:pPr>
+              <w:pStyle w:val="Normal"/>
+              <w:widowControl/>
+              <w:suppressAutoHyphens w:val="true"/>
+              <w:spacing w:lineRule="auto" w:line="240" w:before="0" w:after="0"/>
+              <w:jc w:val="left"/>
+              <w:cnfStyle w:val="000000000000" w:firstRow="0" w:lastRow="0" w:firstColumn="0" w:lastColumn="0" w:oddVBand="0" w:evenVBand="0" w:oddHBand="0" w:evenHBand="0" w:firstRowFirstColumn="0" w:firstRowLastColumn="0" w:lastRowFirstColumn="0" w:lastRowLastColumn="0"/>
+              <w:rPr>
+                <w:rFonts w:eastAsia="Calibri" w:cs=""/>
+                <w:kern w:val="0"/>
+                <w:lang w:val="da-DK" w:eastAsia="en-US" w:bidi="ar-SA"/>
+              </w:rPr>
+            </w:pPr>
+            <w:r>
+              <w:rPr>
+                <w:rFonts w:eastAsia="Calibri" w:cs=""/>
+                <w:kern w:val="0"/>
+                <w:lang w:val="da-DK" w:eastAsia="en-US" w:bidi="ar-SA"/>
+              </w:rPr>
+            </w:r>
+          </w:p>
+        </w:tc>
+        <w:tc>
+          <w:tcPr>
+            <w:tcW w:w="3256" w:type="dxa"/>
+            <w:tcBorders/>
+          </w:tcPr>
+          <w:p>
+            <w:pPr>
+              <w:pStyle w:val="Normal"/>
+              <w:widowControl/>
+              <w:suppressAutoHyphens w:val="true"/>
               <w:spacing w:lineRule="auto" w:line="240" w:before="0" w:after="0"/>
               <w:jc w:val="left"/>
               <w:cnfStyle w:val="000000000000" w:firstRow="0" w:lastRow="0" w:firstColumn="0" w:lastColumn="0" w:oddVBand="0" w:evenVBand="0" w:oddHBand="0" w:evenHBand="0" w:firstRowFirstColumn="0" w:firstRowLastColumn="0" w:lastRowFirstColumn="0" w:lastRowLastColumn="0"/>
@@ -4041,6 +4089,7 @@
             <w:pPr>
               <w:pStyle w:val="Normal"/>
               <w:widowControl/>
+              <w:suppressAutoHyphens w:val="true"/>
               <w:spacing w:lineRule="auto" w:line="240" w:before="0" w:after="0"/>
               <w:jc w:val="left"/>
               <w:rPr>
@@ -4065,13 +4114,14 @@
         </w:tc>
         <w:tc>
           <w:tcPr>
-            <w:tcW w:w="3117" w:type="dxa"/>
-            <w:tcBorders/>
-          </w:tcPr>
-          <w:p>
-            <w:pPr>
-              <w:pStyle w:val="Normal"/>
-              <w:widowControl/>
+            <w:tcW w:w="3116" w:type="dxa"/>
+            <w:tcBorders/>
+          </w:tcPr>
+          <w:p>
+            <w:pPr>
+              <w:pStyle w:val="Normal"/>
+              <w:widowControl/>
+              <w:suppressAutoHyphens w:val="true"/>
               <w:spacing w:lineRule="auto" w:line="240" w:before="0" w:after="0"/>
               <w:jc w:val="left"/>
               <w:cnfStyle w:val="000000000000" w:firstRow="0" w:lastRow="0" w:firstColumn="0" w:lastColumn="0" w:oddVBand="0" w:evenVBand="0" w:oddHBand="0" w:evenHBand="0" w:firstRowFirstColumn="0" w:firstRowLastColumn="0" w:lastRowFirstColumn="0" w:lastRowLastColumn="0"/>
@@ -4093,13 +4143,14 @@
         </w:tc>
         <w:tc>
           <w:tcPr>
-            <w:tcW w:w="3255" w:type="dxa"/>
-            <w:tcBorders/>
-          </w:tcPr>
-          <w:p>
-            <w:pPr>
-              <w:pStyle w:val="Normal"/>
-              <w:widowControl/>
+            <w:tcW w:w="3256" w:type="dxa"/>
+            <w:tcBorders/>
+          </w:tcPr>
+          <w:p>
+            <w:pPr>
+              <w:pStyle w:val="Normal"/>
+              <w:widowControl/>
+              <w:suppressAutoHyphens w:val="true"/>
               <w:spacing w:lineRule="auto" w:line="240" w:before="0" w:after="0"/>
               <w:jc w:val="left"/>
               <w:cnfStyle w:val="000000000000" w:firstRow="0" w:lastRow="0" w:firstColumn="0" w:lastColumn="0" w:oddVBand="0" w:evenVBand="0" w:oddHBand="0" w:evenHBand="0" w:firstRowFirstColumn="0" w:firstRowLastColumn="0" w:lastRowFirstColumn="0" w:lastRowLastColumn="0"/>
@@ -4132,6 +4183,7 @@
             <w:pPr>
               <w:pStyle w:val="Normal"/>
               <w:widowControl/>
+              <w:suppressAutoHyphens w:val="true"/>
               <w:spacing w:lineRule="auto" w:line="240" w:before="0" w:after="0"/>
               <w:jc w:val="left"/>
               <w:rPr>
@@ -4156,13 +4208,14 @@
         </w:tc>
         <w:tc>
           <w:tcPr>
-            <w:tcW w:w="3117" w:type="dxa"/>
-            <w:tcBorders/>
-          </w:tcPr>
-          <w:p>
-            <w:pPr>
-              <w:pStyle w:val="Normal"/>
-              <w:widowControl/>
+            <w:tcW w:w="3116" w:type="dxa"/>
+            <w:tcBorders/>
+          </w:tcPr>
+          <w:p>
+            <w:pPr>
+              <w:pStyle w:val="Normal"/>
+              <w:widowControl/>
+              <w:suppressAutoHyphens w:val="true"/>
               <w:spacing w:lineRule="auto" w:line="240" w:before="0" w:after="0"/>
               <w:jc w:val="left"/>
               <w:cnfStyle w:val="000000000000" w:firstRow="0" w:lastRow="0" w:firstColumn="0" w:lastColumn="0" w:oddVBand="0" w:evenVBand="0" w:oddHBand="0" w:evenHBand="0" w:firstRowFirstColumn="0" w:firstRowLastColumn="0" w:lastRowFirstColumn="0" w:lastRowLastColumn="0"/>
@@ -4184,13 +4237,14 @@
         </w:tc>
         <w:tc>
           <w:tcPr>
-            <w:tcW w:w="3255" w:type="dxa"/>
-            <w:tcBorders/>
-          </w:tcPr>
-          <w:p>
-            <w:pPr>
-              <w:pStyle w:val="Normal"/>
-              <w:widowControl/>
+            <w:tcW w:w="3256" w:type="dxa"/>
+            <w:tcBorders/>
+          </w:tcPr>
+          <w:p>
+            <w:pPr>
+              <w:pStyle w:val="Normal"/>
+              <w:widowControl/>
+              <w:suppressAutoHyphens w:val="true"/>
               <w:spacing w:lineRule="auto" w:line="240" w:before="0" w:after="0"/>
               <w:jc w:val="left"/>
               <w:cnfStyle w:val="000000000000" w:firstRow="0" w:lastRow="0" w:firstColumn="0" w:lastColumn="0" w:oddVBand="0" w:evenVBand="0" w:oddHBand="0" w:evenHBand="0" w:firstRowFirstColumn="0" w:firstRowLastColumn="0" w:lastRowFirstColumn="0" w:lastRowLastColumn="0"/>
@@ -4223,6 +4277,7 @@
             <w:pPr>
               <w:pStyle w:val="Normal"/>
               <w:widowControl/>
+              <w:suppressAutoHyphens w:val="true"/>
               <w:spacing w:lineRule="auto" w:line="240" w:before="0" w:after="0"/>
               <w:jc w:val="left"/>
               <w:rPr>
@@ -4247,13 +4302,14 @@
         </w:tc>
         <w:tc>
           <w:tcPr>
-            <w:tcW w:w="3117" w:type="dxa"/>
-            <w:tcBorders/>
-          </w:tcPr>
-          <w:p>
-            <w:pPr>
-              <w:pStyle w:val="Normal"/>
-              <w:widowControl/>
+            <w:tcW w:w="3116" w:type="dxa"/>
+            <w:tcBorders/>
+          </w:tcPr>
+          <w:p>
+            <w:pPr>
+              <w:pStyle w:val="Normal"/>
+              <w:widowControl/>
+              <w:suppressAutoHyphens w:val="true"/>
               <w:spacing w:lineRule="auto" w:line="240" w:before="0" w:after="0"/>
               <w:jc w:val="left"/>
               <w:cnfStyle w:val="000000000000" w:firstRow="0" w:lastRow="0" w:firstColumn="0" w:lastColumn="0" w:oddVBand="0" w:evenVBand="0" w:oddHBand="0" w:evenHBand="0" w:firstRowFirstColumn="0" w:firstRowLastColumn="0" w:lastRowFirstColumn="0" w:lastRowLastColumn="0"/>
@@ -4275,13 +4331,14 @@
         </w:tc>
         <w:tc>
           <w:tcPr>
-            <w:tcW w:w="3255" w:type="dxa"/>
-            <w:tcBorders/>
-          </w:tcPr>
-          <w:p>
-            <w:pPr>
-              <w:pStyle w:val="Normal"/>
-              <w:widowControl/>
+            <w:tcW w:w="3256" w:type="dxa"/>
+            <w:tcBorders/>
+          </w:tcPr>
+          <w:p>
+            <w:pPr>
+              <w:pStyle w:val="Normal"/>
+              <w:widowControl/>
+              <w:suppressAutoHyphens w:val="true"/>
               <w:spacing w:lineRule="auto" w:line="240" w:before="0" w:after="0"/>
               <w:jc w:val="left"/>
               <w:cnfStyle w:val="000000000000" w:firstRow="0" w:lastRow="0" w:firstColumn="0" w:lastColumn="0" w:oddVBand="0" w:evenVBand="0" w:oddHBand="0" w:evenHBand="0" w:firstRowFirstColumn="0" w:firstRowLastColumn="0" w:lastRowFirstColumn="0" w:lastRowLastColumn="0"/>
@@ -4314,6 +4371,7 @@
             <w:pPr>
               <w:pStyle w:val="Normal"/>
               <w:widowControl/>
+              <w:suppressAutoHyphens w:val="true"/>
               <w:spacing w:lineRule="auto" w:line="240" w:before="0" w:after="0"/>
               <w:jc w:val="left"/>
               <w:rPr>
@@ -4338,40 +4396,42 @@
         </w:tc>
         <w:tc>
           <w:tcPr>
-            <w:tcW w:w="3117" w:type="dxa"/>
-            <w:tcBorders/>
-          </w:tcPr>
-          <w:p>
-            <w:pPr>
-              <w:pStyle w:val="Normal"/>
-              <w:widowControl/>
-              <w:spacing w:lineRule="auto" w:line="240" w:before="0" w:after="0"/>
-              <w:jc w:val="left"/>
-              <w:cnfStyle w:val="000000000000" w:firstRow="0" w:lastRow="0" w:firstColumn="0" w:lastColumn="0" w:oddVBand="0" w:evenVBand="0" w:oddHBand="0" w:evenHBand="0" w:firstRowFirstColumn="0" w:firstRowLastColumn="0" w:lastRowFirstColumn="0" w:lastRowLastColumn="0"/>
-              <w:rPr>
-                <w:rFonts w:eastAsia="Calibri" w:cs=""/>
-                <w:kern w:val="0"/>
-                <w:lang w:val="da-DK" w:eastAsia="en-US" w:bidi="ar-SA"/>
-              </w:rPr>
-            </w:pPr>
-            <w:r>
-              <w:rPr>
-                <w:rFonts w:eastAsia="Calibri" w:cs=""/>
-                <w:kern w:val="0"/>
-                <w:lang w:val="da-DK" w:eastAsia="en-US" w:bidi="ar-SA"/>
-              </w:rPr>
-            </w:r>
-          </w:p>
-        </w:tc>
-        <w:tc>
-          <w:tcPr>
-            <w:tcW w:w="3255" w:type="dxa"/>
-            <w:tcBorders/>
-          </w:tcPr>
-          <w:p>
-            <w:pPr>
-              <w:pStyle w:val="Normal"/>
-              <w:widowControl/>
+            <w:tcW w:w="3116" w:type="dxa"/>
+            <w:tcBorders/>
+          </w:tcPr>
+          <w:p>
+            <w:pPr>
+              <w:pStyle w:val="Normal"/>
+              <w:widowControl/>
+              <w:suppressAutoHyphens w:val="true"/>
+              <w:spacing w:lineRule="auto" w:line="240" w:before="0" w:after="0"/>
+              <w:jc w:val="left"/>
+              <w:cnfStyle w:val="000000000000" w:firstRow="0" w:lastRow="0" w:firstColumn="0" w:lastColumn="0" w:oddVBand="0" w:evenVBand="0" w:oddHBand="0" w:evenHBand="0" w:firstRowFirstColumn="0" w:firstRowLastColumn="0" w:lastRowFirstColumn="0" w:lastRowLastColumn="0"/>
+              <w:rPr>
+                <w:rFonts w:eastAsia="Calibri" w:cs=""/>
+                <w:kern w:val="0"/>
+                <w:lang w:val="da-DK" w:eastAsia="en-US" w:bidi="ar-SA"/>
+              </w:rPr>
+            </w:pPr>
+            <w:r>
+              <w:rPr>
+                <w:rFonts w:eastAsia="Calibri" w:cs=""/>
+                <w:kern w:val="0"/>
+                <w:lang w:val="da-DK" w:eastAsia="en-US" w:bidi="ar-SA"/>
+              </w:rPr>
+            </w:r>
+          </w:p>
+        </w:tc>
+        <w:tc>
+          <w:tcPr>
+            <w:tcW w:w="3256" w:type="dxa"/>
+            <w:tcBorders/>
+          </w:tcPr>
+          <w:p>
+            <w:pPr>
+              <w:pStyle w:val="Normal"/>
+              <w:widowControl/>
+              <w:suppressAutoHyphens w:val="true"/>
               <w:spacing w:lineRule="auto" w:line="240" w:before="0" w:after="0"/>
               <w:jc w:val="left"/>
               <w:cnfStyle w:val="000000000000" w:firstRow="0" w:lastRow="0" w:firstColumn="0" w:lastColumn="0" w:oddVBand="0" w:evenVBand="0" w:oddHBand="0" w:evenHBand="0" w:firstRowFirstColumn="0" w:firstRowLastColumn="0" w:lastRowFirstColumn="0" w:lastRowLastColumn="0"/>
@@ -4404,6 +4464,7 @@
             <w:pPr>
               <w:pStyle w:val="Normal"/>
               <w:widowControl/>
+              <w:suppressAutoHyphens w:val="true"/>
               <w:spacing w:lineRule="auto" w:line="240" w:before="0" w:after="0"/>
               <w:jc w:val="left"/>
               <w:rPr>
@@ -4428,13 +4489,14 @@
         </w:tc>
         <w:tc>
           <w:tcPr>
-            <w:tcW w:w="3117" w:type="dxa"/>
-            <w:tcBorders/>
-          </w:tcPr>
-          <w:p>
-            <w:pPr>
-              <w:pStyle w:val="Normal"/>
-              <w:widowControl/>
+            <w:tcW w:w="3116" w:type="dxa"/>
+            <w:tcBorders/>
+          </w:tcPr>
+          <w:p>
+            <w:pPr>
+              <w:pStyle w:val="Normal"/>
+              <w:widowControl/>
+              <w:suppressAutoHyphens w:val="true"/>
               <w:spacing w:lineRule="auto" w:line="240" w:before="0" w:after="0"/>
               <w:jc w:val="left"/>
               <w:cnfStyle w:val="000000000000" w:firstRow="0" w:lastRow="0" w:firstColumn="0" w:lastColumn="0" w:oddVBand="0" w:evenVBand="0" w:oddHBand="0" w:evenHBand="0" w:firstRowFirstColumn="0" w:firstRowLastColumn="0" w:lastRowFirstColumn="0" w:lastRowLastColumn="0"/>
@@ -4456,13 +4518,14 @@
         </w:tc>
         <w:tc>
           <w:tcPr>
-            <w:tcW w:w="3255" w:type="dxa"/>
-            <w:tcBorders/>
-          </w:tcPr>
-          <w:p>
-            <w:pPr>
-              <w:pStyle w:val="Normal"/>
-              <w:widowControl/>
+            <w:tcW w:w="3256" w:type="dxa"/>
+            <w:tcBorders/>
+          </w:tcPr>
+          <w:p>
+            <w:pPr>
+              <w:pStyle w:val="Normal"/>
+              <w:widowControl/>
+              <w:suppressAutoHyphens w:val="true"/>
               <w:spacing w:lineRule="auto" w:line="240" w:before="0" w:after="0"/>
               <w:jc w:val="left"/>
               <w:cnfStyle w:val="000000000000" w:firstRow="0" w:lastRow="0" w:firstColumn="0" w:lastColumn="0" w:oddVBand="0" w:evenVBand="0" w:oddHBand="0" w:evenHBand="0" w:firstRowFirstColumn="0" w:firstRowLastColumn="0" w:lastRowFirstColumn="0" w:lastRowLastColumn="0"/>
@@ -4495,6 +4558,7 @@
             <w:pPr>
               <w:pStyle w:val="Normal"/>
               <w:widowControl/>
+              <w:suppressAutoHyphens w:val="true"/>
               <w:spacing w:lineRule="auto" w:line="240" w:before="0" w:after="0"/>
               <w:jc w:val="left"/>
               <w:rPr>
@@ -4519,13 +4583,14 @@
         </w:tc>
         <w:tc>
           <w:tcPr>
-            <w:tcW w:w="3117" w:type="dxa"/>
-            <w:tcBorders/>
-          </w:tcPr>
-          <w:p>
-            <w:pPr>
-              <w:pStyle w:val="Normal"/>
-              <w:widowControl/>
+            <w:tcW w:w="3116" w:type="dxa"/>
+            <w:tcBorders/>
+          </w:tcPr>
+          <w:p>
+            <w:pPr>
+              <w:pStyle w:val="Normal"/>
+              <w:widowControl/>
+              <w:suppressAutoHyphens w:val="true"/>
               <w:spacing w:lineRule="auto" w:line="240" w:before="0" w:after="0"/>
               <w:jc w:val="left"/>
               <w:cnfStyle w:val="000000000000" w:firstRow="0" w:lastRow="0" w:firstColumn="0" w:lastColumn="0" w:oddVBand="0" w:evenVBand="0" w:oddHBand="0" w:evenHBand="0" w:firstRowFirstColumn="0" w:firstRowLastColumn="0" w:lastRowFirstColumn="0" w:lastRowLastColumn="0"/>
@@ -4547,13 +4612,14 @@
         </w:tc>
         <w:tc>
           <w:tcPr>
-            <w:tcW w:w="3255" w:type="dxa"/>
-            <w:tcBorders/>
-          </w:tcPr>
-          <w:p>
-            <w:pPr>
-              <w:pStyle w:val="Normal"/>
-              <w:widowControl/>
+            <w:tcW w:w="3256" w:type="dxa"/>
+            <w:tcBorders/>
+          </w:tcPr>
+          <w:p>
+            <w:pPr>
+              <w:pStyle w:val="Normal"/>
+              <w:widowControl/>
+              <w:suppressAutoHyphens w:val="true"/>
               <w:spacing w:lineRule="auto" w:line="240" w:before="0" w:after="0"/>
               <w:jc w:val="left"/>
               <w:cnfStyle w:val="000000000000" w:firstRow="0" w:lastRow="0" w:firstColumn="0" w:lastColumn="0" w:oddVBand="0" w:evenVBand="0" w:oddHBand="0" w:evenHBand="0" w:firstRowFirstColumn="0" w:firstRowLastColumn="0" w:lastRowFirstColumn="0" w:lastRowLastColumn="0"/>
@@ -4586,6 +4652,7 @@
             <w:pPr>
               <w:pStyle w:val="Normal"/>
               <w:widowControl/>
+              <w:suppressAutoHyphens w:val="true"/>
               <w:spacing w:lineRule="auto" w:line="240" w:before="0" w:after="0"/>
               <w:jc w:val="left"/>
               <w:rPr>
@@ -4610,40 +4677,42 @@
         </w:tc>
         <w:tc>
           <w:tcPr>
-            <w:tcW w:w="3117" w:type="dxa"/>
-            <w:tcBorders/>
-          </w:tcPr>
-          <w:p>
-            <w:pPr>
-              <w:pStyle w:val="Normal"/>
-              <w:widowControl/>
-              <w:spacing w:lineRule="auto" w:line="240" w:before="0" w:after="0"/>
-              <w:jc w:val="left"/>
-              <w:cnfStyle w:val="000000000000" w:firstRow="0" w:lastRow="0" w:firstColumn="0" w:lastColumn="0" w:oddVBand="0" w:evenVBand="0" w:oddHBand="0" w:evenHBand="0" w:firstRowFirstColumn="0" w:firstRowLastColumn="0" w:lastRowFirstColumn="0" w:lastRowLastColumn="0"/>
-              <w:rPr>
-                <w:rFonts w:eastAsia="Calibri" w:cs=""/>
-                <w:kern w:val="0"/>
-                <w:lang w:val="da-DK" w:eastAsia="en-US" w:bidi="ar-SA"/>
-              </w:rPr>
-            </w:pPr>
-            <w:r>
-              <w:rPr>
-                <w:rFonts w:eastAsia="Calibri" w:cs=""/>
-                <w:kern w:val="0"/>
-                <w:lang w:val="da-DK" w:eastAsia="en-US" w:bidi="ar-SA"/>
-              </w:rPr>
-            </w:r>
-          </w:p>
-        </w:tc>
-        <w:tc>
-          <w:tcPr>
-            <w:tcW w:w="3255" w:type="dxa"/>
-            <w:tcBorders/>
-          </w:tcPr>
-          <w:p>
-            <w:pPr>
-              <w:pStyle w:val="Normal"/>
-              <w:widowControl/>
+            <w:tcW w:w="3116" w:type="dxa"/>
+            <w:tcBorders/>
+          </w:tcPr>
+          <w:p>
+            <w:pPr>
+              <w:pStyle w:val="Normal"/>
+              <w:widowControl/>
+              <w:suppressAutoHyphens w:val="true"/>
+              <w:spacing w:lineRule="auto" w:line="240" w:before="0" w:after="0"/>
+              <w:jc w:val="left"/>
+              <w:cnfStyle w:val="000000000000" w:firstRow="0" w:lastRow="0" w:firstColumn="0" w:lastColumn="0" w:oddVBand="0" w:evenVBand="0" w:oddHBand="0" w:evenHBand="0" w:firstRowFirstColumn="0" w:firstRowLastColumn="0" w:lastRowFirstColumn="0" w:lastRowLastColumn="0"/>
+              <w:rPr>
+                <w:rFonts w:eastAsia="Calibri" w:cs=""/>
+                <w:kern w:val="0"/>
+                <w:lang w:val="da-DK" w:eastAsia="en-US" w:bidi="ar-SA"/>
+              </w:rPr>
+            </w:pPr>
+            <w:r>
+              <w:rPr>
+                <w:rFonts w:eastAsia="Calibri" w:cs=""/>
+                <w:kern w:val="0"/>
+                <w:lang w:val="da-DK" w:eastAsia="en-US" w:bidi="ar-SA"/>
+              </w:rPr>
+            </w:r>
+          </w:p>
+        </w:tc>
+        <w:tc>
+          <w:tcPr>
+            <w:tcW w:w="3256" w:type="dxa"/>
+            <w:tcBorders/>
+          </w:tcPr>
+          <w:p>
+            <w:pPr>
+              <w:pStyle w:val="Normal"/>
+              <w:widowControl/>
+              <w:suppressAutoHyphens w:val="true"/>
               <w:spacing w:lineRule="auto" w:line="240" w:before="0" w:after="0"/>
               <w:jc w:val="left"/>
               <w:cnfStyle w:val="000000000000" w:firstRow="0" w:lastRow="0" w:firstColumn="0" w:lastColumn="0" w:oddVBand="0" w:evenVBand="0" w:oddHBand="0" w:evenHBand="0" w:firstRowFirstColumn="0" w:firstRowLastColumn="0" w:lastRowFirstColumn="0" w:lastRowLastColumn="0"/>
@@ -4676,6 +4745,7 @@
             <w:pPr>
               <w:pStyle w:val="Normal"/>
               <w:widowControl/>
+              <w:suppressAutoHyphens w:val="true"/>
               <w:spacing w:lineRule="auto" w:line="240" w:before="0" w:after="0"/>
               <w:jc w:val="left"/>
               <w:rPr>
@@ -4700,13 +4770,14 @@
         </w:tc>
         <w:tc>
           <w:tcPr>
-            <w:tcW w:w="3117" w:type="dxa"/>
-            <w:tcBorders/>
-          </w:tcPr>
-          <w:p>
-            <w:pPr>
-              <w:pStyle w:val="Normal"/>
-              <w:widowControl/>
+            <w:tcW w:w="3116" w:type="dxa"/>
+            <w:tcBorders/>
+          </w:tcPr>
+          <w:p>
+            <w:pPr>
+              <w:pStyle w:val="Normal"/>
+              <w:widowControl/>
+              <w:suppressAutoHyphens w:val="true"/>
               <w:spacing w:lineRule="auto" w:line="240" w:before="0" w:after="0"/>
               <w:jc w:val="left"/>
               <w:cnfStyle w:val="000000000000" w:firstRow="0" w:lastRow="0" w:firstColumn="0" w:lastColumn="0" w:oddVBand="0" w:evenVBand="0" w:oddHBand="0" w:evenHBand="0" w:firstRowFirstColumn="0" w:firstRowLastColumn="0" w:lastRowFirstColumn="0" w:lastRowLastColumn="0"/>
@@ -4728,13 +4799,14 @@
         </w:tc>
         <w:tc>
           <w:tcPr>
-            <w:tcW w:w="3255" w:type="dxa"/>
-            <w:tcBorders/>
-          </w:tcPr>
-          <w:p>
-            <w:pPr>
-              <w:pStyle w:val="Normal"/>
-              <w:widowControl/>
+            <w:tcW w:w="3256" w:type="dxa"/>
+            <w:tcBorders/>
+          </w:tcPr>
+          <w:p>
+            <w:pPr>
+              <w:pStyle w:val="Normal"/>
+              <w:widowControl/>
+              <w:suppressAutoHyphens w:val="true"/>
               <w:spacing w:lineRule="auto" w:line="240" w:before="0" w:after="0"/>
               <w:jc w:val="left"/>
               <w:cnfStyle w:val="000000000000" w:firstRow="0" w:lastRow="0" w:firstColumn="0" w:lastColumn="0" w:oddVBand="0" w:evenVBand="0" w:oddHBand="0" w:evenHBand="0" w:firstRowFirstColumn="0" w:firstRowLastColumn="0" w:lastRowFirstColumn="0" w:lastRowLastColumn="0"/>
@@ -4769,6 +4841,7 @@
             <w:pPr>
               <w:pStyle w:val="Normal"/>
               <w:widowControl/>
+              <w:suppressAutoHyphens w:val="true"/>
               <w:spacing w:lineRule="auto" w:line="240" w:before="0" w:after="0"/>
               <w:jc w:val="left"/>
               <w:rPr>
@@ -4793,13 +4866,14 @@
         </w:tc>
         <w:tc>
           <w:tcPr>
-            <w:tcW w:w="3117" w:type="dxa"/>
-            <w:tcBorders/>
-          </w:tcPr>
-          <w:p>
-            <w:pPr>
-              <w:pStyle w:val="Normal"/>
-              <w:widowControl/>
+            <w:tcW w:w="3116" w:type="dxa"/>
+            <w:tcBorders/>
+          </w:tcPr>
+          <w:p>
+            <w:pPr>
+              <w:pStyle w:val="Normal"/>
+              <w:widowControl/>
+              <w:suppressAutoHyphens w:val="true"/>
               <w:spacing w:lineRule="auto" w:line="240" w:before="0" w:after="0"/>
               <w:jc w:val="left"/>
               <w:cnfStyle w:val="000000000000" w:firstRow="0" w:lastRow="0" w:firstColumn="0" w:lastColumn="0" w:oddVBand="0" w:evenVBand="0" w:oddHBand="0" w:evenHBand="0" w:firstRowFirstColumn="0" w:firstRowLastColumn="0" w:lastRowFirstColumn="0" w:lastRowLastColumn="0"/>
@@ -4821,13 +4895,14 @@
         </w:tc>
         <w:tc>
           <w:tcPr>
-            <w:tcW w:w="3255" w:type="dxa"/>
-            <w:tcBorders/>
-          </w:tcPr>
-          <w:p>
-            <w:pPr>
-              <w:pStyle w:val="Normal"/>
-              <w:widowControl/>
+            <w:tcW w:w="3256" w:type="dxa"/>
+            <w:tcBorders/>
+          </w:tcPr>
+          <w:p>
+            <w:pPr>
+              <w:pStyle w:val="Normal"/>
+              <w:widowControl/>
+              <w:suppressAutoHyphens w:val="true"/>
               <w:spacing w:lineRule="auto" w:line="240" w:before="0" w:after="0"/>
               <w:jc w:val="left"/>
               <w:cnfStyle w:val="000000000000" w:firstRow="0" w:lastRow="0" w:firstColumn="0" w:lastColumn="0" w:oddVBand="0" w:evenVBand="0" w:oddHBand="0" w:evenHBand="0" w:firstRowFirstColumn="0" w:firstRowLastColumn="0" w:lastRowFirstColumn="0" w:lastRowLastColumn="0"/>
@@ -4860,6 +4935,7 @@
             <w:pPr>
               <w:pStyle w:val="Normal"/>
               <w:widowControl/>
+              <w:suppressAutoHyphens w:val="true"/>
               <w:spacing w:lineRule="auto" w:line="240" w:before="0" w:after="0"/>
               <w:jc w:val="left"/>
               <w:rPr>
@@ -4884,13 +4960,14 @@
         </w:tc>
         <w:tc>
           <w:tcPr>
-            <w:tcW w:w="3117" w:type="dxa"/>
-            <w:tcBorders/>
-          </w:tcPr>
-          <w:p>
-            <w:pPr>
-              <w:pStyle w:val="Normal"/>
-              <w:widowControl/>
+            <w:tcW w:w="3116" w:type="dxa"/>
+            <w:tcBorders/>
+          </w:tcPr>
+          <w:p>
+            <w:pPr>
+              <w:pStyle w:val="Normal"/>
+              <w:widowControl/>
+              <w:suppressAutoHyphens w:val="true"/>
               <w:spacing w:lineRule="auto" w:line="240" w:before="0" w:after="0"/>
               <w:jc w:val="left"/>
               <w:cnfStyle w:val="000000000000" w:firstRow="0" w:lastRow="0" w:firstColumn="0" w:lastColumn="0" w:oddVBand="0" w:evenVBand="0" w:oddHBand="0" w:evenHBand="0" w:firstRowFirstColumn="0" w:firstRowLastColumn="0" w:lastRowFirstColumn="0" w:lastRowLastColumn="0"/>
@@ -4912,13 +4989,14 @@
         </w:tc>
         <w:tc>
           <w:tcPr>
-            <w:tcW w:w="3255" w:type="dxa"/>
-            <w:tcBorders/>
-          </w:tcPr>
-          <w:p>
-            <w:pPr>
-              <w:pStyle w:val="Normal"/>
-              <w:widowControl/>
+            <w:tcW w:w="3256" w:type="dxa"/>
+            <w:tcBorders/>
+          </w:tcPr>
+          <w:p>
+            <w:pPr>
+              <w:pStyle w:val="Normal"/>
+              <w:widowControl/>
+              <w:suppressAutoHyphens w:val="true"/>
               <w:spacing w:lineRule="auto" w:line="240" w:before="0" w:after="0"/>
               <w:jc w:val="left"/>
               <w:cnfStyle w:val="000000000000" w:firstRow="0" w:lastRow="0" w:firstColumn="0" w:lastColumn="0" w:oddVBand="0" w:evenVBand="0" w:oddHBand="0" w:evenHBand="0" w:firstRowFirstColumn="0" w:firstRowLastColumn="0" w:lastRowFirstColumn="0" w:lastRowLastColumn="0"/>
@@ -4951,6 +5029,7 @@
             <w:pPr>
               <w:pStyle w:val="Normal"/>
               <w:widowControl/>
+              <w:suppressAutoHyphens w:val="true"/>
               <w:spacing w:lineRule="auto" w:line="240" w:before="0" w:after="0"/>
               <w:jc w:val="left"/>
               <w:rPr>
@@ -4975,13 +5054,14 @@
         </w:tc>
         <w:tc>
           <w:tcPr>
-            <w:tcW w:w="3117" w:type="dxa"/>
-            <w:tcBorders/>
-          </w:tcPr>
-          <w:p>
-            <w:pPr>
-              <w:pStyle w:val="Normal"/>
-              <w:widowControl/>
+            <w:tcW w:w="3116" w:type="dxa"/>
+            <w:tcBorders/>
+          </w:tcPr>
+          <w:p>
+            <w:pPr>
+              <w:pStyle w:val="Normal"/>
+              <w:widowControl/>
+              <w:suppressAutoHyphens w:val="true"/>
               <w:spacing w:lineRule="auto" w:line="240" w:before="0" w:after="0"/>
               <w:jc w:val="left"/>
               <w:cnfStyle w:val="000000000000" w:firstRow="0" w:lastRow="0" w:firstColumn="0" w:lastColumn="0" w:oddVBand="0" w:evenVBand="0" w:oddHBand="0" w:evenHBand="0" w:firstRowFirstColumn="0" w:firstRowLastColumn="0" w:lastRowFirstColumn="0" w:lastRowLastColumn="0"/>
@@ -5003,13 +5083,14 @@
         </w:tc>
         <w:tc>
           <w:tcPr>
-            <w:tcW w:w="3255" w:type="dxa"/>
-            <w:tcBorders/>
-          </w:tcPr>
-          <w:p>
-            <w:pPr>
-              <w:pStyle w:val="Normal"/>
-              <w:widowControl/>
+            <w:tcW w:w="3256" w:type="dxa"/>
+            <w:tcBorders/>
+          </w:tcPr>
+          <w:p>
+            <w:pPr>
+              <w:pStyle w:val="Normal"/>
+              <w:widowControl/>
+              <w:suppressAutoHyphens w:val="true"/>
               <w:spacing w:lineRule="auto" w:line="240" w:before="0" w:after="0"/>
               <w:jc w:val="left"/>
               <w:cnfStyle w:val="000000000000" w:firstRow="0" w:lastRow="0" w:firstColumn="0" w:lastColumn="0" w:oddVBand="0" w:evenVBand="0" w:oddHBand="0" w:evenHBand="0" w:firstRowFirstColumn="0" w:firstRowLastColumn="0" w:lastRowFirstColumn="0" w:lastRowLastColumn="0"/>
@@ -5042,6 +5123,7 @@
             <w:pPr>
               <w:pStyle w:val="Normal"/>
               <w:widowControl/>
+              <w:suppressAutoHyphens w:val="true"/>
               <w:spacing w:lineRule="auto" w:line="240" w:before="0" w:after="0"/>
               <w:jc w:val="left"/>
               <w:rPr>
@@ -5066,13 +5148,14 @@
         </w:tc>
         <w:tc>
           <w:tcPr>
-            <w:tcW w:w="3117" w:type="dxa"/>
-            <w:tcBorders/>
-          </w:tcPr>
-          <w:p>
-            <w:pPr>
-              <w:pStyle w:val="Normal"/>
-              <w:widowControl/>
+            <w:tcW w:w="3116" w:type="dxa"/>
+            <w:tcBorders/>
+          </w:tcPr>
+          <w:p>
+            <w:pPr>
+              <w:pStyle w:val="Normal"/>
+              <w:widowControl/>
+              <w:suppressAutoHyphens w:val="true"/>
               <w:spacing w:lineRule="auto" w:line="240" w:before="0" w:after="0"/>
               <w:jc w:val="left"/>
               <w:cnfStyle w:val="000000000000" w:firstRow="0" w:lastRow="0" w:firstColumn="0" w:lastColumn="0" w:oddVBand="0" w:evenVBand="0" w:oddHBand="0" w:evenHBand="0" w:firstRowFirstColumn="0" w:firstRowLastColumn="0" w:lastRowFirstColumn="0" w:lastRowLastColumn="0"/>
@@ -5094,13 +5177,14 @@
         </w:tc>
         <w:tc>
           <w:tcPr>
-            <w:tcW w:w="3255" w:type="dxa"/>
-            <w:tcBorders/>
-          </w:tcPr>
-          <w:p>
-            <w:pPr>
-              <w:pStyle w:val="Normal"/>
-              <w:widowControl/>
+            <w:tcW w:w="3256" w:type="dxa"/>
+            <w:tcBorders/>
+          </w:tcPr>
+          <w:p>
+            <w:pPr>
+              <w:pStyle w:val="Normal"/>
+              <w:widowControl/>
+              <w:suppressAutoHyphens w:val="true"/>
               <w:spacing w:lineRule="auto" w:line="240" w:before="0" w:after="0"/>
               <w:jc w:val="left"/>
               <w:cnfStyle w:val="000000000000" w:firstRow="0" w:lastRow="0" w:firstColumn="0" w:lastColumn="0" w:oddVBand="0" w:evenVBand="0" w:oddHBand="0" w:evenHBand="0" w:firstRowFirstColumn="0" w:firstRowLastColumn="0" w:lastRowFirstColumn="0" w:lastRowLastColumn="0"/>
@@ -5187,8 +5271,8 @@
         <w:tblLook w:val="04a0" w:noHBand="0" w:noVBand="1" w:firstColumn="1" w:lastRow="0" w:lastColumn="0" w:firstRow="1"/>
       </w:tblPr>
       <w:tblGrid>
-        <w:gridCol w:w="3113"/>
-        <w:gridCol w:w="2836"/>
+        <w:gridCol w:w="3112"/>
+        <w:gridCol w:w="2837"/>
         <w:gridCol w:w="3679"/>
       </w:tblGrid>
       <w:tr>
@@ -5197,7 +5281,7 @@
         </w:trPr>
         <w:tc>
           <w:tcPr>
-            <w:tcW w:w="3113" w:type="dxa"/>
+            <w:tcW w:w="3112" w:type="dxa"/>
             <w:cnfStyle w:val="001000000000" w:firstRow="0" w:lastRow="0" w:firstColumn="1" w:lastColumn="0" w:oddVBand="0" w:evenVBand="0" w:oddHBand="0" w:evenHBand="0" w:firstRowFirstColumn="0" w:firstRowLastColumn="0" w:lastRowFirstColumn="0" w:lastRowLastColumn="0"/>
             <w:tcBorders>
               <w:bottom w:val="single" w:sz="12" w:space="0" w:color="9CC2E5"/>
@@ -5207,6 +5291,7 @@
             <w:pPr>
               <w:pStyle w:val="Normal"/>
               <w:widowControl/>
+              <w:suppressAutoHyphens w:val="true"/>
               <w:spacing w:lineRule="auto" w:line="240" w:before="0" w:after="0"/>
               <w:jc w:val="left"/>
               <w:rPr>
@@ -5231,7 +5316,7 @@
         </w:tc>
         <w:tc>
           <w:tcPr>
-            <w:tcW w:w="2836" w:type="dxa"/>
+            <w:tcW w:w="2837" w:type="dxa"/>
             <w:tcBorders>
               <w:bottom w:val="single" w:sz="12" w:space="0" w:color="9CC2E5"/>
             </w:tcBorders>
@@ -5240,6 +5325,7 @@
             <w:pPr>
               <w:pStyle w:val="Normal"/>
               <w:widowControl/>
+              <w:suppressAutoHyphens w:val="true"/>
               <w:spacing w:lineRule="auto" w:line="240" w:before="0" w:after="0"/>
               <w:jc w:val="left"/>
               <w:cnfStyle w:val="100000000000" w:firstRow="1" w:lastRow="0" w:firstColumn="0" w:lastColumn="0" w:oddVBand="0" w:evenVBand="0" w:oddHBand="0" w:evenHBand="0" w:firstRowFirstColumn="0" w:firstRowLastColumn="0" w:lastRowFirstColumn="0" w:lastRowLastColumn="0"/>
@@ -5274,6 +5360,7 @@
             <w:pPr>
               <w:pStyle w:val="Normal"/>
               <w:widowControl/>
+              <w:suppressAutoHyphens w:val="true"/>
               <w:spacing w:lineRule="auto" w:line="240" w:before="0" w:after="0"/>
               <w:jc w:val="left"/>
               <w:cnfStyle w:val="100000000000" w:firstRow="1" w:lastRow="0" w:firstColumn="0" w:lastColumn="0" w:oddVBand="0" w:evenVBand="0" w:oddHBand="0" w:evenHBand="0" w:firstRowFirstColumn="0" w:firstRowLastColumn="0" w:lastRowFirstColumn="0" w:lastRowLastColumn="0"/>
@@ -5302,7 +5389,7 @@
         <w:trPr/>
         <w:tc>
           <w:tcPr>
-            <w:tcW w:w="3113" w:type="dxa"/>
+            <w:tcW w:w="3112" w:type="dxa"/>
             <w:cnfStyle w:val="001000000000" w:firstRow="0" w:lastRow="0" w:firstColumn="1" w:lastColumn="0" w:oddVBand="0" w:evenVBand="0" w:oddHBand="0" w:evenHBand="0" w:firstRowFirstColumn="0" w:firstRowLastColumn="0" w:lastRowFirstColumn="0" w:lastRowLastColumn="0"/>
             <w:tcBorders/>
           </w:tcPr>
@@ -5310,6 +5397,7 @@
             <w:pPr>
               <w:pStyle w:val="Normal"/>
               <w:widowControl/>
+              <w:suppressAutoHyphens w:val="true"/>
               <w:spacing w:lineRule="auto" w:line="240" w:before="0" w:after="0"/>
               <w:jc w:val="left"/>
               <w:rPr>
@@ -5334,13 +5422,14 @@
         </w:tc>
         <w:tc>
           <w:tcPr>
-            <w:tcW w:w="2836" w:type="dxa"/>
-            <w:tcBorders/>
-          </w:tcPr>
-          <w:p>
-            <w:pPr>
-              <w:pStyle w:val="Normal"/>
-              <w:widowControl/>
+            <w:tcW w:w="2837" w:type="dxa"/>
+            <w:tcBorders/>
+          </w:tcPr>
+          <w:p>
+            <w:pPr>
+              <w:pStyle w:val="Normal"/>
+              <w:widowControl/>
+              <w:suppressAutoHyphens w:val="true"/>
               <w:spacing w:lineRule="auto" w:line="240" w:before="0" w:after="0"/>
               <w:jc w:val="left"/>
               <w:cnfStyle w:val="000000000000" w:firstRow="0" w:lastRow="0" w:firstColumn="0" w:lastColumn="0" w:oddVBand="0" w:evenVBand="0" w:oddHBand="0" w:evenHBand="0" w:firstRowFirstColumn="0" w:firstRowLastColumn="0" w:lastRowFirstColumn="0" w:lastRowLastColumn="0"/>
@@ -5369,6 +5458,7 @@
             <w:pPr>
               <w:pStyle w:val="Normal"/>
               <w:widowControl/>
+              <w:suppressAutoHyphens w:val="true"/>
               <w:spacing w:lineRule="auto" w:line="240" w:before="0" w:after="0"/>
               <w:jc w:val="left"/>
               <w:cnfStyle w:val="000000000000" w:firstRow="0" w:lastRow="0" w:firstColumn="0" w:lastColumn="0" w:oddVBand="0" w:evenVBand="0" w:oddHBand="0" w:evenHBand="0" w:firstRowFirstColumn="0" w:firstRowLastColumn="0" w:lastRowFirstColumn="0" w:lastRowLastColumn="0"/>
@@ -5393,7 +5483,7 @@
         <w:trPr/>
         <w:tc>
           <w:tcPr>
-            <w:tcW w:w="3113" w:type="dxa"/>
+            <w:tcW w:w="3112" w:type="dxa"/>
             <w:cnfStyle w:val="001000000000" w:firstRow="0" w:lastRow="0" w:firstColumn="1" w:lastColumn="0" w:oddVBand="0" w:evenVBand="0" w:oddHBand="0" w:evenHBand="0" w:firstRowFirstColumn="0" w:firstRowLastColumn="0" w:lastRowFirstColumn="0" w:lastRowLastColumn="0"/>
             <w:tcBorders/>
           </w:tcPr>
@@ -5401,6 +5491,7 @@
             <w:pPr>
               <w:pStyle w:val="Normal"/>
               <w:widowControl/>
+              <w:suppressAutoHyphens w:val="true"/>
               <w:spacing w:lineRule="auto" w:line="240" w:before="0" w:after="0"/>
               <w:jc w:val="left"/>
               <w:rPr>
@@ -5425,13 +5516,14 @@
         </w:tc>
         <w:tc>
           <w:tcPr>
-            <w:tcW w:w="2836" w:type="dxa"/>
-            <w:tcBorders/>
-          </w:tcPr>
-          <w:p>
-            <w:pPr>
-              <w:pStyle w:val="Normal"/>
-              <w:widowControl/>
+            <w:tcW w:w="2837" w:type="dxa"/>
+            <w:tcBorders/>
+          </w:tcPr>
+          <w:p>
+            <w:pPr>
+              <w:pStyle w:val="Normal"/>
+              <w:widowControl/>
+              <w:suppressAutoHyphens w:val="true"/>
               <w:spacing w:lineRule="auto" w:line="240" w:before="0" w:after="0"/>
               <w:jc w:val="left"/>
               <w:cnfStyle w:val="000000000000" w:firstRow="0" w:lastRow="0" w:firstColumn="0" w:lastColumn="0" w:oddVBand="0" w:evenVBand="0" w:oddHBand="0" w:evenHBand="0" w:firstRowFirstColumn="0" w:firstRowLastColumn="0" w:lastRowFirstColumn="0" w:lastRowLastColumn="0"/>
@@ -5460,6 +5552,7 @@
             <w:pPr>
               <w:pStyle w:val="Normal"/>
               <w:widowControl/>
+              <w:suppressAutoHyphens w:val="true"/>
               <w:spacing w:lineRule="auto" w:line="240" w:before="0" w:after="0"/>
               <w:jc w:val="left"/>
               <w:cnfStyle w:val="000000000000" w:firstRow="0" w:lastRow="0" w:firstColumn="0" w:lastColumn="0" w:oddVBand="0" w:evenVBand="0" w:oddHBand="0" w:evenHBand="0" w:firstRowFirstColumn="0" w:firstRowLastColumn="0" w:lastRowFirstColumn="0" w:lastRowLastColumn="0"/>
@@ -5484,7 +5577,7 @@
         <w:trPr/>
         <w:tc>
           <w:tcPr>
-            <w:tcW w:w="3113" w:type="dxa"/>
+            <w:tcW w:w="3112" w:type="dxa"/>
             <w:cnfStyle w:val="001000000000" w:firstRow="0" w:lastRow="0" w:firstColumn="1" w:lastColumn="0" w:oddVBand="0" w:evenVBand="0" w:oddHBand="0" w:evenHBand="0" w:firstRowFirstColumn="0" w:firstRowLastColumn="0" w:lastRowFirstColumn="0" w:lastRowLastColumn="0"/>
             <w:tcBorders/>
           </w:tcPr>
@@ -5492,6 +5585,7 @@
             <w:pPr>
               <w:pStyle w:val="Normal"/>
               <w:widowControl/>
+              <w:suppressAutoHyphens w:val="true"/>
               <w:spacing w:lineRule="auto" w:line="240" w:before="0" w:after="0"/>
               <w:jc w:val="left"/>
               <w:rPr>
@@ -5516,13 +5610,14 @@
         </w:tc>
         <w:tc>
           <w:tcPr>
-            <w:tcW w:w="2836" w:type="dxa"/>
-            <w:tcBorders/>
-          </w:tcPr>
-          <w:p>
-            <w:pPr>
-              <w:pStyle w:val="Normal"/>
-              <w:widowControl/>
+            <w:tcW w:w="2837" w:type="dxa"/>
+            <w:tcBorders/>
+          </w:tcPr>
+          <w:p>
+            <w:pPr>
+              <w:pStyle w:val="Normal"/>
+              <w:widowControl/>
+              <w:suppressAutoHyphens w:val="true"/>
               <w:spacing w:lineRule="auto" w:line="240" w:before="0" w:after="0"/>
               <w:jc w:val="left"/>
               <w:cnfStyle w:val="000000000000" w:firstRow="0" w:lastRow="0" w:firstColumn="0" w:lastColumn="0" w:oddVBand="0" w:evenVBand="0" w:oddHBand="0" w:evenHBand="0" w:firstRowFirstColumn="0" w:firstRowLastColumn="0" w:lastRowFirstColumn="0" w:lastRowLastColumn="0"/>
@@ -5551,6 +5646,7 @@
             <w:pPr>
               <w:pStyle w:val="Normal"/>
               <w:widowControl/>
+              <w:suppressAutoHyphens w:val="true"/>
               <w:spacing w:lineRule="auto" w:line="240" w:before="0" w:after="0"/>
               <w:jc w:val="left"/>
               <w:cnfStyle w:val="000000000000" w:firstRow="0" w:lastRow="0" w:firstColumn="0" w:lastColumn="0" w:oddVBand="0" w:evenVBand="0" w:oddHBand="0" w:evenHBand="0" w:firstRowFirstColumn="0" w:firstRowLastColumn="0" w:lastRowFirstColumn="0" w:lastRowLastColumn="0"/>
@@ -5575,7 +5671,7 @@
         <w:trPr/>
         <w:tc>
           <w:tcPr>
-            <w:tcW w:w="3113" w:type="dxa"/>
+            <w:tcW w:w="3112" w:type="dxa"/>
             <w:cnfStyle w:val="001000000000" w:firstRow="0" w:lastRow="0" w:firstColumn="1" w:lastColumn="0" w:oddVBand="0" w:evenVBand="0" w:oddHBand="0" w:evenHBand="0" w:firstRowFirstColumn="0" w:firstRowLastColumn="0" w:lastRowFirstColumn="0" w:lastRowLastColumn="0"/>
             <w:tcBorders/>
           </w:tcPr>
@@ -5583,6 +5679,7 @@
             <w:pPr>
               <w:pStyle w:val="Normal"/>
               <w:widowControl/>
+              <w:suppressAutoHyphens w:val="true"/>
               <w:spacing w:lineRule="auto" w:line="240" w:before="0" w:after="0"/>
               <w:jc w:val="left"/>
               <w:rPr>
@@ -5607,13 +5704,14 @@
         </w:tc>
         <w:tc>
           <w:tcPr>
-            <w:tcW w:w="2836" w:type="dxa"/>
-            <w:tcBorders/>
-          </w:tcPr>
-          <w:p>
-            <w:pPr>
-              <w:pStyle w:val="Normal"/>
-              <w:widowControl/>
+            <w:tcW w:w="2837" w:type="dxa"/>
+            <w:tcBorders/>
+          </w:tcPr>
+          <w:p>
+            <w:pPr>
+              <w:pStyle w:val="Normal"/>
+              <w:widowControl/>
+              <w:suppressAutoHyphens w:val="true"/>
               <w:spacing w:lineRule="auto" w:line="240" w:before="0" w:after="0"/>
               <w:jc w:val="left"/>
               <w:cnfStyle w:val="000000000000" w:firstRow="0" w:lastRow="0" w:firstColumn="0" w:lastColumn="0" w:oddVBand="0" w:evenVBand="0" w:oddHBand="0" w:evenHBand="0" w:firstRowFirstColumn="0" w:firstRowLastColumn="0" w:lastRowFirstColumn="0" w:lastRowLastColumn="0"/>
@@ -5642,6 +5740,7 @@
             <w:pPr>
               <w:pStyle w:val="Normal"/>
               <w:widowControl/>
+              <w:suppressAutoHyphens w:val="true"/>
               <w:spacing w:lineRule="auto" w:line="240" w:before="0" w:after="0"/>
               <w:jc w:val="left"/>
               <w:cnfStyle w:val="000000000000" w:firstRow="0" w:lastRow="0" w:firstColumn="0" w:lastColumn="0" w:oddVBand="0" w:evenVBand="0" w:oddHBand="0" w:evenHBand="0" w:firstRowFirstColumn="0" w:firstRowLastColumn="0" w:lastRowFirstColumn="0" w:lastRowLastColumn="0"/>
@@ -5666,7 +5765,7 @@
         <w:trPr/>
         <w:tc>
           <w:tcPr>
-            <w:tcW w:w="3113" w:type="dxa"/>
+            <w:tcW w:w="3112" w:type="dxa"/>
             <w:cnfStyle w:val="001000000000" w:firstRow="0" w:lastRow="0" w:firstColumn="1" w:lastColumn="0" w:oddVBand="0" w:evenVBand="0" w:oddHBand="0" w:evenHBand="0" w:firstRowFirstColumn="0" w:firstRowLastColumn="0" w:lastRowFirstColumn="0" w:lastRowLastColumn="0"/>
             <w:tcBorders/>
           </w:tcPr>
@@ -5674,6 +5773,7 @@
             <w:pPr>
               <w:pStyle w:val="Normal"/>
               <w:widowControl/>
+              <w:suppressAutoHyphens w:val="true"/>
               <w:spacing w:lineRule="auto" w:line="240" w:before="0" w:after="0"/>
               <w:jc w:val="left"/>
               <w:rPr>
@@ -5698,13 +5798,14 @@
         </w:tc>
         <w:tc>
           <w:tcPr>
-            <w:tcW w:w="2836" w:type="dxa"/>
-            <w:tcBorders/>
-          </w:tcPr>
-          <w:p>
-            <w:pPr>
-              <w:pStyle w:val="Normal"/>
-              <w:widowControl/>
+            <w:tcW w:w="2837" w:type="dxa"/>
+            <w:tcBorders/>
+          </w:tcPr>
+          <w:p>
+            <w:pPr>
+              <w:pStyle w:val="Normal"/>
+              <w:widowControl/>
+              <w:suppressAutoHyphens w:val="true"/>
               <w:spacing w:lineRule="auto" w:line="240" w:before="0" w:after="0"/>
               <w:jc w:val="left"/>
               <w:cnfStyle w:val="000000000000" w:firstRow="0" w:lastRow="0" w:firstColumn="0" w:lastColumn="0" w:oddVBand="0" w:evenVBand="0" w:oddHBand="0" w:evenHBand="0" w:firstRowFirstColumn="0" w:firstRowLastColumn="0" w:lastRowFirstColumn="0" w:lastRowLastColumn="0"/>
@@ -5733,38 +5834,23 @@
             <w:pPr>
               <w:pStyle w:val="Normal"/>
               <w:widowControl/>
-              <w:spacing w:lineRule="auto" w:line="240" w:before="0" w:after="0"/>
-              <w:jc w:val="left"/>
-              <w:cnfStyle w:val="000000000000" w:firstRow="0" w:lastRow="0" w:firstColumn="0" w:lastColumn="0" w:oddVBand="0" w:evenVBand="0" w:oddHBand="0" w:evenHBand="0" w:firstRowFirstColumn="0" w:firstRowLastColumn="0" w:lastRowFirstColumn="0" w:lastRowLastColumn="0"/>
-              <w:rPr>
-                <w:rFonts w:eastAsia="Calibri" w:cs=""/>
-                <w:kern w:val="0"/>
-                <w:lang w:val="da-DK" w:eastAsia="en-US" w:bidi="ar-SA"/>
-              </w:rPr>
-            </w:pPr>
-            <w:r>
-              <w:rPr>
-                <w:rFonts w:eastAsia="Calibri" w:cs=""/>
-                <w:kern w:val="0"/>
-                <w:lang w:val="da-DK" w:eastAsia="en-US" w:bidi="ar-SA"/>
-              </w:rPr>
-              <w:t xml:space="preserve">Den OU i AD’et hvor alle sikkerhedsgrupperne oprettes. Bemærk at der IKKE må ligge andre grupper i denne OU, da integrationen </w:t>
-            </w:r>
-            <w:r>
-              <w:rPr>
-                <w:rFonts w:eastAsia="Calibri" w:cs=""/>
-                <w:kern w:val="0"/>
-                <w:lang w:val="da-DK" w:eastAsia="en-US" w:bidi="ar-SA"/>
-              </w:rPr>
-              <w:t>i</w:t>
-            </w:r>
-            <w:r>
-              <w:rPr>
-                <w:rFonts w:eastAsia="Calibri" w:cs=""/>
-                <w:kern w:val="0"/>
-                <w:lang w:val="da-DK" w:eastAsia="en-US" w:bidi="ar-SA"/>
-              </w:rPr>
-              <w:t xml:space="preserve"> så fald vil slette dem.</w:t>
+              <w:suppressAutoHyphens w:val="true"/>
+              <w:spacing w:lineRule="auto" w:line="240" w:before="0" w:after="0"/>
+              <w:jc w:val="left"/>
+              <w:cnfStyle w:val="000000000000" w:firstRow="0" w:lastRow="0" w:firstColumn="0" w:lastColumn="0" w:oddVBand="0" w:evenVBand="0" w:oddHBand="0" w:evenHBand="0" w:firstRowFirstColumn="0" w:firstRowLastColumn="0" w:lastRowFirstColumn="0" w:lastRowLastColumn="0"/>
+              <w:rPr>
+                <w:rFonts w:eastAsia="Calibri" w:cs=""/>
+                <w:kern w:val="0"/>
+                <w:lang w:val="da-DK" w:eastAsia="en-US" w:bidi="ar-SA"/>
+              </w:rPr>
+            </w:pPr>
+            <w:r>
+              <w:rPr>
+                <w:rFonts w:eastAsia="Calibri" w:cs=""/>
+                <w:kern w:val="0"/>
+                <w:lang w:val="da-DK" w:eastAsia="en-US" w:bidi="ar-SA"/>
+              </w:rPr>
+              <w:t>Den OU i AD’et hvor alle sikkerhedsgrupperne oprettes. Bemærk at der IKKE må ligge andre grupper i denne OU, da integrationen i så fald vil slette dem.</w:t>
             </w:r>
           </w:p>
         </w:tc>
@@ -5773,7 +5859,7 @@
         <w:trPr/>
         <w:tc>
           <w:tcPr>
-            <w:tcW w:w="3113" w:type="dxa"/>
+            <w:tcW w:w="3112" w:type="dxa"/>
             <w:cnfStyle w:val="001000000000" w:firstRow="0" w:lastRow="0" w:firstColumn="1" w:lastColumn="0" w:oddVBand="0" w:evenVBand="0" w:oddHBand="0" w:evenHBand="0" w:firstRowFirstColumn="0" w:firstRowLastColumn="0" w:lastRowFirstColumn="0" w:lastRowLastColumn="0"/>
             <w:tcBorders/>
           </w:tcPr>
@@ -5781,6 +5867,7 @@
             <w:pPr>
               <w:pStyle w:val="Normal"/>
               <w:widowControl/>
+              <w:suppressAutoHyphens w:val="true"/>
               <w:spacing w:lineRule="auto" w:line="240" w:before="0" w:after="0"/>
               <w:jc w:val="left"/>
               <w:rPr>
@@ -5805,13 +5892,14 @@
         </w:tc>
         <w:tc>
           <w:tcPr>
-            <w:tcW w:w="2836" w:type="dxa"/>
-            <w:tcBorders/>
-          </w:tcPr>
-          <w:p>
-            <w:pPr>
-              <w:pStyle w:val="Normal"/>
-              <w:widowControl/>
+            <w:tcW w:w="2837" w:type="dxa"/>
+            <w:tcBorders/>
+          </w:tcPr>
+          <w:p>
+            <w:pPr>
+              <w:pStyle w:val="Normal"/>
+              <w:widowControl/>
+              <w:suppressAutoHyphens w:val="true"/>
               <w:spacing w:lineRule="auto" w:line="240" w:before="0" w:after="0"/>
               <w:jc w:val="left"/>
               <w:cnfStyle w:val="000000000000" w:firstRow="0" w:lastRow="0" w:firstColumn="0" w:lastColumn="0" w:oddVBand="0" w:evenVBand="0" w:oddHBand="0" w:evenHBand="0" w:firstRowFirstColumn="0" w:firstRowLastColumn="0" w:lastRowFirstColumn="0" w:lastRowLastColumn="0"/>
@@ -5840,6 +5928,7 @@
             <w:pPr>
               <w:pStyle w:val="Normal"/>
               <w:widowControl/>
+              <w:suppressAutoHyphens w:val="true"/>
               <w:spacing w:lineRule="auto" w:line="240" w:before="0" w:after="0"/>
               <w:jc w:val="left"/>
               <w:cnfStyle w:val="000000000000" w:firstRow="0" w:lastRow="0" w:firstColumn="0" w:lastColumn="0" w:oddVBand="0" w:evenVBand="0" w:oddHBand="0" w:evenHBand="0" w:firstRowFirstColumn="0" w:firstRowLastColumn="0" w:lastRowFirstColumn="0" w:lastRowLastColumn="0"/>
@@ -5864,7 +5953,7 @@
         <w:trPr/>
         <w:tc>
           <w:tcPr>
-            <w:tcW w:w="3113" w:type="dxa"/>
+            <w:tcW w:w="3112" w:type="dxa"/>
             <w:cnfStyle w:val="001000000000" w:firstRow="0" w:lastRow="0" w:firstColumn="1" w:lastColumn="0" w:oddVBand="0" w:evenVBand="0" w:oddHBand="0" w:evenHBand="0" w:firstRowFirstColumn="0" w:firstRowLastColumn="0" w:lastRowFirstColumn="0" w:lastRowLastColumn="0"/>
             <w:tcBorders/>
           </w:tcPr>
@@ -5872,6 +5961,7 @@
             <w:pPr>
               <w:pStyle w:val="Normal"/>
               <w:widowControl/>
+              <w:suppressAutoHyphens w:val="true"/>
               <w:spacing w:lineRule="auto" w:line="240" w:before="0" w:after="0"/>
               <w:jc w:val="left"/>
               <w:rPr>
@@ -5896,13 +5986,14 @@
         </w:tc>
         <w:tc>
           <w:tcPr>
-            <w:tcW w:w="2836" w:type="dxa"/>
-            <w:tcBorders/>
-          </w:tcPr>
-          <w:p>
-            <w:pPr>
-              <w:pStyle w:val="Normal"/>
-              <w:widowControl/>
+            <w:tcW w:w="2837" w:type="dxa"/>
+            <w:tcBorders/>
+          </w:tcPr>
+          <w:p>
+            <w:pPr>
+              <w:pStyle w:val="Normal"/>
+              <w:widowControl/>
+              <w:suppressAutoHyphens w:val="true"/>
               <w:spacing w:lineRule="auto" w:line="240" w:before="0" w:after="0"/>
               <w:jc w:val="left"/>
               <w:cnfStyle w:val="000000000000" w:firstRow="0" w:lastRow="0" w:firstColumn="0" w:lastColumn="0" w:oddVBand="0" w:evenVBand="0" w:oddHBand="0" w:evenHBand="0" w:firstRowFirstColumn="0" w:firstRowLastColumn="0" w:lastRowFirstColumn="0" w:lastRowLastColumn="0"/>
@@ -5930,6 +6021,7 @@
             <w:pPr>
               <w:pStyle w:val="Normal"/>
               <w:widowControl/>
+              <w:suppressAutoHyphens w:val="true"/>
               <w:spacing w:lineRule="auto" w:line="240" w:before="0" w:after="0"/>
               <w:jc w:val="left"/>
               <w:cnfStyle w:val="000000000000" w:firstRow="0" w:lastRow="0" w:firstColumn="0" w:lastColumn="0" w:oddVBand="0" w:evenVBand="0" w:oddHBand="0" w:evenHBand="0" w:firstRowFirstColumn="0" w:firstRowLastColumn="0" w:lastRowFirstColumn="0" w:lastRowLastColumn="0"/>
@@ -5954,7 +6046,7 @@
         <w:trPr/>
         <w:tc>
           <w:tcPr>
-            <w:tcW w:w="3113" w:type="dxa"/>
+            <w:tcW w:w="3112" w:type="dxa"/>
             <w:cnfStyle w:val="001000000000" w:firstRow="0" w:lastRow="0" w:firstColumn="1" w:lastColumn="0" w:oddVBand="0" w:evenVBand="0" w:oddHBand="0" w:evenHBand="0" w:firstRowFirstColumn="0" w:firstRowLastColumn="0" w:lastRowFirstColumn="0" w:lastRowLastColumn="0"/>
             <w:tcBorders/>
           </w:tcPr>
@@ -5962,6 +6054,7 @@
             <w:pPr>
               <w:pStyle w:val="Normal"/>
               <w:widowControl/>
+              <w:suppressAutoHyphens w:val="true"/>
               <w:spacing w:lineRule="auto" w:line="240" w:before="0" w:after="0"/>
               <w:jc w:val="left"/>
               <w:rPr>
@@ -5986,13 +6079,14 @@
         </w:tc>
         <w:tc>
           <w:tcPr>
-            <w:tcW w:w="2836" w:type="dxa"/>
-            <w:tcBorders/>
-          </w:tcPr>
-          <w:p>
-            <w:pPr>
-              <w:pStyle w:val="Normal"/>
-              <w:widowControl/>
+            <w:tcW w:w="2837" w:type="dxa"/>
+            <w:tcBorders/>
+          </w:tcPr>
+          <w:p>
+            <w:pPr>
+              <w:pStyle w:val="Normal"/>
+              <w:widowControl/>
+              <w:suppressAutoHyphens w:val="true"/>
               <w:spacing w:lineRule="auto" w:line="240" w:before="0" w:after="0"/>
               <w:jc w:val="left"/>
               <w:cnfStyle w:val="000000000000" w:firstRow="0" w:lastRow="0" w:firstColumn="0" w:lastColumn="0" w:oddVBand="0" w:evenVBand="0" w:oddHBand="0" w:evenHBand="0" w:firstRowFirstColumn="0" w:firstRowLastColumn="0" w:lastRowFirstColumn="0" w:lastRowLastColumn="0"/>
@@ -6020,6 +6114,7 @@
             <w:pPr>
               <w:pStyle w:val="Normal"/>
               <w:widowControl/>
+              <w:suppressAutoHyphens w:val="true"/>
               <w:spacing w:lineRule="auto" w:line="240" w:before="0" w:after="0"/>
               <w:jc w:val="left"/>
               <w:cnfStyle w:val="000000000000" w:firstRow="0" w:lastRow="0" w:firstColumn="0" w:lastColumn="0" w:oddVBand="0" w:evenVBand="0" w:oddHBand="0" w:evenHBand="0" w:firstRowFirstColumn="0" w:firstRowLastColumn="0" w:lastRowFirstColumn="0" w:lastRowLastColumn="0"/>
@@ -6044,7 +6139,7 @@
         <w:trPr/>
         <w:tc>
           <w:tcPr>
-            <w:tcW w:w="3113" w:type="dxa"/>
+            <w:tcW w:w="3112" w:type="dxa"/>
             <w:cnfStyle w:val="001000000000" w:firstRow="0" w:lastRow="0" w:firstColumn="1" w:lastColumn="0" w:oddVBand="0" w:evenVBand="0" w:oddHBand="0" w:evenHBand="0" w:firstRowFirstColumn="0" w:firstRowLastColumn="0" w:lastRowFirstColumn="0" w:lastRowLastColumn="0"/>
             <w:tcBorders/>
           </w:tcPr>
@@ -6052,6 +6147,7 @@
             <w:pPr>
               <w:pStyle w:val="Normal"/>
               <w:widowControl/>
+              <w:suppressAutoHyphens w:val="true"/>
               <w:spacing w:lineRule="auto" w:line="240" w:before="0" w:after="0"/>
               <w:jc w:val="left"/>
               <w:rPr>
@@ -6076,13 +6172,14 @@
         </w:tc>
         <w:tc>
           <w:tcPr>
-            <w:tcW w:w="2836" w:type="dxa"/>
-            <w:tcBorders/>
-          </w:tcPr>
-          <w:p>
-            <w:pPr>
-              <w:pStyle w:val="Normal"/>
-              <w:widowControl/>
+            <w:tcW w:w="2837" w:type="dxa"/>
+            <w:tcBorders/>
+          </w:tcPr>
+          <w:p>
+            <w:pPr>
+              <w:pStyle w:val="Normal"/>
+              <w:widowControl/>
+              <w:suppressAutoHyphens w:val="true"/>
               <w:spacing w:lineRule="auto" w:line="240" w:before="0" w:after="0"/>
               <w:jc w:val="left"/>
               <w:cnfStyle w:val="000000000000" w:firstRow="0" w:lastRow="0" w:firstColumn="0" w:lastColumn="0" w:oddVBand="0" w:evenVBand="0" w:oddHBand="0" w:evenHBand="0" w:firstRowFirstColumn="0" w:firstRowLastColumn="0" w:lastRowFirstColumn="0" w:lastRowLastColumn="0"/>
@@ -6110,6 +6207,7 @@
             <w:pPr>
               <w:pStyle w:val="Normal"/>
               <w:widowControl/>
+              <w:suppressAutoHyphens w:val="true"/>
               <w:spacing w:lineRule="auto" w:line="240" w:before="0" w:after="0"/>
               <w:jc w:val="left"/>
               <w:cnfStyle w:val="000000000000" w:firstRow="0" w:lastRow="0" w:firstColumn="0" w:lastColumn="0" w:oddVBand="0" w:evenVBand="0" w:oddHBand="0" w:evenHBand="0" w:firstRowFirstColumn="0" w:firstRowLastColumn="0" w:lastRowFirstColumn="0" w:lastRowLastColumn="0"/>
@@ -6134,7 +6232,7 @@
         <w:trPr/>
         <w:tc>
           <w:tcPr>
-            <w:tcW w:w="3113" w:type="dxa"/>
+            <w:tcW w:w="3112" w:type="dxa"/>
             <w:cnfStyle w:val="001000000000" w:firstRow="0" w:lastRow="0" w:firstColumn="1" w:lastColumn="0" w:oddVBand="0" w:evenVBand="0" w:oddHBand="0" w:evenHBand="0" w:firstRowFirstColumn="0" w:firstRowLastColumn="0" w:lastRowFirstColumn="0" w:lastRowLastColumn="0"/>
             <w:tcBorders>
               <w:top w:val="nil"/>
@@ -6144,6 +6242,7 @@
             <w:pPr>
               <w:pStyle w:val="Normal"/>
               <w:widowControl/>
+              <w:suppressAutoHyphens w:val="true"/>
               <w:spacing w:lineRule="auto" w:line="240" w:before="0" w:after="0"/>
               <w:jc w:val="left"/>
               <w:rPr>
@@ -6168,7 +6267,7 @@
         </w:tc>
         <w:tc>
           <w:tcPr>
-            <w:tcW w:w="2836" w:type="dxa"/>
+            <w:tcW w:w="2837" w:type="dxa"/>
             <w:tcBorders>
               <w:top w:val="nil"/>
             </w:tcBorders>
@@ -6177,6 +6276,7 @@
             <w:pPr>
               <w:pStyle w:val="Normal"/>
               <w:widowControl/>
+              <w:suppressAutoHyphens w:val="true"/>
               <w:spacing w:lineRule="auto" w:line="240" w:before="0" w:after="0"/>
               <w:jc w:val="left"/>
               <w:cnfStyle w:val="000000000000" w:firstRow="0" w:lastRow="0" w:firstColumn="0" w:lastColumn="0" w:oddVBand="0" w:evenVBand="0" w:oddHBand="0" w:evenHBand="0" w:firstRowFirstColumn="0" w:firstRowLastColumn="0" w:lastRowFirstColumn="0" w:lastRowLastColumn="0"/>
@@ -6206,6 +6306,7 @@
             <w:pPr>
               <w:pStyle w:val="Normal"/>
               <w:widowControl/>
+              <w:suppressAutoHyphens w:val="true"/>
               <w:spacing w:lineRule="auto" w:line="240" w:before="0" w:after="0"/>
               <w:jc w:val="left"/>
               <w:cnfStyle w:val="000000000000" w:firstRow="0" w:lastRow="0" w:firstColumn="0" w:lastColumn="0" w:oddVBand="0" w:evenVBand="0" w:oddHBand="0" w:evenHBand="0" w:firstRowFirstColumn="0" w:firstRowLastColumn="0" w:lastRowFirstColumn="0" w:lastRowLastColumn="0"/>
@@ -6222,6 +6323,546 @@
                 <w:lang w:val="da-DK" w:eastAsia="en-US" w:bidi="ar-SA"/>
               </w:rPr>
               <w:t>Struktur der beskriver hvordan grupper med ledere for enheder  (og alle de underliggende enheder) oprettes og vedligeholdes – se detaljer for opsætningen nedenfor</w:t>
+            </w:r>
+          </w:p>
+        </w:tc>
+      </w:tr>
+      <w:tr>
+        <w:trPr/>
+        <w:tc>
+          <w:tcPr>
+            <w:tcW w:w="3112" w:type="dxa"/>
+            <w:cnfStyle w:val="001000000000" w:firstRow="0" w:lastRow="0" w:firstColumn="1" w:lastColumn="0" w:oddVBand="0" w:evenVBand="0" w:oddHBand="0" w:evenHBand="0" w:firstRowFirstColumn="0" w:firstRowLastColumn="0" w:lastRowFirstColumn="0" w:lastRowLastColumn="0"/>
+            <w:tcBorders>
+              <w:top w:val="nil"/>
+            </w:tcBorders>
+          </w:tcPr>
+          <w:p>
+            <w:pPr>
+              <w:pStyle w:val="Normal"/>
+              <w:widowControl/>
+              <w:suppressAutoHyphens w:val="true"/>
+              <w:spacing w:lineRule="auto" w:line="240" w:before="0" w:after="0"/>
+              <w:jc w:val="left"/>
+              <w:rPr>
+                <w:rFonts w:eastAsia="Calibri" w:cs=""/>
+                <w:b/>
+                <w:bCs/>
+                <w:kern w:val="0"/>
+                <w:lang w:val="da-DK" w:eastAsia="en-US" w:bidi="ar-SA"/>
+              </w:rPr>
+            </w:pPr>
+            <w:r>
+              <w:rPr>
+                <w:rFonts w:eastAsia="Calibri" w:cs=""/>
+                <w:b w:val="false"/>
+                <w:bCs w:val="false"/>
+                <w:kern w:val="0"/>
+                <w:lang w:val="da-DK" w:eastAsia="en-US" w:bidi="ar-SA"/>
+              </w:rPr>
+              <w:t>Direct</w:t>
+            </w:r>
+            <w:r>
+              <w:rPr>
+                <w:rFonts w:eastAsia="Calibri" w:cs=""/>
+                <w:b w:val="false"/>
+                <w:bCs w:val="false"/>
+                <w:kern w:val="0"/>
+                <w:lang w:val="da-DK" w:eastAsia="en-US" w:bidi="ar-SA"/>
+              </w:rPr>
+              <w:t>External</w:t>
+            </w:r>
+            <w:r>
+              <w:rPr>
+                <w:rFonts w:eastAsia="Calibri" w:cs=""/>
+                <w:b w:val="false"/>
+                <w:bCs w:val="false"/>
+                <w:kern w:val="0"/>
+                <w:lang w:val="da-DK" w:eastAsia="en-US" w:bidi="ar-SA"/>
+              </w:rPr>
+              <w:t>Group</w:t>
+            </w:r>
+          </w:p>
+        </w:tc>
+        <w:tc>
+          <w:tcPr>
+            <w:tcW w:w="2837" w:type="dxa"/>
+            <w:tcBorders>
+              <w:top w:val="nil"/>
+            </w:tcBorders>
+          </w:tcPr>
+          <w:p>
+            <w:pPr>
+              <w:pStyle w:val="Normal"/>
+              <w:widowControl/>
+              <w:suppressAutoHyphens w:val="true"/>
+              <w:spacing w:lineRule="auto" w:line="240" w:before="0" w:after="0"/>
+              <w:jc w:val="left"/>
+              <w:cnfStyle w:val="000000000000" w:firstRow="0" w:lastRow="0" w:firstColumn="0" w:lastColumn="0" w:oddVBand="0" w:evenVBand="0" w:oddHBand="0" w:evenHBand="0" w:firstRowFirstColumn="0" w:firstRowLastColumn="0" w:lastRowFirstColumn="0" w:lastRowLastColumn="0"/>
+              <w:rPr>
+                <w:rFonts w:eastAsia="Calibri" w:cs=""/>
+                <w:kern w:val="0"/>
+                <w:lang w:val="da-DK" w:eastAsia="en-US" w:bidi="ar-SA"/>
+              </w:rPr>
+            </w:pPr>
+            <w:r>
+              <w:rPr>
+                <w:rFonts w:eastAsia="Calibri" w:cs=""/>
+                <w:kern w:val="0"/>
+                <w:lang w:val="da-DK" w:eastAsia="en-US" w:bidi="ar-SA"/>
+              </w:rPr>
+            </w:r>
+          </w:p>
+        </w:tc>
+        <w:tc>
+          <w:tcPr>
+            <w:tcW w:w="3679" w:type="dxa"/>
+            <w:tcBorders>
+              <w:top w:val="nil"/>
+            </w:tcBorders>
+          </w:tcPr>
+          <w:p>
+            <w:pPr>
+              <w:pStyle w:val="Normal"/>
+              <w:widowControl/>
+              <w:suppressAutoHyphens w:val="true"/>
+              <w:spacing w:lineRule="auto" w:line="240" w:before="0" w:after="0"/>
+              <w:jc w:val="left"/>
+              <w:cnfStyle w:val="000000000000" w:firstRow="0" w:lastRow="0" w:firstColumn="0" w:lastColumn="0" w:oddVBand="0" w:evenVBand="0" w:oddHBand="0" w:evenHBand="0" w:firstRowFirstColumn="0" w:firstRowLastColumn="0" w:lastRowFirstColumn="0" w:lastRowLastColumn="0"/>
+              <w:rPr>
+                <w:rFonts w:eastAsia="Calibri" w:cs=""/>
+                <w:kern w:val="0"/>
+                <w:lang w:val="da-DK" w:eastAsia="en-US" w:bidi="ar-SA"/>
+              </w:rPr>
+            </w:pPr>
+            <w:r>
+              <w:rPr>
+                <w:rFonts w:eastAsia="Calibri" w:cs=""/>
+                <w:kern w:val="0"/>
+                <w:lang w:val="da-DK" w:eastAsia="en-US" w:bidi="ar-SA"/>
+              </w:rPr>
+              <w:t xml:space="preserve">Struktur der beskriver hvordan grupper med </w:t>
+            </w:r>
+            <w:r>
+              <w:rPr>
+                <w:rFonts w:eastAsia="Calibri" w:cs=""/>
+                <w:kern w:val="0"/>
+                <w:lang w:val="da-DK" w:eastAsia="en-US" w:bidi="ar-SA"/>
+              </w:rPr>
+              <w:t xml:space="preserve">eksterne </w:t>
+            </w:r>
+            <w:r>
+              <w:rPr>
+                <w:rFonts w:eastAsia="Calibri" w:cs=""/>
+                <w:kern w:val="0"/>
+                <w:lang w:val="da-DK" w:eastAsia="en-US" w:bidi="ar-SA"/>
+              </w:rPr>
+              <w:t>brugere der har direkte tilhørsforhold i enhederne oprettes og vedligeholdes – se detaljer for opsætningen nedenfor</w:t>
+            </w:r>
+          </w:p>
+        </w:tc>
+      </w:tr>
+      <w:tr>
+        <w:trPr/>
+        <w:tc>
+          <w:tcPr>
+            <w:tcW w:w="3112" w:type="dxa"/>
+            <w:cnfStyle w:val="001000000000" w:firstRow="0" w:lastRow="0" w:firstColumn="1" w:lastColumn="0" w:oddVBand="0" w:evenVBand="0" w:oddHBand="0" w:evenHBand="0" w:firstRowFirstColumn="0" w:firstRowLastColumn="0" w:lastRowFirstColumn="0" w:lastRowLastColumn="0"/>
+            <w:tcBorders>
+              <w:top w:val="nil"/>
+            </w:tcBorders>
+          </w:tcPr>
+          <w:p>
+            <w:pPr>
+              <w:pStyle w:val="Normal"/>
+              <w:widowControl/>
+              <w:suppressAutoHyphens w:val="true"/>
+              <w:spacing w:lineRule="auto" w:line="240" w:before="0" w:after="0"/>
+              <w:jc w:val="left"/>
+              <w:rPr>
+                <w:rFonts w:eastAsia="Calibri" w:cs=""/>
+                <w:b w:val="false"/>
+                <w:bCs w:val="false"/>
+                <w:kern w:val="0"/>
+                <w:lang w:val="da-DK" w:eastAsia="en-US" w:bidi="ar-SA"/>
+              </w:rPr>
+            </w:pPr>
+            <w:r>
+              <w:rPr>
+                <w:rFonts w:eastAsia="Calibri" w:cs=""/>
+                <w:b w:val="false"/>
+                <w:bCs w:val="false"/>
+                <w:kern w:val="0"/>
+                <w:lang w:val="da-DK" w:eastAsia="en-US" w:bidi="ar-SA"/>
+              </w:rPr>
+              <w:t>Inherited</w:t>
+            </w:r>
+            <w:r>
+              <w:rPr>
+                <w:rFonts w:eastAsia="Calibri" w:cs=""/>
+                <w:b w:val="false"/>
+                <w:bCs w:val="false"/>
+                <w:kern w:val="0"/>
+                <w:lang w:val="da-DK" w:eastAsia="en-US" w:bidi="ar-SA"/>
+              </w:rPr>
+              <w:t>External</w:t>
+            </w:r>
+            <w:r>
+              <w:rPr>
+                <w:rFonts w:eastAsia="Calibri" w:cs=""/>
+                <w:b w:val="false"/>
+                <w:bCs w:val="false"/>
+                <w:kern w:val="0"/>
+                <w:lang w:val="da-DK" w:eastAsia="en-US" w:bidi="ar-SA"/>
+              </w:rPr>
+              <w:t>Group</w:t>
+            </w:r>
+          </w:p>
+        </w:tc>
+        <w:tc>
+          <w:tcPr>
+            <w:tcW w:w="2837" w:type="dxa"/>
+            <w:tcBorders>
+              <w:top w:val="nil"/>
+            </w:tcBorders>
+          </w:tcPr>
+          <w:p>
+            <w:pPr>
+              <w:pStyle w:val="Normal"/>
+              <w:widowControl/>
+              <w:suppressAutoHyphens w:val="true"/>
+              <w:spacing w:lineRule="auto" w:line="240" w:before="0" w:after="0"/>
+              <w:jc w:val="left"/>
+              <w:cnfStyle w:val="000000000000" w:firstRow="0" w:lastRow="0" w:firstColumn="0" w:lastColumn="0" w:oddVBand="0" w:evenVBand="0" w:oddHBand="0" w:evenHBand="0" w:firstRowFirstColumn="0" w:firstRowLastColumn="0" w:lastRowFirstColumn="0" w:lastRowLastColumn="0"/>
+              <w:rPr>
+                <w:rFonts w:eastAsia="Calibri" w:cs=""/>
+                <w:kern w:val="0"/>
+                <w:lang w:val="da-DK" w:eastAsia="en-US" w:bidi="ar-SA"/>
+              </w:rPr>
+            </w:pPr>
+            <w:r>
+              <w:rPr>
+                <w:rFonts w:eastAsia="Calibri" w:cs=""/>
+                <w:kern w:val="0"/>
+                <w:lang w:val="da-DK" w:eastAsia="en-US" w:bidi="ar-SA"/>
+              </w:rPr>
+            </w:r>
+          </w:p>
+        </w:tc>
+        <w:tc>
+          <w:tcPr>
+            <w:tcW w:w="3679" w:type="dxa"/>
+            <w:tcBorders>
+              <w:top w:val="nil"/>
+            </w:tcBorders>
+          </w:tcPr>
+          <w:p>
+            <w:pPr>
+              <w:pStyle w:val="Normal"/>
+              <w:widowControl/>
+              <w:suppressAutoHyphens w:val="true"/>
+              <w:spacing w:lineRule="auto" w:line="240" w:before="0" w:after="0"/>
+              <w:jc w:val="left"/>
+              <w:cnfStyle w:val="000000000000" w:firstRow="0" w:lastRow="0" w:firstColumn="0" w:lastColumn="0" w:oddVBand="0" w:evenVBand="0" w:oddHBand="0" w:evenHBand="0" w:firstRowFirstColumn="0" w:firstRowLastColumn="0" w:lastRowFirstColumn="0" w:lastRowLastColumn="0"/>
+              <w:rPr>
+                <w:rFonts w:eastAsia="Calibri" w:cs=""/>
+                <w:kern w:val="0"/>
+                <w:lang w:val="da-DK" w:eastAsia="en-US" w:bidi="ar-SA"/>
+              </w:rPr>
+            </w:pPr>
+            <w:r>
+              <w:rPr>
+                <w:rFonts w:eastAsia="Calibri" w:cs=""/>
+                <w:kern w:val="0"/>
+                <w:lang w:val="da-DK" w:eastAsia="en-US" w:bidi="ar-SA"/>
+              </w:rPr>
+              <w:t xml:space="preserve">Struktur der beskriver hvordan grupper med </w:t>
+            </w:r>
+            <w:r>
+              <w:rPr>
+                <w:rFonts w:eastAsia="Calibri" w:cs=""/>
+                <w:kern w:val="0"/>
+                <w:lang w:val="da-DK" w:eastAsia="en-US" w:bidi="ar-SA"/>
+              </w:rPr>
+              <w:t>eksterne brugere</w:t>
+            </w:r>
+            <w:r>
+              <w:rPr>
+                <w:rFonts w:eastAsia="Calibri" w:cs=""/>
+                <w:kern w:val="0"/>
+                <w:lang w:val="da-DK" w:eastAsia="en-US" w:bidi="ar-SA"/>
+              </w:rPr>
+              <w:t xml:space="preserve"> for enheder  (og alle de underliggende enheder) oprettes og vedligeholdes – se detaljer for opsætningen nedenfor</w:t>
+            </w:r>
+          </w:p>
+        </w:tc>
+      </w:tr>
+      <w:tr>
+        <w:trPr/>
+        <w:tc>
+          <w:tcPr>
+            <w:tcW w:w="3112" w:type="dxa"/>
+            <w:cnfStyle w:val="001000000000" w:firstRow="0" w:lastRow="0" w:firstColumn="1" w:lastColumn="0" w:oddVBand="0" w:evenVBand="0" w:oddHBand="0" w:evenHBand="0" w:firstRowFirstColumn="0" w:firstRowLastColumn="0" w:lastRowFirstColumn="0" w:lastRowLastColumn="0"/>
+            <w:tcBorders>
+              <w:top w:val="nil"/>
+            </w:tcBorders>
+          </w:tcPr>
+          <w:p>
+            <w:pPr>
+              <w:pStyle w:val="Normal"/>
+              <w:widowControl/>
+              <w:suppressAutoHyphens w:val="true"/>
+              <w:spacing w:lineRule="auto" w:line="240" w:before="0" w:after="0"/>
+              <w:jc w:val="left"/>
+              <w:rPr>
+                <w:rFonts w:eastAsia="Calibri" w:cs=""/>
+                <w:b/>
+                <w:bCs/>
+                <w:kern w:val="0"/>
+                <w:lang w:val="da-DK" w:eastAsia="en-US" w:bidi="ar-SA"/>
+              </w:rPr>
+            </w:pPr>
+            <w:r>
+              <w:rPr>
+                <w:rFonts w:eastAsia="Calibri" w:cs=""/>
+                <w:b w:val="false"/>
+                <w:bCs w:val="false"/>
+                <w:kern w:val="0"/>
+                <w:lang w:val="da-DK" w:eastAsia="en-US" w:bidi="ar-SA"/>
+              </w:rPr>
+              <w:t>Direct</w:t>
+            </w:r>
+            <w:r>
+              <w:rPr>
+                <w:rFonts w:eastAsia="Calibri" w:cs=""/>
+                <w:b w:val="false"/>
+                <w:bCs w:val="false"/>
+                <w:kern w:val="0"/>
+                <w:lang w:val="da-DK" w:eastAsia="en-US" w:bidi="ar-SA"/>
+              </w:rPr>
+              <w:t>Substitute</w:t>
+            </w:r>
+            <w:r>
+              <w:rPr>
+                <w:rFonts w:eastAsia="Calibri" w:cs=""/>
+                <w:b w:val="false"/>
+                <w:bCs w:val="false"/>
+                <w:kern w:val="0"/>
+                <w:lang w:val="da-DK" w:eastAsia="en-US" w:bidi="ar-SA"/>
+              </w:rPr>
+              <w:t>Group</w:t>
+            </w:r>
+          </w:p>
+        </w:tc>
+        <w:tc>
+          <w:tcPr>
+            <w:tcW w:w="2837" w:type="dxa"/>
+            <w:tcBorders>
+              <w:top w:val="nil"/>
+            </w:tcBorders>
+          </w:tcPr>
+          <w:p>
+            <w:pPr>
+              <w:pStyle w:val="Normal"/>
+              <w:widowControl/>
+              <w:suppressAutoHyphens w:val="true"/>
+              <w:spacing w:lineRule="auto" w:line="240" w:before="0" w:after="0"/>
+              <w:jc w:val="left"/>
+              <w:cnfStyle w:val="000000000000" w:firstRow="0" w:lastRow="0" w:firstColumn="0" w:lastColumn="0" w:oddVBand="0" w:evenVBand="0" w:oddHBand="0" w:evenHBand="0" w:firstRowFirstColumn="0" w:firstRowLastColumn="0" w:lastRowFirstColumn="0" w:lastRowLastColumn="0"/>
+              <w:rPr>
+                <w:rFonts w:eastAsia="Calibri" w:cs=""/>
+                <w:kern w:val="0"/>
+                <w:lang w:val="da-DK" w:eastAsia="en-US" w:bidi="ar-SA"/>
+              </w:rPr>
+            </w:pPr>
+            <w:r>
+              <w:rPr>
+                <w:rFonts w:eastAsia="Calibri" w:cs=""/>
+                <w:kern w:val="0"/>
+                <w:lang w:val="da-DK" w:eastAsia="en-US" w:bidi="ar-SA"/>
+              </w:rPr>
+            </w:r>
+          </w:p>
+        </w:tc>
+        <w:tc>
+          <w:tcPr>
+            <w:tcW w:w="3679" w:type="dxa"/>
+            <w:tcBorders>
+              <w:top w:val="nil"/>
+            </w:tcBorders>
+          </w:tcPr>
+          <w:p>
+            <w:pPr>
+              <w:pStyle w:val="Normal"/>
+              <w:widowControl/>
+              <w:suppressAutoHyphens w:val="true"/>
+              <w:spacing w:lineRule="auto" w:line="240" w:before="0" w:after="0"/>
+              <w:jc w:val="left"/>
+              <w:cnfStyle w:val="000000000000" w:firstRow="0" w:lastRow="0" w:firstColumn="0" w:lastColumn="0" w:oddVBand="0" w:evenVBand="0" w:oddHBand="0" w:evenHBand="0" w:firstRowFirstColumn="0" w:firstRowLastColumn="0" w:lastRowFirstColumn="0" w:lastRowLastColumn="0"/>
+              <w:rPr>
+                <w:rFonts w:eastAsia="Calibri" w:cs=""/>
+                <w:kern w:val="0"/>
+                <w:lang w:val="da-DK" w:eastAsia="en-US" w:bidi="ar-SA"/>
+              </w:rPr>
+            </w:pPr>
+            <w:r>
+              <w:rPr>
+                <w:rFonts w:eastAsia="Calibri" w:cs=""/>
+                <w:kern w:val="0"/>
+                <w:lang w:val="da-DK" w:eastAsia="en-US" w:bidi="ar-SA"/>
+              </w:rPr>
+              <w:t xml:space="preserve">Struktur der beskriver hvordan grupper med </w:t>
+            </w:r>
+            <w:r>
+              <w:rPr>
+                <w:rFonts w:eastAsia="Calibri" w:cs=""/>
+                <w:kern w:val="0"/>
+                <w:lang w:val="da-DK" w:eastAsia="en-US" w:bidi="ar-SA"/>
+              </w:rPr>
+              <w:t>vikar brugere</w:t>
+            </w:r>
+            <w:r>
+              <w:rPr>
+                <w:rFonts w:eastAsia="Calibri" w:cs=""/>
+                <w:kern w:val="0"/>
+                <w:lang w:val="da-DK" w:eastAsia="en-US" w:bidi="ar-SA"/>
+              </w:rPr>
+              <w:t xml:space="preserve"> der har direkte tilhørsforhold i enhederne oprettes og vedligeholdes – se detaljer for opsætningen nedenfor</w:t>
+            </w:r>
+          </w:p>
+        </w:tc>
+      </w:tr>
+      <w:tr>
+        <w:trPr/>
+        <w:tc>
+          <w:tcPr>
+            <w:tcW w:w="3112" w:type="dxa"/>
+            <w:cnfStyle w:val="001000000000" w:firstRow="0" w:lastRow="0" w:firstColumn="1" w:lastColumn="0" w:oddVBand="0" w:evenVBand="0" w:oddHBand="0" w:evenHBand="0" w:firstRowFirstColumn="0" w:firstRowLastColumn="0" w:lastRowFirstColumn="0" w:lastRowLastColumn="0"/>
+            <w:tcBorders>
+              <w:top w:val="nil"/>
+            </w:tcBorders>
+          </w:tcPr>
+          <w:p>
+            <w:pPr>
+              <w:pStyle w:val="Normal"/>
+              <w:widowControl/>
+              <w:suppressAutoHyphens w:val="true"/>
+              <w:spacing w:lineRule="auto" w:line="240" w:before="0" w:after="0"/>
+              <w:jc w:val="left"/>
+              <w:rPr>
+                <w:rFonts w:eastAsia="Calibri" w:cs=""/>
+                <w:b w:val="false"/>
+                <w:bCs w:val="false"/>
+                <w:kern w:val="0"/>
+                <w:lang w:val="da-DK" w:eastAsia="en-US" w:bidi="ar-SA"/>
+              </w:rPr>
+            </w:pPr>
+            <w:r>
+              <w:rPr>
+                <w:rFonts w:eastAsia="Calibri" w:cs=""/>
+                <w:b w:val="false"/>
+                <w:bCs w:val="false"/>
+                <w:kern w:val="0"/>
+                <w:lang w:val="da-DK" w:eastAsia="en-US" w:bidi="ar-SA"/>
+              </w:rPr>
+              <w:t>Inherited</w:t>
+            </w:r>
+            <w:r>
+              <w:rPr>
+                <w:rFonts w:eastAsia="Calibri" w:cs=""/>
+                <w:b w:val="false"/>
+                <w:bCs w:val="false"/>
+                <w:kern w:val="0"/>
+                <w:lang w:val="da-DK" w:eastAsia="en-US" w:bidi="ar-SA"/>
+              </w:rPr>
+              <w:t>Substitute</w:t>
+            </w:r>
+            <w:r>
+              <w:rPr>
+                <w:rFonts w:eastAsia="Calibri" w:cs=""/>
+                <w:b w:val="false"/>
+                <w:bCs w:val="false"/>
+                <w:kern w:val="0"/>
+                <w:lang w:val="da-DK" w:eastAsia="en-US" w:bidi="ar-SA"/>
+              </w:rPr>
+              <w:t>Group</w:t>
+            </w:r>
+          </w:p>
+        </w:tc>
+        <w:tc>
+          <w:tcPr>
+            <w:tcW w:w="2837" w:type="dxa"/>
+            <w:tcBorders>
+              <w:top w:val="nil"/>
+            </w:tcBorders>
+          </w:tcPr>
+          <w:p>
+            <w:pPr>
+              <w:pStyle w:val="Normal"/>
+              <w:widowControl/>
+              <w:suppressAutoHyphens w:val="true"/>
+              <w:spacing w:lineRule="auto" w:line="240" w:before="0" w:after="0"/>
+              <w:jc w:val="left"/>
+              <w:cnfStyle w:val="000000000000" w:firstRow="0" w:lastRow="0" w:firstColumn="0" w:lastColumn="0" w:oddVBand="0" w:evenVBand="0" w:oddHBand="0" w:evenHBand="0" w:firstRowFirstColumn="0" w:firstRowLastColumn="0" w:lastRowFirstColumn="0" w:lastRowLastColumn="0"/>
+              <w:rPr>
+                <w:rFonts w:eastAsia="Calibri" w:cs=""/>
+                <w:kern w:val="0"/>
+                <w:lang w:val="da-DK" w:eastAsia="en-US" w:bidi="ar-SA"/>
+              </w:rPr>
+            </w:pPr>
+            <w:r>
+              <w:rPr>
+                <w:rFonts w:eastAsia="Calibri" w:cs=""/>
+                <w:kern w:val="0"/>
+                <w:lang w:val="da-DK" w:eastAsia="en-US" w:bidi="ar-SA"/>
+              </w:rPr>
+            </w:r>
+          </w:p>
+        </w:tc>
+        <w:tc>
+          <w:tcPr>
+            <w:tcW w:w="3679" w:type="dxa"/>
+            <w:tcBorders>
+              <w:top w:val="nil"/>
+            </w:tcBorders>
+          </w:tcPr>
+          <w:p>
+            <w:pPr>
+              <w:pStyle w:val="Normal"/>
+              <w:widowControl/>
+              <w:suppressAutoHyphens w:val="true"/>
+              <w:spacing w:lineRule="auto" w:line="240" w:before="0" w:after="0"/>
+              <w:jc w:val="left"/>
+              <w:cnfStyle w:val="000000000000" w:firstRow="0" w:lastRow="0" w:firstColumn="0" w:lastColumn="0" w:oddVBand="0" w:evenVBand="0" w:oddHBand="0" w:evenHBand="0" w:firstRowFirstColumn="0" w:firstRowLastColumn="0" w:lastRowFirstColumn="0" w:lastRowLastColumn="0"/>
+              <w:rPr>
+                <w:rFonts w:eastAsia="Calibri" w:cs=""/>
+                <w:kern w:val="0"/>
+                <w:lang w:val="da-DK" w:eastAsia="en-US" w:bidi="ar-SA"/>
+              </w:rPr>
+            </w:pPr>
+            <w:r>
+              <w:rPr>
+                <w:rFonts w:eastAsia="Calibri" w:cs=""/>
+                <w:kern w:val="0"/>
+                <w:lang w:val="da-DK" w:eastAsia="en-US" w:bidi="ar-SA"/>
+              </w:rPr>
+              <w:t xml:space="preserve">Struktur der beskriver hvordan grupper med </w:t>
+            </w:r>
+            <w:r>
+              <w:rPr>
+                <w:rFonts w:eastAsia="Calibri" w:cs=""/>
+                <w:kern w:val="0"/>
+                <w:lang w:val="da-DK" w:eastAsia="en-US" w:bidi="ar-SA"/>
+              </w:rPr>
+              <w:t>vikar brugere</w:t>
+            </w:r>
+            <w:r>
+              <w:rPr>
+                <w:rFonts w:eastAsia="Calibri" w:cs=""/>
+                <w:kern w:val="0"/>
+                <w:lang w:val="da-DK" w:eastAsia="en-US" w:bidi="ar-SA"/>
+              </w:rPr>
+              <w:t xml:space="preserve"> for enheder  (og alle de underliggende enheder) oprettes og vedligeholdes – se detaljer for opsætningen nedenfor</w:t>
             </w:r>
           </w:p>
         </w:tc>
@@ -6262,77 +6903,7 @@
           <w:kern w:val="0"/>
           <w:lang w:val="da-DK" w:eastAsia="en-US" w:bidi="ar-SA"/>
         </w:rPr>
-        <w:t xml:space="preserve">DirectManagerGroup </w:t>
-      </w:r>
-      <w:r>
-        <w:rPr>
-          <w:rFonts w:eastAsia="Calibri" w:cs=""/>
-          <w:b w:val="false"/>
-          <w:bCs w:val="false"/>
-          <w:kern w:val="0"/>
-          <w:lang w:val="da-DK" w:eastAsia="en-US" w:bidi="ar-SA"/>
-        </w:rPr>
-        <w:t xml:space="preserve">er bagudkompatible med </w:t>
-      </w:r>
-      <w:r>
-        <w:rPr>
-          <w:rFonts w:eastAsia="Calibri" w:cs=""/>
-          <w:b w:val="false"/>
-          <w:bCs w:val="false"/>
-          <w:kern w:val="0"/>
-          <w:lang w:val="da-DK" w:eastAsia="en-US" w:bidi="ar-SA"/>
-        </w:rPr>
-        <w:t xml:space="preserve">ManagerGroup </w:t>
-      </w:r>
-      <w:r>
-        <w:rPr>
-          <w:rFonts w:eastAsia="Calibri" w:cs=""/>
-          <w:b w:val="false"/>
-          <w:bCs w:val="false"/>
-          <w:kern w:val="0"/>
-          <w:lang w:val="da-DK" w:eastAsia="en-US" w:bidi="ar-SA"/>
-        </w:rPr>
-        <w:t xml:space="preserve">og InheritedMemberGroup er bagudkompatible med </w:t>
-      </w:r>
-      <w:r>
-        <w:rPr>
-          <w:rFonts w:eastAsia="Calibri" w:cs=""/>
-          <w:b w:val="false"/>
-          <w:bCs w:val="false"/>
-          <w:kern w:val="0"/>
-          <w:lang w:val="da-DK" w:eastAsia="en-US" w:bidi="ar-SA"/>
-        </w:rPr>
-        <w:t xml:space="preserve">MemberGroup, </w:t>
-      </w:r>
-      <w:r>
-        <w:rPr>
-          <w:rFonts w:eastAsia="Calibri" w:cs=""/>
-          <w:b w:val="false"/>
-          <w:bCs w:val="false"/>
-          <w:kern w:val="0"/>
-          <w:lang w:val="da-DK" w:eastAsia="en-US" w:bidi="ar-SA"/>
-        </w:rPr>
-        <w:t>således begge navne kan anvendes.</w:t>
-      </w:r>
-      <w:r>
-        <w:rPr>
-          <w:rFonts w:eastAsia="Calibri" w:cs=""/>
-          <w:b w:val="false"/>
-          <w:bCs w:val="false"/>
-          <w:kern w:val="0"/>
-          <w:lang w:val="da-DK" w:eastAsia="en-US" w:bidi="ar-SA"/>
-        </w:rPr>
-        <w:t xml:space="preserve"> </w:t>
-      </w:r>
-      <w:r>
-        <w:rPr>
-          <w:rFonts w:eastAsia="Calibri" w:cs=""/>
-          <w:b w:val="false"/>
-          <w:bCs w:val="false"/>
-          <w:kern w:val="0"/>
-          <w:lang w:val="da-DK" w:eastAsia="en-US" w:bidi="ar-SA"/>
-        </w:rPr>
-        <w:t>Såfremt indstillingen er enablet både med sit nye og bagudkompatible navn, vil indstillingerne med de nye navn blive brugt. Vi anbefaler, at man i videst mulige udstrækning bruger de nyeste navne.</w:t>
+        <w:t>DirectManagerGroup er bagudkompatible med ManagerGroup og InheritedMemberGroup er bagudkompatible med MemberGroup, således begge navne kan anvendes. Såfremt indstillingen er enablet både med sit nye og bagudkompatible navn, vil indstillingerne med de nye navn blive brugt. Vi anbefaler, at man i videst mulige udstrækning bruger de nyeste navne.</w:t>
       </w:r>
     </w:p>
     <w:p>
@@ -6359,31 +6930,7 @@
         <w:rPr>
           <w:lang w:val="da-DK"/>
         </w:rPr>
-        <w:t xml:space="preserve">Hver af de </w:t>
-      </w:r>
-      <w:r>
-        <w:rPr>
-          <w:lang w:val="da-DK"/>
-        </w:rPr>
-        <w:t>4</w:t>
-      </w:r>
-      <w:r>
-        <w:rPr>
-          <w:lang w:val="da-DK"/>
-        </w:rPr>
-        <w:t xml:space="preserve"> typer af grupper har en sektion der angiver hvordan disse skal skabes. Strukturen er ens for hver af disse, og konfigu</w:t>
-      </w:r>
-      <w:r>
-        <w:rPr>
-          <w:lang w:val="da-DK"/>
-        </w:rPr>
-        <w:t>r</w:t>
-      </w:r>
-      <w:r>
-        <w:rPr>
-          <w:lang w:val="da-DK"/>
-        </w:rPr>
-        <w:t>eres på følgende måde</w:t>
+        <w:t>Hver af de 4 typer af grupper har en sektion der angiver hvordan disse skal skabes. Strukturen er ens for hver af disse, og konfigureres på følgende måde</w:t>
       </w:r>
     </w:p>
     <w:tbl>
@@ -6402,8 +6949,8 @@
         <w:tblLook w:val="04a0" w:noHBand="0" w:noVBand="1" w:firstColumn="1" w:lastRow="0" w:lastColumn="0" w:firstRow="1"/>
       </w:tblPr>
       <w:tblGrid>
-        <w:gridCol w:w="3113"/>
-        <w:gridCol w:w="2836"/>
+        <w:gridCol w:w="3112"/>
+        <w:gridCol w:w="2837"/>
         <w:gridCol w:w="3679"/>
       </w:tblGrid>
       <w:tr>
@@ -6412,7 +6959,7 @@
         </w:trPr>
         <w:tc>
           <w:tcPr>
-            <w:tcW w:w="3113" w:type="dxa"/>
+            <w:tcW w:w="3112" w:type="dxa"/>
             <w:cnfStyle w:val="001000000000" w:firstRow="0" w:lastRow="0" w:firstColumn="1" w:lastColumn="0" w:oddVBand="0" w:evenVBand="0" w:oddHBand="0" w:evenHBand="0" w:firstRowFirstColumn="0" w:firstRowLastColumn="0" w:lastRowFirstColumn="0" w:lastRowLastColumn="0"/>
             <w:tcBorders>
               <w:bottom w:val="single" w:sz="12" w:space="0" w:color="9CC2E5"/>
@@ -6422,6 +6969,7 @@
             <w:pPr>
               <w:pStyle w:val="Normal"/>
               <w:widowControl/>
+              <w:suppressAutoHyphens w:val="true"/>
               <w:spacing w:lineRule="auto" w:line="240" w:before="0" w:after="0"/>
               <w:jc w:val="left"/>
               <w:rPr>
@@ -6446,7 +6994,7 @@
         </w:tc>
         <w:tc>
           <w:tcPr>
-            <w:tcW w:w="2836" w:type="dxa"/>
+            <w:tcW w:w="2837" w:type="dxa"/>
             <w:tcBorders>
               <w:bottom w:val="single" w:sz="12" w:space="0" w:color="9CC2E5"/>
             </w:tcBorders>
@@ -6455,6 +7003,7 @@
             <w:pPr>
               <w:pStyle w:val="Normal"/>
               <w:widowControl/>
+              <w:suppressAutoHyphens w:val="true"/>
               <w:spacing w:lineRule="auto" w:line="240" w:before="0" w:after="0"/>
               <w:jc w:val="left"/>
               <w:cnfStyle w:val="100000000000" w:firstRow="1" w:lastRow="0" w:firstColumn="0" w:lastColumn="0" w:oddVBand="0" w:evenVBand="0" w:oddHBand="0" w:evenHBand="0" w:firstRowFirstColumn="0" w:firstRowLastColumn="0" w:lastRowFirstColumn="0" w:lastRowLastColumn="0"/>
@@ -6489,6 +7038,7 @@
             <w:pPr>
               <w:pStyle w:val="Normal"/>
               <w:widowControl/>
+              <w:suppressAutoHyphens w:val="true"/>
               <w:spacing w:lineRule="auto" w:line="240" w:before="0" w:after="0"/>
               <w:jc w:val="left"/>
               <w:cnfStyle w:val="100000000000" w:firstRow="1" w:lastRow="0" w:firstColumn="0" w:lastColumn="0" w:oddVBand="0" w:evenVBand="0" w:oddHBand="0" w:evenHBand="0" w:firstRowFirstColumn="0" w:firstRowLastColumn="0" w:lastRowFirstColumn="0" w:lastRowLastColumn="0"/>
@@ -6517,7 +7067,7 @@
         <w:trPr/>
         <w:tc>
           <w:tcPr>
-            <w:tcW w:w="3113" w:type="dxa"/>
+            <w:tcW w:w="3112" w:type="dxa"/>
             <w:cnfStyle w:val="001000000000" w:firstRow="0" w:lastRow="0" w:firstColumn="1" w:lastColumn="0" w:oddVBand="0" w:evenVBand="0" w:oddHBand="0" w:evenHBand="0" w:firstRowFirstColumn="0" w:firstRowLastColumn="0" w:lastRowFirstColumn="0" w:lastRowLastColumn="0"/>
             <w:tcBorders/>
           </w:tcPr>
@@ -6525,6 +7075,7 @@
             <w:pPr>
               <w:pStyle w:val="Normal"/>
               <w:widowControl/>
+              <w:suppressAutoHyphens w:val="true"/>
               <w:spacing w:lineRule="auto" w:line="240" w:before="0" w:after="0"/>
               <w:jc w:val="left"/>
               <w:rPr>
@@ -6549,13 +7100,14 @@
         </w:tc>
         <w:tc>
           <w:tcPr>
-            <w:tcW w:w="2836" w:type="dxa"/>
-            <w:tcBorders/>
-          </w:tcPr>
-          <w:p>
-            <w:pPr>
-              <w:pStyle w:val="Normal"/>
-              <w:widowControl/>
+            <w:tcW w:w="2837" w:type="dxa"/>
+            <w:tcBorders/>
+          </w:tcPr>
+          <w:p>
+            <w:pPr>
+              <w:pStyle w:val="Normal"/>
+              <w:widowControl/>
+              <w:suppressAutoHyphens w:val="true"/>
               <w:spacing w:lineRule="auto" w:line="240" w:before="0" w:after="0"/>
               <w:jc w:val="left"/>
               <w:cnfStyle w:val="000000000000" w:firstRow="0" w:lastRow="0" w:firstColumn="0" w:lastColumn="0" w:oddVBand="0" w:evenVBand="0" w:oddHBand="0" w:evenHBand="0" w:firstRowFirstColumn="0" w:firstRowLastColumn="0" w:lastRowFirstColumn="0" w:lastRowLastColumn="0"/>
@@ -6584,6 +7136,7 @@
             <w:pPr>
               <w:pStyle w:val="Normal"/>
               <w:widowControl/>
+              <w:suppressAutoHyphens w:val="true"/>
               <w:spacing w:lineRule="auto" w:line="240" w:before="0" w:after="0"/>
               <w:jc w:val="left"/>
               <w:cnfStyle w:val="000000000000" w:firstRow="0" w:lastRow="0" w:firstColumn="0" w:lastColumn="0" w:oddVBand="0" w:evenVBand="0" w:oddHBand="0" w:evenHBand="0" w:firstRowFirstColumn="0" w:firstRowLastColumn="0" w:lastRowFirstColumn="0" w:lastRowLastColumn="0"/>
@@ -6608,7 +7161,7 @@
         <w:trPr/>
         <w:tc>
           <w:tcPr>
-            <w:tcW w:w="3113" w:type="dxa"/>
+            <w:tcW w:w="3112" w:type="dxa"/>
             <w:cnfStyle w:val="001000000000" w:firstRow="0" w:lastRow="0" w:firstColumn="1" w:lastColumn="0" w:oddVBand="0" w:evenVBand="0" w:oddHBand="0" w:evenHBand="0" w:firstRowFirstColumn="0" w:firstRowLastColumn="0" w:lastRowFirstColumn="0" w:lastRowLastColumn="0"/>
             <w:tcBorders/>
           </w:tcPr>
@@ -6616,6 +7169,7 @@
             <w:pPr>
               <w:pStyle w:val="Normal"/>
               <w:widowControl/>
+              <w:suppressAutoHyphens w:val="true"/>
               <w:spacing w:lineRule="auto" w:line="240" w:before="0" w:after="0"/>
               <w:jc w:val="left"/>
               <w:rPr>
@@ -6640,13 +7194,14 @@
         </w:tc>
         <w:tc>
           <w:tcPr>
-            <w:tcW w:w="2836" w:type="dxa"/>
-            <w:tcBorders/>
-          </w:tcPr>
-          <w:p>
-            <w:pPr>
-              <w:pStyle w:val="Normal"/>
-              <w:widowControl/>
+            <w:tcW w:w="2837" w:type="dxa"/>
+            <w:tcBorders/>
+          </w:tcPr>
+          <w:p>
+            <w:pPr>
+              <w:pStyle w:val="Normal"/>
+              <w:widowControl/>
+              <w:suppressAutoHyphens w:val="true"/>
               <w:spacing w:lineRule="auto" w:line="240" w:before="0" w:after="0"/>
               <w:jc w:val="left"/>
               <w:cnfStyle w:val="000000000000" w:firstRow="0" w:lastRow="0" w:firstColumn="0" w:lastColumn="0" w:oddVBand="0" w:evenVBand="0" w:oddHBand="0" w:evenHBand="0" w:firstRowFirstColumn="0" w:firstRowLastColumn="0" w:lastRowFirstColumn="0" w:lastRowLastColumn="0"/>
@@ -6674,6 +7229,7 @@
             <w:pPr>
               <w:pStyle w:val="Normal"/>
               <w:widowControl/>
+              <w:suppressAutoHyphens w:val="true"/>
               <w:spacing w:lineRule="auto" w:line="240" w:before="0" w:after="0"/>
               <w:jc w:val="left"/>
               <w:cnfStyle w:val="000000000000" w:firstRow="0" w:lastRow="0" w:firstColumn="0" w:lastColumn="0" w:oddVBand="0" w:evenVBand="0" w:oddHBand="0" w:evenHBand="0" w:firstRowFirstColumn="0" w:firstRowLastColumn="0" w:lastRowFirstColumn="0" w:lastRowLastColumn="0"/>
@@ -6698,7 +7254,7 @@
         <w:trPr/>
         <w:tc>
           <w:tcPr>
-            <w:tcW w:w="3113" w:type="dxa"/>
+            <w:tcW w:w="3112" w:type="dxa"/>
             <w:cnfStyle w:val="001000000000" w:firstRow="0" w:lastRow="0" w:firstColumn="1" w:lastColumn="0" w:oddVBand="0" w:evenVBand="0" w:oddHBand="0" w:evenHBand="0" w:firstRowFirstColumn="0" w:firstRowLastColumn="0" w:lastRowFirstColumn="0" w:lastRowLastColumn="0"/>
             <w:tcBorders/>
           </w:tcPr>
@@ -6706,6 +7262,7 @@
             <w:pPr>
               <w:pStyle w:val="Normal"/>
               <w:widowControl/>
+              <w:suppressAutoHyphens w:val="true"/>
               <w:spacing w:lineRule="auto" w:line="240" w:before="0" w:after="0"/>
               <w:jc w:val="left"/>
               <w:rPr>
@@ -6730,13 +7287,14 @@
         </w:tc>
         <w:tc>
           <w:tcPr>
-            <w:tcW w:w="2836" w:type="dxa"/>
-            <w:tcBorders/>
-          </w:tcPr>
-          <w:p>
-            <w:pPr>
-              <w:pStyle w:val="Normal"/>
-              <w:widowControl/>
+            <w:tcW w:w="2837" w:type="dxa"/>
+            <w:tcBorders/>
+          </w:tcPr>
+          <w:p>
+            <w:pPr>
+              <w:pStyle w:val="Normal"/>
+              <w:widowControl/>
+              <w:suppressAutoHyphens w:val="true"/>
               <w:spacing w:lineRule="auto" w:line="240" w:before="0" w:after="0"/>
               <w:jc w:val="left"/>
               <w:cnfStyle w:val="000000000000" w:firstRow="0" w:lastRow="0" w:firstColumn="0" w:lastColumn="0" w:oddVBand="0" w:evenVBand="0" w:oddHBand="0" w:evenHBand="0" w:firstRowFirstColumn="0" w:firstRowLastColumn="0" w:lastRowFirstColumn="0" w:lastRowLastColumn="0"/>
@@ -6764,6 +7322,7 @@
             <w:pPr>
               <w:pStyle w:val="Normal"/>
               <w:widowControl/>
+              <w:suppressAutoHyphens w:val="true"/>
               <w:spacing w:lineRule="auto" w:line="240" w:before="0" w:after="0"/>
               <w:jc w:val="left"/>
               <w:cnfStyle w:val="000000000000" w:firstRow="0" w:lastRow="0" w:firstColumn="0" w:lastColumn="0" w:oddVBand="0" w:evenVBand="0" w:oddHBand="0" w:evenHBand="0" w:firstRowFirstColumn="0" w:firstRowLastColumn="0" w:lastRowFirstColumn="0" w:lastRowLastColumn="0"/>
@@ -6788,7 +7347,7 @@
         <w:trPr/>
         <w:tc>
           <w:tcPr>
-            <w:tcW w:w="3113" w:type="dxa"/>
+            <w:tcW w:w="3112" w:type="dxa"/>
             <w:cnfStyle w:val="001000000000" w:firstRow="0" w:lastRow="0" w:firstColumn="1" w:lastColumn="0" w:oddVBand="0" w:evenVBand="0" w:oddHBand="0" w:evenHBand="0" w:firstRowFirstColumn="0" w:firstRowLastColumn="0" w:lastRowFirstColumn="0" w:lastRowLastColumn="0"/>
             <w:tcBorders/>
           </w:tcPr>
@@ -6796,6 +7355,7 @@
             <w:pPr>
               <w:pStyle w:val="Normal"/>
               <w:widowControl/>
+              <w:suppressAutoHyphens w:val="true"/>
               <w:spacing w:lineRule="auto" w:line="240" w:before="0" w:after="0"/>
               <w:jc w:val="left"/>
               <w:rPr>
@@ -6820,13 +7380,14 @@
         </w:tc>
         <w:tc>
           <w:tcPr>
-            <w:tcW w:w="2836" w:type="dxa"/>
-            <w:tcBorders/>
-          </w:tcPr>
-          <w:p>
-            <w:pPr>
-              <w:pStyle w:val="Normal"/>
-              <w:widowControl/>
+            <w:tcW w:w="2837" w:type="dxa"/>
+            <w:tcBorders/>
+          </w:tcPr>
+          <w:p>
+            <w:pPr>
+              <w:pStyle w:val="Normal"/>
+              <w:widowControl/>
+              <w:suppressAutoHyphens w:val="true"/>
               <w:spacing w:lineRule="auto" w:line="240" w:before="0" w:after="0"/>
               <w:jc w:val="left"/>
               <w:cnfStyle w:val="000000000000" w:firstRow="0" w:lastRow="0" w:firstColumn="0" w:lastColumn="0" w:oddVBand="0" w:evenVBand="0" w:oddHBand="0" w:evenHBand="0" w:firstRowFirstColumn="0" w:firstRowLastColumn="0" w:lastRowFirstColumn="0" w:lastRowLastColumn="0"/>
@@ -6854,6 +7415,7 @@
             <w:pPr>
               <w:pStyle w:val="Normal"/>
               <w:widowControl/>
+              <w:suppressAutoHyphens w:val="true"/>
               <w:spacing w:lineRule="auto" w:line="240" w:before="0" w:after="0"/>
               <w:jc w:val="left"/>
               <w:cnfStyle w:val="000000000000" w:firstRow="0" w:lastRow="0" w:firstColumn="0" w:lastColumn="0" w:oddVBand="0" w:evenVBand="0" w:oddHBand="0" w:evenHBand="0" w:firstRowFirstColumn="0" w:firstRowLastColumn="0" w:lastRowFirstColumn="0" w:lastRowLastColumn="0"/>
@@ -6878,7 +7440,7 @@
         <w:trPr/>
         <w:tc>
           <w:tcPr>
-            <w:tcW w:w="3113" w:type="dxa"/>
+            <w:tcW w:w="3112" w:type="dxa"/>
             <w:cnfStyle w:val="001000000000" w:firstRow="0" w:lastRow="0" w:firstColumn="1" w:lastColumn="0" w:oddVBand="0" w:evenVBand="0" w:oddHBand="0" w:evenHBand="0" w:firstRowFirstColumn="0" w:firstRowLastColumn="0" w:lastRowFirstColumn="0" w:lastRowLastColumn="0"/>
             <w:tcBorders/>
           </w:tcPr>
@@ -6886,6 +7448,7 @@
             <w:pPr>
               <w:pStyle w:val="Normal"/>
               <w:widowControl/>
+              <w:suppressAutoHyphens w:val="true"/>
               <w:spacing w:lineRule="auto" w:line="240" w:before="0" w:after="0"/>
               <w:jc w:val="left"/>
               <w:rPr>
@@ -6910,13 +7473,14 @@
         </w:tc>
         <w:tc>
           <w:tcPr>
-            <w:tcW w:w="2836" w:type="dxa"/>
-            <w:tcBorders/>
-          </w:tcPr>
-          <w:p>
-            <w:pPr>
-              <w:pStyle w:val="Normal"/>
-              <w:widowControl/>
+            <w:tcW w:w="2837" w:type="dxa"/>
+            <w:tcBorders/>
+          </w:tcPr>
+          <w:p>
+            <w:pPr>
+              <w:pStyle w:val="Normal"/>
+              <w:widowControl/>
+              <w:suppressAutoHyphens w:val="true"/>
               <w:spacing w:lineRule="auto" w:line="240" w:before="0" w:after="0"/>
               <w:jc w:val="left"/>
               <w:cnfStyle w:val="000000000000" w:firstRow="0" w:lastRow="0" w:firstColumn="0" w:lastColumn="0" w:oddVBand="0" w:evenVBand="0" w:oddHBand="0" w:evenHBand="0" w:firstRowFirstColumn="0" w:firstRowLastColumn="0" w:lastRowFirstColumn="0" w:lastRowLastColumn="0"/>
@@ -6944,6 +7508,7 @@
             <w:pPr>
               <w:pStyle w:val="Normal"/>
               <w:widowControl/>
+              <w:suppressAutoHyphens w:val="true"/>
               <w:spacing w:lineRule="auto" w:line="240" w:before="0" w:after="0"/>
               <w:jc w:val="left"/>
               <w:cnfStyle w:val="000000000000" w:firstRow="0" w:lastRow="0" w:firstColumn="0" w:lastColumn="0" w:oddVBand="0" w:evenVBand="0" w:oddHBand="0" w:evenHBand="0" w:firstRowFirstColumn="0" w:firstRowLastColumn="0" w:lastRowFirstColumn="0" w:lastRowLastColumn="0"/>
@@ -6960,6 +7525,305 @@
                 <w:lang w:val="da-DK" w:eastAsia="en-US" w:bidi="ar-SA"/>
               </w:rPr>
               <w:t>Hvad skal der står i beskrivelsesfeltet for gruppen</w:t>
+            </w:r>
+          </w:p>
+        </w:tc>
+      </w:tr>
+      <w:tr>
+        <w:trPr/>
+        <w:tc>
+          <w:tcPr>
+            <w:tcW w:w="3112" w:type="dxa"/>
+            <w:cnfStyle w:val="001000000000" w:firstRow="0" w:lastRow="0" w:firstColumn="1" w:lastColumn="0" w:oddVBand="0" w:evenVBand="0" w:oddHBand="0" w:evenHBand="0" w:firstRowFirstColumn="0" w:firstRowLastColumn="0" w:lastRowFirstColumn="0" w:lastRowLastColumn="0"/>
+            <w:tcBorders>
+              <w:top w:val="nil"/>
+            </w:tcBorders>
+          </w:tcPr>
+          <w:p>
+            <w:pPr>
+              <w:pStyle w:val="Normal"/>
+              <w:widowControl/>
+              <w:suppressAutoHyphens w:val="true"/>
+              <w:spacing w:lineRule="auto" w:line="240" w:before="0" w:after="0"/>
+              <w:jc w:val="left"/>
+              <w:rPr>
+                <w:rFonts w:eastAsia="Calibri" w:cs=""/>
+                <w:b w:val="false"/>
+                <w:bCs w:val="false"/>
+                <w:kern w:val="0"/>
+                <w:lang w:val="da-DK" w:eastAsia="en-US" w:bidi="ar-SA"/>
+              </w:rPr>
+            </w:pPr>
+            <w:r>
+              <w:rPr>
+                <w:rFonts w:eastAsia="Calibri" w:cs=""/>
+                <w:b w:val="false"/>
+                <w:bCs w:val="false"/>
+                <w:kern w:val="0"/>
+                <w:lang w:val="da-DK" w:eastAsia="en-US" w:bidi="ar-SA"/>
+              </w:rPr>
+              <w:t>ExcludeExternalUsers</w:t>
+            </w:r>
+          </w:p>
+        </w:tc>
+        <w:tc>
+          <w:tcPr>
+            <w:tcW w:w="2837" w:type="dxa"/>
+            <w:tcBorders>
+              <w:top w:val="nil"/>
+            </w:tcBorders>
+          </w:tcPr>
+          <w:p>
+            <w:pPr>
+              <w:pStyle w:val="Normal"/>
+              <w:widowControl/>
+              <w:suppressAutoHyphens w:val="true"/>
+              <w:spacing w:lineRule="auto" w:line="240" w:before="0" w:after="0"/>
+              <w:jc w:val="left"/>
+              <w:cnfStyle w:val="000000000000" w:firstRow="0" w:lastRow="0" w:firstColumn="0" w:lastColumn="0" w:oddVBand="0" w:evenVBand="0" w:oddHBand="0" w:evenHBand="0" w:firstRowFirstColumn="0" w:firstRowLastColumn="0" w:lastRowFirstColumn="0" w:lastRowLastColumn="0"/>
+              <w:rPr>
+                <w:rFonts w:eastAsia="Calibri" w:cs=""/>
+                <w:kern w:val="0"/>
+                <w:lang w:val="da-DK" w:eastAsia="en-US" w:bidi="ar-SA"/>
+              </w:rPr>
+            </w:pPr>
+            <w:r>
+              <w:rPr>
+                <w:rFonts w:eastAsia="Calibri" w:cs=""/>
+                <w:kern w:val="0"/>
+                <w:lang w:val="da-DK" w:eastAsia="en-US" w:bidi="ar-SA"/>
+              </w:rPr>
+            </w:r>
+          </w:p>
+        </w:tc>
+        <w:tc>
+          <w:tcPr>
+            <w:tcW w:w="3679" w:type="dxa"/>
+            <w:tcBorders>
+              <w:top w:val="nil"/>
+            </w:tcBorders>
+          </w:tcPr>
+          <w:p>
+            <w:pPr>
+              <w:pStyle w:val="Normal"/>
+              <w:widowControl/>
+              <w:suppressAutoHyphens w:val="true"/>
+              <w:spacing w:lineRule="auto" w:line="240" w:before="0" w:after="0"/>
+              <w:jc w:val="left"/>
+              <w:cnfStyle w:val="000000000000" w:firstRow="0" w:lastRow="0" w:firstColumn="0" w:lastColumn="0" w:oddVBand="0" w:evenVBand="0" w:oddHBand="0" w:evenHBand="0" w:firstRowFirstColumn="0" w:firstRowLastColumn="0" w:lastRowFirstColumn="0" w:lastRowLastColumn="0"/>
+              <w:rPr>
+                <w:rFonts w:eastAsia="Calibri" w:cs=""/>
+                <w:kern w:val="0"/>
+                <w:lang w:val="da-DK" w:eastAsia="en-US" w:bidi="ar-SA"/>
+              </w:rPr>
+            </w:pPr>
+            <w:r>
+              <w:rPr>
+                <w:rFonts w:eastAsia="Calibri" w:cs=""/>
+                <w:kern w:val="0"/>
+                <w:lang w:val="da-DK" w:eastAsia="en-US" w:bidi="ar-SA"/>
+              </w:rPr>
+              <w:t>Eksterne brugere skal ikke tilføjes til denne gruppe</w:t>
+            </w:r>
+          </w:p>
+        </w:tc>
+      </w:tr>
+      <w:tr>
+        <w:trPr/>
+        <w:tc>
+          <w:tcPr>
+            <w:tcW w:w="3112" w:type="dxa"/>
+            <w:cnfStyle w:val="001000000000" w:firstRow="0" w:lastRow="0" w:firstColumn="1" w:lastColumn="0" w:oddVBand="0" w:evenVBand="0" w:oddHBand="0" w:evenHBand="0" w:firstRowFirstColumn="0" w:firstRowLastColumn="0" w:lastRowFirstColumn="0" w:lastRowLastColumn="0"/>
+            <w:tcBorders>
+              <w:top w:val="nil"/>
+            </w:tcBorders>
+          </w:tcPr>
+          <w:p>
+            <w:pPr>
+              <w:pStyle w:val="Normal"/>
+              <w:widowControl/>
+              <w:suppressAutoHyphens w:val="true"/>
+              <w:spacing w:lineRule="auto" w:line="240" w:before="0" w:after="0"/>
+              <w:jc w:val="left"/>
+              <w:rPr>
+                <w:rFonts w:eastAsia="Calibri" w:cs=""/>
+                <w:b w:val="false"/>
+                <w:bCs w:val="false"/>
+                <w:kern w:val="0"/>
+                <w:lang w:val="da-DK" w:eastAsia="en-US" w:bidi="ar-SA"/>
+              </w:rPr>
+            </w:pPr>
+            <w:r>
+              <w:rPr>
+                <w:rFonts w:eastAsia="Calibri" w:cs=""/>
+                <w:b w:val="false"/>
+                <w:bCs w:val="false"/>
+                <w:kern w:val="0"/>
+                <w:lang w:val="da-DK" w:eastAsia="en-US" w:bidi="ar-SA"/>
+              </w:rPr>
+              <w:t>ExcludeSubstituteUsers</w:t>
+            </w:r>
+          </w:p>
+        </w:tc>
+        <w:tc>
+          <w:tcPr>
+            <w:tcW w:w="2837" w:type="dxa"/>
+            <w:tcBorders>
+              <w:top w:val="nil"/>
+            </w:tcBorders>
+          </w:tcPr>
+          <w:p>
+            <w:pPr>
+              <w:pStyle w:val="Normal"/>
+              <w:widowControl/>
+              <w:suppressAutoHyphens w:val="true"/>
+              <w:spacing w:lineRule="auto" w:line="240" w:before="0" w:after="0"/>
+              <w:jc w:val="left"/>
+              <w:cnfStyle w:val="000000000000" w:firstRow="0" w:lastRow="0" w:firstColumn="0" w:lastColumn="0" w:oddVBand="0" w:evenVBand="0" w:oddHBand="0" w:evenHBand="0" w:firstRowFirstColumn="0" w:firstRowLastColumn="0" w:lastRowFirstColumn="0" w:lastRowLastColumn="0"/>
+              <w:rPr>
+                <w:rFonts w:eastAsia="Calibri" w:cs=""/>
+                <w:kern w:val="0"/>
+                <w:lang w:val="da-DK" w:eastAsia="en-US" w:bidi="ar-SA"/>
+              </w:rPr>
+            </w:pPr>
+            <w:r>
+              <w:rPr>
+                <w:rFonts w:eastAsia="Calibri" w:cs=""/>
+                <w:kern w:val="0"/>
+                <w:lang w:val="da-DK" w:eastAsia="en-US" w:bidi="ar-SA"/>
+              </w:rPr>
+            </w:r>
+          </w:p>
+        </w:tc>
+        <w:tc>
+          <w:tcPr>
+            <w:tcW w:w="3679" w:type="dxa"/>
+            <w:tcBorders>
+              <w:top w:val="nil"/>
+            </w:tcBorders>
+          </w:tcPr>
+          <w:p>
+            <w:pPr>
+              <w:pStyle w:val="Normal"/>
+              <w:widowControl/>
+              <w:suppressAutoHyphens w:val="true"/>
+              <w:spacing w:lineRule="auto" w:line="240" w:before="0" w:after="0"/>
+              <w:jc w:val="left"/>
+              <w:cnfStyle w:val="000000000000" w:firstRow="0" w:lastRow="0" w:firstColumn="0" w:lastColumn="0" w:oddVBand="0" w:evenVBand="0" w:oddHBand="0" w:evenHBand="0" w:firstRowFirstColumn="0" w:firstRowLastColumn="0" w:lastRowFirstColumn="0" w:lastRowLastColumn="0"/>
+              <w:rPr>
+                <w:rFonts w:eastAsia="Calibri" w:cs=""/>
+                <w:kern w:val="0"/>
+                <w:lang w:val="da-DK" w:eastAsia="en-US" w:bidi="ar-SA"/>
+              </w:rPr>
+            </w:pPr>
+            <w:r>
+              <w:rPr>
+                <w:rFonts w:eastAsia="Calibri" w:cs=""/>
+                <w:kern w:val="0"/>
+                <w:lang w:val="da-DK" w:eastAsia="en-US" w:bidi="ar-SA"/>
+              </w:rPr>
+              <w:t>Vikar brugere skal ikke tilføjes til denne gruppe</w:t>
+            </w:r>
+          </w:p>
+        </w:tc>
+      </w:tr>
+      <w:tr>
+        <w:trPr>
+          <w:trHeight w:val="420" w:hRule="atLeast"/>
+        </w:trPr>
+        <w:tc>
+          <w:tcPr>
+            <w:tcW w:w="3112" w:type="dxa"/>
+            <w:cnfStyle w:val="001000000000" w:firstRow="0" w:lastRow="0" w:firstColumn="1" w:lastColumn="0" w:oddVBand="0" w:evenVBand="0" w:oddHBand="0" w:evenHBand="0" w:firstRowFirstColumn="0" w:firstRowLastColumn="0" w:lastRowFirstColumn="0" w:lastRowLastColumn="0"/>
+            <w:tcBorders>
+              <w:top w:val="nil"/>
+            </w:tcBorders>
+          </w:tcPr>
+          <w:p>
+            <w:pPr>
+              <w:pStyle w:val="Normal"/>
+              <w:widowControl/>
+              <w:suppressAutoHyphens w:val="true"/>
+              <w:spacing w:lineRule="auto" w:line="240" w:before="0" w:after="0"/>
+              <w:jc w:val="left"/>
+              <w:rPr>
+                <w:rFonts w:eastAsia="Calibri" w:cs=""/>
+                <w:b w:val="false"/>
+                <w:bCs w:val="false"/>
+                <w:kern w:val="0"/>
+                <w:lang w:val="da-DK" w:eastAsia="en-US" w:bidi="ar-SA"/>
+              </w:rPr>
+            </w:pPr>
+            <w:r>
+              <w:rPr>
+                <w:rFonts w:eastAsia="Calibri" w:cs=""/>
+                <w:b w:val="false"/>
+                <w:bCs w:val="false"/>
+                <w:kern w:val="0"/>
+                <w:lang w:val="da-DK" w:eastAsia="en-US" w:bidi="ar-SA"/>
+              </w:rPr>
+              <w:t>ExcludeGroupMembershipFromTheseOUs</w:t>
+            </w:r>
+          </w:p>
+        </w:tc>
+        <w:tc>
+          <w:tcPr>
+            <w:tcW w:w="2837" w:type="dxa"/>
+            <w:tcBorders>
+              <w:top w:val="nil"/>
+            </w:tcBorders>
+          </w:tcPr>
+          <w:p>
+            <w:pPr>
+              <w:pStyle w:val="Normal"/>
+              <w:widowControl/>
+              <w:suppressAutoHyphens w:val="true"/>
+              <w:spacing w:lineRule="auto" w:line="240" w:before="0" w:after="0"/>
+              <w:jc w:val="left"/>
+              <w:cnfStyle w:val="000000000000" w:firstRow="0" w:lastRow="0" w:firstColumn="0" w:lastColumn="0" w:oddVBand="0" w:evenVBand="0" w:oddHBand="0" w:evenHBand="0" w:firstRowFirstColumn="0" w:firstRowLastColumn="0" w:lastRowFirstColumn="0" w:lastRowLastColumn="0"/>
+              <w:rPr>
+                <w:rFonts w:eastAsia="Calibri" w:cs=""/>
+                <w:kern w:val="0"/>
+                <w:lang w:val="da-DK" w:eastAsia="en-US" w:bidi="ar-SA"/>
+              </w:rPr>
+            </w:pPr>
+            <w:r>
+              <w:rPr>
+                <w:rFonts w:eastAsia="Calibri" w:cs=""/>
+                <w:kern w:val="0"/>
+                <w:lang w:val="da-DK" w:eastAsia="en-US" w:bidi="ar-SA"/>
+              </w:rPr>
+            </w:r>
+          </w:p>
+        </w:tc>
+        <w:tc>
+          <w:tcPr>
+            <w:tcW w:w="3679" w:type="dxa"/>
+            <w:tcBorders>
+              <w:top w:val="nil"/>
+            </w:tcBorders>
+          </w:tcPr>
+          <w:p>
+            <w:pPr>
+              <w:pStyle w:val="Normal"/>
+              <w:widowControl/>
+              <w:suppressAutoHyphens w:val="true"/>
+              <w:spacing w:lineRule="auto" w:line="240" w:before="0" w:after="0"/>
+              <w:jc w:val="left"/>
+              <w:cnfStyle w:val="000000000000" w:firstRow="0" w:lastRow="0" w:firstColumn="0" w:lastColumn="0" w:oddVBand="0" w:evenVBand="0" w:oddHBand="0" w:evenHBand="0" w:firstRowFirstColumn="0" w:firstRowLastColumn="0" w:lastRowFirstColumn="0" w:lastRowLastColumn="0"/>
+              <w:rPr>
+                <w:rFonts w:eastAsia="Calibri" w:cs=""/>
+                <w:kern w:val="0"/>
+                <w:lang w:val="da-DK" w:eastAsia="en-US" w:bidi="ar-SA"/>
+              </w:rPr>
+            </w:pPr>
+            <w:r>
+              <w:rPr>
+                <w:rFonts w:eastAsia="Calibri" w:cs=""/>
+                <w:kern w:val="0"/>
+                <w:lang w:val="da-DK" w:eastAsia="en-US" w:bidi="ar-SA"/>
+              </w:rPr>
+              <w:t>En liste over OU, som denne gruppe ikke skal indbefatte</w:t>
             </w:r>
           </w:p>
         </w:tc>
@@ -6989,13 +7853,7 @@
         <w:rPr>
           <w:lang w:val="da-DK"/>
         </w:rPr>
-        <w:t xml:space="preserve">I gruppetypernes indstillinger kan følgende pladsholdere anvendes til at generere </w:t>
-      </w:r>
-      <w:r>
-        <w:rPr>
-          <w:lang w:val="da-DK"/>
-        </w:rPr>
-        <w:t>gruppens felter.</w:t>
+        <w:t>I gruppetypernes indstillinger kan følgende pladsholdere anvendes til at generere gruppens felter.</w:t>
       </w:r>
     </w:p>
     <w:tbl>
@@ -7015,7 +7873,7 @@
       </w:tblPr>
       <w:tblGrid>
         <w:gridCol w:w="1750"/>
-        <w:gridCol w:w="2554"/>
+        <w:gridCol w:w="2553"/>
         <w:gridCol w:w="2663"/>
         <w:gridCol w:w="2661"/>
       </w:tblGrid>
@@ -7035,6 +7893,7 @@
             <w:pPr>
               <w:pStyle w:val="Normal"/>
               <w:widowControl/>
+              <w:suppressAutoHyphens w:val="true"/>
               <w:spacing w:lineRule="auto" w:line="240" w:before="0" w:after="0"/>
               <w:jc w:val="left"/>
               <w:rPr>
@@ -7059,7 +7918,7 @@
         </w:tc>
         <w:tc>
           <w:tcPr>
-            <w:tcW w:w="2554" w:type="dxa"/>
+            <w:tcW w:w="2553" w:type="dxa"/>
             <w:tcBorders>
               <w:bottom w:val="single" w:sz="12" w:space="0" w:color="9CC2E5"/>
             </w:tcBorders>
@@ -7068,6 +7927,7 @@
             <w:pPr>
               <w:pStyle w:val="Normal"/>
               <w:widowControl/>
+              <w:suppressAutoHyphens w:val="true"/>
               <w:spacing w:lineRule="auto" w:line="240" w:before="0" w:after="0"/>
               <w:jc w:val="left"/>
               <w:cnfStyle w:val="100000000000" w:firstRow="1" w:lastRow="0" w:firstColumn="0" w:lastColumn="0" w:oddVBand="0" w:evenVBand="0" w:oddHBand="0" w:evenHBand="0" w:firstRowFirstColumn="0" w:firstRowLastColumn="0" w:lastRowFirstColumn="0" w:lastRowLastColumn="0"/>
@@ -7087,17 +7947,7 @@
                 <w:kern w:val="0"/>
                 <w:lang w:val="da-DK" w:eastAsia="en-US" w:bidi="ar-SA"/>
               </w:rPr>
-              <w:t>Bør kun</w:t>
-            </w:r>
-            <w:r>
-              <w:rPr>
-                <w:rFonts w:eastAsia="Calibri" w:cs=""/>
-                <w:b/>
-                <w:bCs/>
-                <w:kern w:val="0"/>
-                <w:lang w:val="da-DK" w:eastAsia="en-US" w:bidi="ar-SA"/>
-              </w:rPr>
-              <w:t xml:space="preserve"> anvendes på</w:t>
+              <w:t>Bør kun anvendes på</w:t>
             </w:r>
           </w:p>
         </w:tc>
@@ -7113,6 +7963,7 @@
             <w:pPr>
               <w:pStyle w:val="Normal"/>
               <w:widowControl/>
+              <w:suppressAutoHyphens w:val="true"/>
               <w:spacing w:lineRule="auto" w:line="240" w:before="0" w:after="0"/>
               <w:jc w:val="left"/>
               <w:cnfStyle w:val="100000000000" w:firstRow="1" w:lastRow="0" w:firstColumn="0" w:lastColumn="0" w:oddVBand="0" w:evenVBand="0" w:oddHBand="0" w:evenHBand="0" w:firstRowFirstColumn="0" w:firstRowLastColumn="0" w:lastRowFirstColumn="0" w:lastRowLastColumn="0"/>
@@ -7147,6 +7998,7 @@
             <w:pPr>
               <w:pStyle w:val="Normal"/>
               <w:widowControl/>
+              <w:suppressAutoHyphens w:val="true"/>
               <w:spacing w:lineRule="auto" w:line="240" w:before="0" w:after="0"/>
               <w:jc w:val="left"/>
               <w:cnfStyle w:val="100000000000" w:firstRow="1" w:lastRow="0" w:firstColumn="0" w:lastColumn="0" w:oddVBand="0" w:evenVBand="0" w:oddHBand="0" w:evenHBand="0" w:firstRowFirstColumn="0" w:firstRowLastColumn="0" w:lastRowFirstColumn="0" w:lastRowLastColumn="0"/>
@@ -7183,6 +8035,7 @@
             <w:pPr>
               <w:pStyle w:val="Normal"/>
               <w:widowControl/>
+              <w:suppressAutoHyphens w:val="true"/>
               <w:spacing w:lineRule="auto" w:line="240" w:before="0" w:after="0"/>
               <w:jc w:val="left"/>
               <w:rPr>
@@ -7207,13 +8060,14 @@
         </w:tc>
         <w:tc>
           <w:tcPr>
-            <w:tcW w:w="2554" w:type="dxa"/>
-            <w:tcBorders/>
-          </w:tcPr>
-          <w:p>
-            <w:pPr>
-              <w:pStyle w:val="Normal"/>
-              <w:widowControl/>
+            <w:tcW w:w="2553" w:type="dxa"/>
+            <w:tcBorders/>
+          </w:tcPr>
+          <w:p>
+            <w:pPr>
+              <w:pStyle w:val="Normal"/>
+              <w:widowControl/>
+              <w:suppressAutoHyphens w:val="true"/>
               <w:spacing w:lineRule="auto" w:line="240" w:before="0" w:after="0"/>
               <w:jc w:val="left"/>
               <w:cnfStyle w:val="000000000000" w:firstRow="0" w:lastRow="0" w:firstColumn="0" w:lastColumn="0" w:oddVBand="0" w:evenVBand="0" w:oddHBand="0" w:evenHBand="0" w:firstRowFirstColumn="0" w:firstRowLastColumn="0" w:lastRowFirstColumn="0" w:lastRowLastColumn="0"/>
@@ -7259,6 +8113,7 @@
             <w:pPr>
               <w:pStyle w:val="Normal"/>
               <w:widowControl/>
+              <w:suppressAutoHyphens w:val="true"/>
               <w:spacing w:lineRule="auto" w:line="240" w:before="0" w:after="0"/>
               <w:jc w:val="left"/>
               <w:cnfStyle w:val="000000000000" w:firstRow="0" w:lastRow="0" w:firstColumn="0" w:lastColumn="0" w:oddVBand="0" w:evenVBand="0" w:oddHBand="0" w:evenHBand="0" w:firstRowFirstColumn="0" w:firstRowLastColumn="0" w:lastRowFirstColumn="0" w:lastRowLastColumn="0"/>
@@ -7287,6 +8142,7 @@
             <w:pPr>
               <w:pStyle w:val="Normal"/>
               <w:widowControl/>
+              <w:suppressAutoHyphens w:val="true"/>
               <w:spacing w:lineRule="auto" w:line="240" w:before="0" w:after="0"/>
               <w:jc w:val="left"/>
               <w:cnfStyle w:val="000000000000" w:firstRow="0" w:lastRow="0" w:firstColumn="0" w:lastColumn="0" w:oddVBand="0" w:evenVBand="0" w:oddHBand="0" w:evenHBand="0" w:firstRowFirstColumn="0" w:firstRowLastColumn="0" w:lastRowFirstColumn="0" w:lastRowLastColumn="0"/>
@@ -7319,6 +8175,7 @@
             <w:pPr>
               <w:pStyle w:val="Normal"/>
               <w:widowControl/>
+              <w:suppressAutoHyphens w:val="true"/>
               <w:spacing w:lineRule="auto" w:line="240" w:before="0" w:after="0"/>
               <w:jc w:val="left"/>
               <w:rPr>
@@ -7343,13 +8200,14 @@
         </w:tc>
         <w:tc>
           <w:tcPr>
-            <w:tcW w:w="2554" w:type="dxa"/>
-            <w:tcBorders/>
-          </w:tcPr>
-          <w:p>
-            <w:pPr>
-              <w:pStyle w:val="Normal"/>
-              <w:widowControl/>
+            <w:tcW w:w="2553" w:type="dxa"/>
+            <w:tcBorders/>
+          </w:tcPr>
+          <w:p>
+            <w:pPr>
+              <w:pStyle w:val="Normal"/>
+              <w:widowControl/>
+              <w:suppressAutoHyphens w:val="true"/>
               <w:spacing w:lineRule="auto" w:line="240" w:before="0" w:after="0"/>
               <w:jc w:val="left"/>
               <w:cnfStyle w:val="000000000000" w:firstRow="0" w:lastRow="0" w:firstColumn="0" w:lastColumn="0" w:oddVBand="0" w:evenVBand="0" w:oddHBand="0" w:evenHBand="0" w:firstRowFirstColumn="0" w:firstRowLastColumn="0" w:lastRowFirstColumn="0" w:lastRowLastColumn="0"/>
@@ -7395,6 +8253,7 @@
             <w:pPr>
               <w:pStyle w:val="Normal"/>
               <w:widowControl/>
+              <w:suppressAutoHyphens w:val="true"/>
               <w:spacing w:lineRule="auto" w:line="240" w:before="0" w:after="0"/>
               <w:jc w:val="left"/>
               <w:cnfStyle w:val="000000000000" w:firstRow="0" w:lastRow="0" w:firstColumn="0" w:lastColumn="0" w:oddVBand="0" w:evenVBand="0" w:oddHBand="0" w:evenHBand="0" w:firstRowFirstColumn="0" w:firstRowLastColumn="0" w:lastRowFirstColumn="0" w:lastRowLastColumn="0"/>
@@ -7425,6 +8284,7 @@
             <w:pPr>
               <w:pStyle w:val="Normal"/>
               <w:widowControl/>
+              <w:suppressAutoHyphens w:val="true"/>
               <w:spacing w:lineRule="auto" w:line="240" w:before="0" w:after="0"/>
               <w:jc w:val="left"/>
               <w:cnfStyle w:val="000000000000" w:firstRow="0" w:lastRow="0" w:firstColumn="0" w:lastColumn="0" w:oddVBand="0" w:evenVBand="0" w:oddHBand="0" w:evenHBand="0" w:firstRowFirstColumn="0" w:firstRowLastColumn="0" w:lastRowFirstColumn="0" w:lastRowLastColumn="0"/>
@@ -7459,6 +8319,7 @@
             <w:pPr>
               <w:pStyle w:val="Normal"/>
               <w:widowControl/>
+              <w:suppressAutoHyphens w:val="true"/>
               <w:spacing w:lineRule="auto" w:line="240" w:before="0" w:after="0"/>
               <w:jc w:val="left"/>
               <w:rPr>
@@ -7483,7 +8344,7 @@
         </w:tc>
         <w:tc>
           <w:tcPr>
-            <w:tcW w:w="2554" w:type="dxa"/>
+            <w:tcW w:w="2553" w:type="dxa"/>
             <w:tcBorders>
               <w:top w:val="nil"/>
             </w:tcBorders>
@@ -7492,6 +8353,7 @@
             <w:pPr>
               <w:pStyle w:val="Normal"/>
               <w:widowControl/>
+              <w:suppressAutoHyphens w:val="true"/>
               <w:spacing w:lineRule="auto" w:line="240" w:before="0" w:after="0"/>
               <w:jc w:val="left"/>
               <w:cnfStyle w:val="000000000000" w:firstRow="0" w:lastRow="0" w:firstColumn="0" w:lastColumn="0" w:oddVBand="0" w:evenVBand="0" w:oddHBand="0" w:evenHBand="0" w:firstRowFirstColumn="0" w:firstRowLastColumn="0" w:lastRowFirstColumn="0" w:lastRowLastColumn="0"/>
@@ -7538,6 +8400,7 @@
             <w:pPr>
               <w:pStyle w:val="Normal"/>
               <w:widowControl/>
+              <w:suppressAutoHyphens w:val="true"/>
               <w:spacing w:lineRule="auto" w:line="240" w:before="0" w:after="0"/>
               <w:jc w:val="left"/>
               <w:cnfStyle w:val="000000000000" w:firstRow="0" w:lastRow="0" w:firstColumn="0" w:lastColumn="0" w:oddVBand="0" w:evenVBand="0" w:oddHBand="0" w:evenHBand="0" w:firstRowFirstColumn="0" w:firstRowLastColumn="0" w:lastRowFirstColumn="0" w:lastRowLastColumn="0"/>
@@ -7568,6 +8431,7 @@
             <w:pPr>
               <w:pStyle w:val="Normal"/>
               <w:widowControl/>
+              <w:suppressAutoHyphens w:val="true"/>
               <w:spacing w:lineRule="auto" w:line="240" w:before="0" w:after="0"/>
               <w:jc w:val="left"/>
               <w:cnfStyle w:val="000000000000" w:firstRow="0" w:lastRow="0" w:firstColumn="0" w:lastColumn="0" w:oddVBand="0" w:evenVBand="0" w:oddHBand="0" w:evenHBand="0" w:firstRowFirstColumn="0" w:firstRowLastColumn="0" w:lastRowFirstColumn="0" w:lastRowLastColumn="0"/>
@@ -7602,6 +8466,7 @@
             <w:pPr>
               <w:pStyle w:val="Normal"/>
               <w:widowControl/>
+              <w:suppressAutoHyphens w:val="true"/>
               <w:spacing w:lineRule="auto" w:line="240" w:before="0" w:after="0"/>
               <w:jc w:val="left"/>
               <w:rPr>
@@ -7620,43 +8485,13 @@
                 <w:kern w:val="0"/>
                 <w:lang w:val="da-DK" w:eastAsia="en-US" w:bidi="ar-SA"/>
               </w:rPr>
-              <w:t>{PATH[</w:t>
-            </w:r>
-            <w:r>
-              <w:rPr>
-                <w:rFonts w:eastAsia="Calibri" w:cs=""/>
-                <w:b w:val="false"/>
-                <w:bCs w:val="false"/>
-                <w:kern w:val="0"/>
-                <w:lang w:val="da-DK" w:eastAsia="en-US" w:bidi="ar-SA"/>
-              </w:rPr>
-              <w:t>X</w:t>
-            </w:r>
-            <w:r>
-              <w:rPr>
-                <w:rFonts w:eastAsia="Calibri" w:cs=""/>
-                <w:b w:val="false"/>
-                <w:bCs w:val="false"/>
-                <w:kern w:val="0"/>
-                <w:lang w:val="da-DK" w:eastAsia="en-US" w:bidi="ar-SA"/>
-              </w:rPr>
-              <w:t xml:space="preserve">]} – </w:t>
-            </w:r>
-            <w:r>
-              <w:rPr>
-                <w:rFonts w:eastAsia="Calibri" w:cs=""/>
-                <w:b w:val="false"/>
-                <w:bCs w:val="false"/>
-                <w:kern w:val="0"/>
-                <w:lang w:val="da-DK" w:eastAsia="en-US" w:bidi="ar-SA"/>
-              </w:rPr>
-              <w:t>hvor X er et tal  1 eller større</w:t>
-            </w:r>
-          </w:p>
-        </w:tc>
-        <w:tc>
-          <w:tcPr>
-            <w:tcW w:w="2554" w:type="dxa"/>
+              <w:t>{PATH[X]} – hvor X er et tal  1 eller større</w:t>
+            </w:r>
+          </w:p>
+        </w:tc>
+        <w:tc>
+          <w:tcPr>
+            <w:tcW w:w="2553" w:type="dxa"/>
             <w:tcBorders>
               <w:top w:val="nil"/>
             </w:tcBorders>
@@ -7665,6 +8500,7 @@
             <w:pPr>
               <w:pStyle w:val="Normal"/>
               <w:widowControl/>
+              <w:suppressAutoHyphens w:val="true"/>
               <w:spacing w:lineRule="auto" w:line="240" w:before="0" w:after="0"/>
               <w:jc w:val="left"/>
               <w:cnfStyle w:val="000000000000" w:firstRow="0" w:lastRow="0" w:firstColumn="0" w:lastColumn="0" w:oddVBand="0" w:evenVBand="0" w:oddHBand="0" w:evenHBand="0" w:firstRowFirstColumn="0" w:firstRowLastColumn="0" w:lastRowFirstColumn="0" w:lastRowLastColumn="0"/>
@@ -7683,15 +8519,6 @@
                 <w:lang w:val="da-DK" w:eastAsia="en-US" w:bidi="ar-SA"/>
               </w:rPr>
               <w:t>Name,</w:t>
-            </w:r>
-            <w:r>
-              <w:rPr>
-                <w:rFonts w:eastAsia="Calibri" w:cs=""/>
-                <w:b w:val="false"/>
-                <w:bCs w:val="false"/>
-                <w:kern w:val="0"/>
-                <w:lang w:val="da-DK" w:eastAsia="en-US" w:bidi="ar-SA"/>
-              </w:rPr>
               <w:br/>
               <w:t>SAMaccountName,</w:t>
               <w:br/>
@@ -7713,6 +8540,7 @@
             <w:pPr>
               <w:pStyle w:val="Normal"/>
               <w:widowControl/>
+              <w:suppressAutoHyphens w:val="true"/>
               <w:spacing w:lineRule="auto" w:line="240" w:before="0" w:after="0"/>
               <w:jc w:val="left"/>
               <w:cnfStyle w:val="000000000000" w:firstRow="0" w:lastRow="0" w:firstColumn="0" w:lastColumn="0" w:oddVBand="0" w:evenVBand="0" w:oddHBand="0" w:evenHBand="0" w:firstRowFirstColumn="0" w:firstRowLastColumn="0" w:lastRowFirstColumn="0" w:lastRowLastColumn="0"/>
@@ -7730,7 +8558,7 @@
               </w:rPr>
               <w:t>Enheden X niveauer over den gældende enhed.</w:t>
               <w:br/>
-              <w:t xml:space="preserve">Hvis tallet er større end antallet af enheder til roden, returneres en tom streng. </w:t>
+              <w:t>Hvis tallet er større end antallet af enheder til roden, returneres en tom streng.</w:t>
             </w:r>
           </w:p>
         </w:tc>
@@ -7745,6 +8573,7 @@
             <w:pPr>
               <w:pStyle w:val="Normal"/>
               <w:widowControl/>
+              <w:suppressAutoHyphens w:val="true"/>
               <w:spacing w:lineRule="auto" w:line="240" w:before="0" w:after="0"/>
               <w:jc w:val="left"/>
               <w:cnfStyle w:val="000000000000" w:firstRow="0" w:lastRow="0" w:firstColumn="0" w:lastColumn="0" w:oddVBand="0" w:evenVBand="0" w:oddHBand="0" w:evenHBand="0" w:firstRowFirstColumn="0" w:firstRowLastColumn="0" w:lastRowFirstColumn="0" w:lastRowLastColumn="0"/>
@@ -7779,6 +8608,7 @@
             <w:pPr>
               <w:pStyle w:val="Normal"/>
               <w:widowControl/>
+              <w:suppressAutoHyphens w:val="true"/>
               <w:spacing w:lineRule="auto" w:line="240" w:before="0" w:after="0"/>
               <w:jc w:val="left"/>
               <w:rPr>
@@ -7797,43 +8627,13 @@
                 <w:kern w:val="0"/>
                 <w:lang w:val="da-DK" w:eastAsia="en-US" w:bidi="ar-SA"/>
               </w:rPr>
-              <w:t>{PATH[</w:t>
-            </w:r>
-            <w:r>
-              <w:rPr>
-                <w:rFonts w:eastAsia="Calibri" w:cs=""/>
-                <w:b w:val="false"/>
-                <w:bCs w:val="false"/>
-                <w:kern w:val="0"/>
-                <w:lang w:val="da-DK" w:eastAsia="en-US" w:bidi="ar-SA"/>
-              </w:rPr>
-              <w:t>X</w:t>
-            </w:r>
-            <w:r>
-              <w:rPr>
-                <w:rFonts w:eastAsia="Calibri" w:cs=""/>
-                <w:b w:val="false"/>
-                <w:bCs w:val="false"/>
-                <w:kern w:val="0"/>
-                <w:lang w:val="da-DK" w:eastAsia="en-US" w:bidi="ar-SA"/>
-              </w:rPr>
-              <w:t xml:space="preserve">]} – </w:t>
-            </w:r>
-            <w:r>
-              <w:rPr>
-                <w:rFonts w:eastAsia="Calibri" w:cs=""/>
-                <w:b w:val="false"/>
-                <w:bCs w:val="false"/>
-                <w:kern w:val="0"/>
-                <w:lang w:val="da-DK" w:eastAsia="en-US" w:bidi="ar-SA"/>
-              </w:rPr>
-              <w:t>hvor X ikek er et tal</w:t>
-            </w:r>
-          </w:p>
-        </w:tc>
-        <w:tc>
-          <w:tcPr>
-            <w:tcW w:w="2554" w:type="dxa"/>
+              <w:t>{PATH[X]} – hvor X ikek er et tal</w:t>
+            </w:r>
+          </w:p>
+        </w:tc>
+        <w:tc>
+          <w:tcPr>
+            <w:tcW w:w="2553" w:type="dxa"/>
             <w:tcBorders>
               <w:top w:val="nil"/>
             </w:tcBorders>
@@ -7842,6 +8642,7 @@
             <w:pPr>
               <w:pStyle w:val="Normal"/>
               <w:widowControl/>
+              <w:suppressAutoHyphens w:val="true"/>
               <w:spacing w:lineRule="auto" w:line="240" w:before="0" w:after="0"/>
               <w:jc w:val="left"/>
               <w:cnfStyle w:val="000000000000" w:firstRow="0" w:lastRow="0" w:firstColumn="0" w:lastColumn="0" w:oddVBand="0" w:evenVBand="0" w:oddHBand="0" w:evenHBand="0" w:firstRowFirstColumn="0" w:firstRowLastColumn="0" w:lastRowFirstColumn="0" w:lastRowLastColumn="0"/>
@@ -7879,6 +8680,7 @@
             <w:pPr>
               <w:pStyle w:val="Normal"/>
               <w:widowControl/>
+              <w:suppressAutoHyphens w:val="true"/>
               <w:spacing w:lineRule="auto" w:line="240" w:before="0" w:after="0"/>
               <w:jc w:val="left"/>
               <w:cnfStyle w:val="000000000000" w:firstRow="0" w:lastRow="0" w:firstColumn="0" w:lastColumn="0" w:oddVBand="0" w:evenVBand="0" w:oddHBand="0" w:evenHBand="0" w:firstRowFirstColumn="0" w:firstRowLastColumn="0" w:lastRowFirstColumn="0" w:lastRowLastColumn="0"/>
@@ -7897,39 +8699,7 @@
               <w:t>Enhedens fulde sti, separeret af X (så hvis / bruges som separator, vil stien ligne rod-enhed/enhed/enhed)</w:t>
               <w:br/>
               <w:br/>
-              <w:t>Skal ikke anve</w:t>
-            </w:r>
-            <w:r>
-              <w:rPr>
-                <w:rFonts w:eastAsia="Calibri" w:cs=""/>
-                <w:kern w:val="0"/>
-                <w:lang w:val="da-DK" w:eastAsia="en-US" w:bidi="ar-SA"/>
-              </w:rPr>
-              <w:t>n</w:t>
-            </w:r>
-            <w:r>
-              <w:rPr>
-                <w:rFonts w:eastAsia="Calibri" w:cs=""/>
-                <w:kern w:val="0"/>
-                <w:lang w:val="da-DK" w:eastAsia="en-US" w:bidi="ar-SA"/>
-              </w:rPr>
-              <w:t xml:space="preserve">des på Name, da det kan </w:t>
-            </w:r>
-            <w:r>
-              <w:rPr>
-                <w:rFonts w:eastAsia="Calibri" w:cs=""/>
-                <w:kern w:val="0"/>
-                <w:lang w:val="da-DK" w:eastAsia="en-US" w:bidi="ar-SA"/>
-              </w:rPr>
-              <w:t>forårsage</w:t>
-            </w:r>
-            <w:r>
-              <w:rPr>
-                <w:rFonts w:eastAsia="Calibri" w:cs=""/>
-                <w:kern w:val="0"/>
-                <w:lang w:val="da-DK" w:eastAsia="en-US" w:bidi="ar-SA"/>
-              </w:rPr>
-              <w:t xml:space="preserve"> problemer.</w:t>
+              <w:t>Skal ikke anvendes på Name, da det kan forårsage problemer.</w:t>
             </w:r>
           </w:p>
         </w:tc>
@@ -7944,6 +8714,7 @@
             <w:pPr>
               <w:pStyle w:val="Normal"/>
               <w:widowControl/>
+              <w:suppressAutoHyphens w:val="true"/>
               <w:spacing w:lineRule="auto" w:line="240" w:before="0" w:after="0"/>
               <w:jc w:val="left"/>
               <w:cnfStyle w:val="000000000000" w:firstRow="0" w:lastRow="0" w:firstColumn="0" w:lastColumn="0" w:oddVBand="0" w:evenVBand="0" w:oddHBand="0" w:evenHBand="0" w:firstRowFirstColumn="0" w:firstRowLastColumn="0" w:lastRowFirstColumn="0" w:lastRowLastColumn="0"/>
@@ -7961,22 +8732,8 @@
               </w:rPr>
               <w:t>Eksempel Komme/</w:t>
               <w:br/>
-            </w:r>
-            <w:r>
-              <w:rPr>
-                <w:rFonts w:eastAsia="Calibri" w:cs=""/>
-                <w:kern w:val="0"/>
-                <w:lang w:val="da-DK" w:eastAsia="en-US" w:bidi="ar-SA"/>
-              </w:rPr>
               <w:t>Direktionsområde Velfærd/</w:t>
               <w:br/>
-            </w:r>
-            <w:r>
-              <w:rPr>
-                <w:rFonts w:eastAsia="Calibri" w:cs=""/>
-                <w:kern w:val="0"/>
-                <w:lang w:val="da-DK" w:eastAsia="en-US" w:bidi="ar-SA"/>
-              </w:rPr>
               <w:t>Børn og Unge</w:t>
             </w:r>
           </w:p>
@@ -8035,9 +8792,7 @@
         </w:rPr>
       </w:pPr>
       <w:r>
-        <w:rPr>
-          <w:lang w:val="da-DK"/>
-        </w:rPr>
+        <w:rPr/>
         <w:drawing>
           <wp:inline distT="0" distB="0" distL="0" distR="0">
             <wp:extent cx="5724525" cy="1476375"/>
@@ -8219,7 +8974,7 @@
             <w:szCs w:val="16"/>
             <w:bCs/>
           </w:rPr>
-          <w:t>5</w:t>
+          <w:t>8</w:t>
         </w:r>
         <w:r>
           <w:rPr>
@@ -8272,7 +9027,7 @@
             <w:szCs w:val="16"/>
             <w:bCs/>
           </w:rPr>
-          <w:t>7</w:t>
+          <w:t>8</w:t>
         </w:r>
         <w:r>
           <w:rPr>
@@ -9062,6 +9817,7 @@
     <w:rsid w:val="00546fae"/>
     <w:pPr>
       <w:widowControl/>
+      <w:suppressAutoHyphens w:val="true"/>
       <w:bidi w:val="0"/>
       <w:spacing w:lineRule="auto" w:line="259" w:before="0" w:after="160"/>
       <w:jc w:val="left"/>

</xml_diff>